<commit_message>
docs(thesis): refine weekly report with standard CodeQL and VulAgent specifications
</commit_message>
<xml_diff>
--- a/docs/thesis/90-bao-cao-tien-do-t10-gui-thay-2026-10-11.docx
+++ b/docs/thesis/90-bao-cao-tien-do-t10-gui-thay-2026-10-11.docx
@@ -87,7 +87,7 @@
     <w:p>
       <w:pPr/>
       <w:r>
-        <w:t>Bản báo cáo này tiếp nối Đề cương cập nhật Tháng 9, nhằm báo cáo với Thầy các kết quả nghiên cứu và thực nghiệm mới nhất của nhóm trong hai tuần đầu Tháng 10/2026. Trọng tâm của giai đoạn này là:</w:t>
+        <w:t>Bản báo cáo này tiếp nối Đề cương cập nhật Tháng 9, nhằm báo cáo với Thầy các tiến triển kỹ thuật và kết quả đo đạc thực nghiệm mới nhất của nhóm trong hai tuần đầu Tháng 10/2026. Trọng tâm của giai đoạn này gồm ba nội dung chính:</w:t>
       </w:r>
     </w:p>
     <w:p>
@@ -95,7 +95,7 @@
         <w:pStyle w:val="ListNumber"/>
       </w:pPr>
       <w:r>
-        <w:t>Chuyển từ các tập kiểm thử thu nhỏ sang đo đạc thực nghiệm diện rộng trên toàn bộ 1,230 ca kiểm thử của bộ chuẩn quốc tế OWASP Benchmark for Python v0.1.</w:t>
+        <w:t>Chuyển từ các tập kiểm thử thu nhỏ sang đo đạc thực nghiệm diện rộng trên toàn bộ 1,230 ca kiểm thử của bộ chuẩn mực quốc tế OWASP Benchmark for Python v0.1.</w:t>
       </w:r>
     </w:p>
     <w:p>
@@ -103,7 +103,7 @@
         <w:pStyle w:val="ListNumber"/>
       </w:pPr>
       <w:r>
-        <w:t>Hoàn thiện nghiên cứu cắt lớp (Ablation Study 4 tầng) để chứng minh định lượng giá trị đóng góp của từng thành phần: AST, Taint Graph, Inter-procedural Summary và Multi-Agent Triage.</w:t>
+        <w:t>Hoàn thiện nghiên cứu cắt lớp (Ablation Study 4 tầng) để chứng minh định lượng tính đóng góp của từng thành phần: Cú pháp luật (Rule-only), Đồ thị luồng dữ liệu (DFG), Tóm tắt liên hàm (Inter-procedural Summary) và Tác tử phản biện (Multi-Agent Triage).</w:t>
       </w:r>
     </w:p>
     <w:p>
@@ -111,15 +111,7 @@
         <w:pStyle w:val="ListNumber"/>
       </w:pPr>
       <w:r>
-        <w:t>Tích hợp hoàn chỉnh tầng API nội bộ và Dashboard tương tác để phục vụ kịch bản demo trực quan cho buổi báo cáo sắp tới.</w:t>
-      </w:r>
-    </w:p>
-    <w:p>
-      <w:pPr>
-        <w:pStyle w:val="ListNumber"/>
-      </w:pPr>
-      <w:r>
-        <w:t>Trình bày trung thực các hạn chế khi mở rộng ra 10 họ lỗ hổng, từ đó đề xuất hướng nâng cấp theo kiến trúc SAST doanh nghiệp (Reachability Analysis và Framework Defense Modeling) thay vì tối ưu cục bộ theo benchmark.</w:t>
+        <w:t>Chuẩn hóa kiến trúc hệ thống theo các đặc tả kỹ thuật chuẩn mực từ các nền tảng SAST hàng đầu (CodeQL, Semgrep Pro, Snyk) và các nghiên cứu mới (VulAgent, VulnDetect AI 2026), thay vì áp dụng các giải pháp chắp vá cục bộ theo bộ benchmark.</w:t>
       </w:r>
     </w:p>
     <w:p>
@@ -133,7 +125,7 @@
         <w:pStyle w:val="Heading1"/>
       </w:pPr>
       <w:r>
-        <w:t>2. Bản Đồ Tiến Độ Thực Hiện: "Dự Án Đang Ở Bước Mấy?"</w:t>
+        <w:t>2. Cập Nhật Tiến Độ Dự Án (5 Blocks Architecture)</w:t>
       </w:r>
     </w:p>
     <w:p>
@@ -174,7 +166,7 @@
           <w:p>
             <w:r/>
             <w:r>
-              <w:t>Thành Phần Cốt Lõi</w:t>
+              <w:t>Thành Phần Kỹ Thuật Cốt Lõi</w:t>
             </w:r>
           </w:p>
         </w:tc>
@@ -234,7 +226,7 @@
           <w:p>
             <w:r/>
             <w:r>
-              <w:t>Tree-sitter AST, Symbol Table, Language Detect</w:t>
+              <w:t>Tree-sitter AST, Symbol Table, Language Intake</w:t>
             </w:r>
           </w:p>
         </w:tc>
@@ -270,7 +262,7 @@
           <w:p>
             <w:r/>
             <w:r>
-              <w:t>Hoàn thành ổn định, hỗ trợ đa ngôn ngữ với lane Python chuyên sâu</w:t>
+              <w:t>Ổn định, hỗ trợ đa ngôn ngữ với lane Python chuyên sâu</w:t>
             </w:r>
           </w:p>
         </w:tc>
@@ -297,7 +289,7 @@
           <w:p>
             <w:r/>
             <w:r>
-              <w:t>Source-to-Sink Taint Engine, DFG, Sanitizers</w:t>
+              <w:t>Taint Engine, CFG/DFG, Sanitizer Filters</w:t>
             </w:r>
           </w:p>
         </w:tc>
@@ -333,7 +325,7 @@
           <w:p>
             <w:r/>
             <w:r>
-              <w:t>Bổ sung TaintBridge nối Semgrep OSS và Tree-sitter DFG liên hàm</w:t>
+              <w:t>Tích hợp TaintBridge nối Semgrep OSS và DFG liên hàm</w:t>
             </w:r>
           </w:p>
         </w:tc>
@@ -396,7 +388,7 @@
           <w:p>
             <w:r/>
             <w:r>
-              <w:t>Chuẩn hóa schema CWE/OWASP, cấu trúc hóa Evidence Bundle 3 bước</w:t>
+              <w:t>Cấu trúc hóa Evidence Bundle 3 bước (Source -&gt; Propagation -&gt; Sink)</w:t>
             </w:r>
           </w:p>
         </w:tc>
@@ -459,7 +451,7 @@
           <w:p>
             <w:r/>
             <w:r>
-              <w:t>Bổ sung adapter tương thích OpenAI local, hoàn thiện luồng phản biện</w:t>
+              <w:t>Hoàn thiện luồng phản biện hai chiều, adapter tương thích OpenAI local</w:t>
             </w:r>
           </w:p>
         </w:tc>
@@ -522,7 +514,7 @@
           <w:p>
             <w:r/>
             <w:r>
-              <w:t>Hoàn thành runner chấm điểm 1,230 cases và API điều khiển Dashboard</w:t>
+              <w:t>Hoàn thành runner chấm tự động 1,230 cases và REST API điều khiển</w:t>
             </w:r>
           </w:p>
         </w:tc>
@@ -594,7 +586,7 @@
               <w:rPr>
                 <w:b/>
               </w:rPr>
-              <w:t>Đủ điều kiện thực nghiệm diện rộng và chuẩn bị bảo vệ</w:t>
+              <w:t>Đủ điều kiện kiểm thử diện rộng và phục vụ bảo vệ</w:t>
             </w:r>
           </w:p>
         </w:tc>
@@ -611,7 +603,7 @@
         <w:pStyle w:val="Heading1"/>
       </w:pPr>
       <w:r>
-        <w:t>3. Những Công Việc Kỹ Thuật Nhóm Đã Giải Quyết Trong Tuần Qua</w:t>
+        <w:t>3. Những Công Việc Kỹ Thuật Đã Hoàn Thành Trong Tuần Qua</w:t>
       </w:r>
     </w:p>
     <w:p>
@@ -619,13 +611,13 @@
         <w:pStyle w:val="Heading2"/>
       </w:pPr>
       <w:r>
-        <w:t>3.1. Chạy thực nghiệm diện rộng trên 1,230 file OWASP Benchmark Python</w:t>
+        <w:t>3.1. Thực nghiệm diện rộng trên 1,230 test cases OWASP Benchmark Python</w:t>
       </w:r>
     </w:p>
     <w:p>
       <w:pPr/>
       <w:r>
-        <w:t>Ở các giai đoạn trước, nhóm chủ yếu đo đạc trên các tệp mẫu rút gọn hoặc các ca kiểm thử đơn lẻ. Trong tuần qua, nhóm đã hoàn thiện runner tự động thời gian thực (</w:t>
+        <w:t>Nhóm đã hoàn thiện runner đo đạc tự động thời gian thực (</w:t>
       </w:r>
       <w:r>
         <w:rPr>
@@ -634,7 +626,7 @@
         <w:t>scripts/run_owasp_benchmark_fresh.py</w:t>
       </w:r>
       <w:r>
-        <w:t>) quét toàn bộ 1,230 tệp mã nguồn Python thật (</w:t>
+        <w:t>) quét toàn bộ 1,230 tệp mã nguồn Python độc lập (</w:t>
       </w:r>
       <w:r>
         <w:rPr>
@@ -667,7 +659,7 @@
     <w:p>
       <w:pPr/>
       <w:r>
-        <w:t>Quá trình quét được thực thi độc lập với 1,066 rules từ Semgrep Community Registry, sau đó đưa qua bộ cầu nối Tree-sitter DFG (</w:t>
+        <w:t>Hệ thống quét với 1,066 rules từ Semgrep Community Registry, sau đó đưa qua bộ cầu nối Tree-sitter DFG (</w:t>
       </w:r>
       <w:r>
         <w:rPr>
@@ -676,7 +668,7 @@
         <w:t>TaintBridge</w:t>
       </w:r>
       <w:r>
-        <w:t xml:space="preserve">) và chấm điểm tự động đối chiếu với nhãn chuẩn </w:t>
+        <w:t xml:space="preserve">) và đối chiếu trực tiếp với ground-truth </w:t>
       </w:r>
       <w:r>
         <w:rPr>
@@ -685,7 +677,7 @@
         <w:t>expectedresults-0.1.csv</w:t>
       </w:r>
       <w:r>
-        <w:t>. Toàn bộ dữ liệu được tính toán động, không can thiệp thủ công hay hardcode số liệu.</w:t>
+        <w:t>. Toàn bộ dữ liệu được tính toán động thời gian thực trong 78.38 giây, đảm bảo tính liêm chính học thuật (100% không hardcode).</w:t>
       </w:r>
     </w:p>
     <w:p>
@@ -693,13 +685,13 @@
         <w:pStyle w:val="Heading2"/>
       </w:pPr>
       <w:r>
-        <w:t>3.2. Thực hiện nghiên cứu cắt lớp (Ablation Study 4 tầng)</w:t>
+        <w:t>3.2. Nghiên cứu cắt lớp (Ablation Study 4 tầng)</w:t>
       </w:r>
     </w:p>
     <w:p>
       <w:pPr/>
       <w:r>
-        <w:t xml:space="preserve">Để phục vụ bài báo khoa học và thuyết minh khóa luận, nhóm đã xây dựng kịch bản kiểm chứng độc lập 4 tầng kỹ thuật trên runner </w:t>
+        <w:t xml:space="preserve">Để phục vụ bài báo khoa học và thuyết minh khóa luận, nhóm đã xây dựng runner </w:t>
       </w:r>
       <w:r>
         <w:rPr>
@@ -708,7 +700,7 @@
         <w:t>scripts/run_ablation_study.py</w:t>
       </w:r>
       <w:r>
-        <w:t>:</w:t>
+        <w:t xml:space="preserve"> để kiểm chứng độc lập 4 tầng kỹ thuật:</w:t>
       </w:r>
     </w:p>
     <w:p>
@@ -722,7 +714,7 @@
         <w:t>Tầng 1 (Rule-Only Syntax):</w:t>
       </w:r>
       <w:r>
-        <w:t xml:space="preserve"> Chỉ dùng luật đối sánh mẫu cú pháp đơn thuần.</w:t>
+        <w:t xml:space="preserve"> Chỉ dùng đối sánh mẫu cú pháp bề mặt.</w:t>
       </w:r>
     </w:p>
     <w:p>
@@ -750,7 +742,7 @@
         <w:t>Tầng 3 (Cross-file Inter-procedural Summary):</w:t>
       </w:r>
       <w:r>
-        <w:t xml:space="preserve"> Bổ sung bộ tóm tắt hàm liên file để phát hiện chuỗi khai thác đa module.</w:t>
+        <w:t xml:space="preserve"> Bổ sung bộ tóm tắt hàm liên file để giải quyết điểm mù chuỗi khai thác đa module.</w:t>
       </w:r>
     </w:p>
     <w:p>
@@ -770,7 +762,7 @@
     <w:p>
       <w:pPr/>
       <w:r>
-        <w:t>Kết quả định lượng cho thấy sự cải thiện rõ ràng qua từng nấc thang: từ độ chính xác 33.3% ở Tầng 1 lên 100% ở Tầng 4 trên chuỗi khai thác đa module.</w:t>
+        <w:t>Kết quả định lượng chứng minh độ chính xác cải thiện rõ rệt: từ 33.3% ở Tầng 1 lên 100% ở Tầng 4 trên chuỗi khai thác đa module.</w:t>
       </w:r>
     </w:p>
     <w:p>
@@ -778,13 +770,13 @@
         <w:pStyle w:val="Heading2"/>
       </w:pPr>
       <w:r>
-        <w:t>3.3. Hoàn thiện API nội bộ và Dashboard tương tác phục vụ Demo</w:t>
+        <w:t>3.3. Hoàn thiện REST API nội bộ và Dashboard tương tác phục vụ Demo</w:t>
       </w:r>
     </w:p>
     <w:p>
       <w:pPr/>
       <w:r>
-        <w:t xml:space="preserve">Nhóm đã triển khai xong module </w:t>
+        <w:t xml:space="preserve">Nhóm đã triển khai module </w:t>
       </w:r>
       <w:r>
         <w:rPr>
@@ -793,7 +785,7 @@
         <w:t>aegis_sast/api/routes.py</w:t>
       </w:r>
       <w:r>
-        <w:t xml:space="preserve"> cung cấp các REST API cho hệ thống:</w:t>
+        <w:t xml:space="preserve"> cung cấp các API endpoint:</w:t>
       </w:r>
     </w:p>
     <w:p>
@@ -801,7 +793,7 @@
         <w:pStyle w:val="ListBullet"/>
       </w:pPr>
       <w:r>
-        <w:t>Khởi chạy quét nền bất đồng bộ và trả về mã tác vụ.</w:t>
+        <w:t>Kích hoạt tiến trình quét nền bất đồng bộ và trả về Task ID.</w:t>
       </w:r>
     </w:p>
     <w:p>
@@ -809,7 +801,7 @@
         <w:pStyle w:val="ListBullet"/>
       </w:pPr>
       <w:r>
-        <w:t>Theo dõi tiến độ quét theo thời gian thực (real-time progress tracking).</w:t>
+        <w:t>Theo dõi trạng thái tiến trình quét theo thời gian thực (real-time progress tracking).</w:t>
       </w:r>
     </w:p>
     <w:p>
@@ -817,13 +809,13 @@
         <w:pStyle w:val="ListBullet"/>
       </w:pPr>
       <w:r>
-        <w:t>Xuất kết quả finding và báo cáo chuẩn hóa.</w:t>
+        <w:t>Cung cấp danh sách finding chuẩn hóa phục vụ giao diện người dùng.</w:t>
       </w:r>
     </w:p>
     <w:p>
       <w:pPr/>
       <w:r>
-        <w:t>Dashboard giao diện người dùng (</w:t>
+        <w:t>Dashboard (</w:t>
       </w:r>
       <w:r>
         <w:rPr>
@@ -832,7 +824,7 @@
         <w:t>apps/findings-dashboard</w:t>
       </w:r>
       <w:r>
-        <w:t>) hiện đã kết nối trực tiếp với backend API. Người dùng có thể xem danh sách lỗ hổng, trực quan hóa đường dẫn vấy bẩn (Taint Flow Trace: Source -&gt; Propagation -&gt; Sink), theo dõi lý lẽ phản biện của Auditor/Skeptic/Judge và xem bản vá code an toàn (Suggested Remediation Patch).</w:t>
+        <w:t>) hiện đã kết nối trực tiếp với backend API, cho phép trực quan hóa đường dẫn vấy bẩn (Taint Flow Trace), hiển thị bảng bằng chứng phản biện (Evidence Ledger của Auditor/Skeptic/Judge) và cung cấp gợi ý bản vá bảo mật (Remediation Patch Diff).</w:t>
       </w:r>
     </w:p>
     <w:p>
@@ -846,7 +838,7 @@
     <w:p>
       <w:pPr/>
       <w:r>
-        <w:t xml:space="preserve">Nhóm đã thiết lập quy trình kiểm thử tự động tại </w:t>
+        <w:t xml:space="preserve">Nhóm đã thiết lập workflow </w:t>
       </w:r>
       <w:r>
         <w:rPr>
@@ -855,7 +847,7 @@
         <w:t>.github/workflows/aegis-scan.yml</w:t>
       </w:r>
       <w:r>
-        <w:t>. Mỗi khi có mã nguồn mới được đẩy lên nhánh main, hệ thống tự động chạy toàn bộ 278 unit tests và kiểm tra pipeline quét tĩnh nhằm đảm bảo không phát sinh lỗi hồi quy (regression).</w:t>
+        <w:t xml:space="preserve"> trên GitHub. Mỗi lượt cập nhật mã nguồn đều tự động kích hoạt bộ kiểm thử gồm 278 unit tests nhằm ngăn ngừa lỗi hồi quy (regression) trong quá trình phát triển.</w:t>
       </w:r>
     </w:p>
     <w:p>
@@ -883,16 +875,7 @@
     <w:p>
       <w:pPr/>
       <w:r>
-        <w:t xml:space="preserve">Kết quả quét và chấm điểm tự động trên toàn bộ kho chuẩn mực đối chiếu với </w:t>
-      </w:r>
-      <w:r>
-        <w:rPr>
-          <w:rFonts w:ascii="Consolas" w:hAnsi="Consolas"/>
-        </w:rPr>
-        <w:t>expectedresults-0.1.csv</w:t>
-      </w:r>
-      <w:r>
-        <w:t>:</w:t>
+        <w:t>Kết quả đối chiếu trên 677 test cases nằm trong phạm vi tập luật:</w:t>
       </w:r>
     </w:p>
     <w:tbl>
@@ -1243,7 +1226,7 @@
         <w:rPr>
           <w:b/>
         </w:rPr>
-        <w:t>Ý nghĩa học thuật từ kết quả:</w:t>
+        <w:t>Phân tích kỹ thuật từ kết quả:</w:t>
       </w:r>
     </w:p>
     <w:p>
@@ -1257,7 +1240,7 @@
         <w:t>Triệt tiêu 65.00% False Positive:</w:t>
       </w:r>
       <w:r>
-        <w:t xml:space="preserve"> Aegis-SAST đã loại bỏ được 416 cảnh báo rác mà Semgrep nguyên bản báo nhầm (từ 640 FP xuống còn 224 FP).</w:t>
+        <w:t xml:space="preserve"> Aegis-SAST loại bỏ thành công 416 cảnh báo giả mà Semgrep nguyên bản báo nhầm (từ 640 FP xuống còn 224 FP).</w:t>
       </w:r>
     </w:p>
     <w:p>
@@ -1268,7 +1251,7 @@
         <w:rPr>
           <w:b/>
         </w:rPr>
-        <w:t>Độ chính xác (Precision) tăng gần gấp đôi:</w:t>
+        <w:t>Precision tăng gần gấp đôi:</w:t>
       </w:r>
       <w:r>
         <w:t xml:space="preserve"> Tăng từ 16.88% lên 33.13% (tăng tương đối +96.27%).</w:t>
@@ -1282,10 +1265,10 @@
         <w:rPr>
           <w:b/>
         </w:rPr>
-        <w:t>F1-Score cải thiện rõ rệt:</w:t>
+        <w:t>F1-Score cải thiện 50%:</w:t>
       </w:r>
       <w:r>
-        <w:t xml:space="preserve"> Tăng từ 0.2574 lên 0.3861 (tăng tương đối +50.00%).</w:t>
+        <w:t xml:space="preserve"> Tăng từ 0.2574 lên 0.3861.</w:t>
       </w:r>
     </w:p>
     <w:p>
@@ -1293,13 +1276,13 @@
         <w:pStyle w:val="Heading2"/>
       </w:pPr>
       <w:r>
-        <w:t>4.2. Bảng số liệu phân tích sâu trên 4 họ lỗ hổng trọng tâm (Core 4 Families)</w:t>
+        <w:t>4.2. Bảng số liệu trên 4 họ lỗ hổng trọng tâm (Core 4 Families)</w:t>
       </w:r>
     </w:p>
     <w:p>
       <w:pPr/>
       <w:r>
-        <w:t>Khi bóc tách dữ liệu trên 4 họ lỗ hổng trọng tâm mà nhóm tập trung thiết kế mô hình đồ thị luồng dữ liệu (CWE-78 Command Injection, CWE-22 Path Traversal, CWE-502 Insecure Deserialization, CWE-89 SQL Injection):</w:t>
+        <w:t>Khi đánh giá riêng trên 4 họ lỗ hổng mục tiêu mà nhóm tập trung thiết kế mô hình đồ thị DFG (Command Injection CWE-78, Path Traversal CWE-22, Insecure Deserialization CWE-502, SQL Injection CWE-89):</w:t>
       </w:r>
     </w:p>
     <w:tbl>
@@ -1619,7 +1602,7 @@
         <w:rPr>
           <w:b/>
         </w:rPr>
-        <w:t>Điểm đột phá:</w:t>
+        <w:t>Nhận xét kỹ thuật:</w:t>
       </w:r>
     </w:p>
     <w:p>
@@ -1627,16 +1610,16 @@
         <w:pStyle w:val="ListBullet"/>
       </w:pPr>
       <w:r>
-        <w:t xml:space="preserve">Trên 4 nhóm lỗ hổng cốt lõi, Aegis-SAST </w:t>
+        <w:t xml:space="preserve">Trên 4 họ mục tiêu, Aegis-SAST </w:t>
       </w:r>
       <w:r>
         <w:rPr>
           <w:b/>
         </w:rPr>
-        <w:t>triệt tiêu tới 89.66% cảnh báo giả</w:t>
+        <w:t>triệt tiêu 89.66% False Positive</w:t>
       </w:r>
       <w:r>
-        <w:t xml:space="preserve"> (từ 348 FP xuống chỉ còn 36 FP).</w:t>
+        <w:t xml:space="preserve"> (từ 348 FP xuống còn 36 FP).</w:t>
       </w:r>
     </w:p>
     <w:p>
@@ -1644,7 +1627,7 @@
         <w:pStyle w:val="ListBullet"/>
       </w:pPr>
       <w:r>
-        <w:t>Độ chính xác tăng gần 4 lần (từ 16.75% lên 62.11%).</w:t>
+        <w:t>Precision tăng gần 4 lần (từ 16.75% lên 62.11%), F1 tăng hơn gấp đôi (từ 26.97% lên 60.20%).</w:t>
       </w:r>
     </w:p>
     <w:p>
@@ -1661,7 +1644,7 @@
         <w:t>Path Traversal (CWE-22)</w:t>
       </w:r>
       <w:r>
-        <w:t xml:space="preserve">: False Positive giảm tới 93% (từ 329 ca FP xuống còn 23 ca FP) nhờ mô hình nhận diện hàm chuẩn hóa đường dẫn </w:t>
+        <w:t xml:space="preserve">: Giảm 93% False Positive (từ 329 xuống 23 FP) nhờ mô hình nhận diện hàm chuẩn hóa </w:t>
       </w:r>
       <w:r>
         <w:rPr>
@@ -1696,7 +1679,7 @@
         <w:t>SQL Injection (CWE-89)</w:t>
       </w:r>
       <w:r>
-        <w:t>: Đạt độ chính xác 100% tuyệt đối (FP = 0).</w:t>
+        <w:t>: Đạt Precision 100% (FP = 0).</w:t>
       </w:r>
     </w:p>
     <w:p>
@@ -1710,7 +1693,7 @@
         <w:pStyle w:val="Heading1"/>
       </w:pPr>
       <w:r>
-        <w:t>5. Phân Tích Khó Khăn Học Thuật &amp; Định Hướng Nâng Cấp Chuẩn Doanh Nghiệp</w:t>
+        <w:t>5. Tham Chiếu Kiến Trúc Chuẩn Doanh Nghiệp (Không Tối Ưu Cục Bộ Theo Benchmark)</w:t>
       </w:r>
     </w:p>
     <w:p>
@@ -1718,13 +1701,13 @@
         <w:pStyle w:val="Heading2"/>
       </w:pPr>
       <w:r>
-        <w:t>5.1. Nhận diện nguyên nhân điểm tổng thể 10 họ bị kéo tụt</w:t>
+        <w:t>5.1. Phân tích nguyên nhân điểm tổng thể bị giới hạn</w:t>
       </w:r>
     </w:p>
     <w:p>
       <w:pPr/>
       <w:r>
-        <w:t>Khi mở rộng đánh giá ra toàn bộ 10 họ lỗi của OWASP, điểm F1 tổng thể đạt 38.61% (dù cải thiện 50% so với Semgrep gốc 25.74%) nhưng chưa đạt mức kỳ vọng cao nhất của nhóm. Khi mổ xẻ nguyên nhân kỹ thuật, nhóm nhận thấy hơn 70% số lượng False Positive còn lại tập trung ở hai điểm nghẽn:</w:t>
+        <w:t>Khi đánh giá trên toàn bộ 10 họ lỗi, điểm F1 dừng ở mức 38.61% do hơn 70% số lượng False Positive còn lại tập trung ở hai nhóm:</w:t>
       </w:r>
     </w:p>
     <w:p>
@@ -1735,10 +1718,10 @@
         <w:rPr>
           <w:b/>
         </w:rPr>
-        <w:t>XSS (CWE-79) chiếm 115 / 224 FP:</w:t>
+        <w:t>XSS (CWE-79) với 115 FP:</w:t>
       </w:r>
       <w:r>
-        <w:t xml:space="preserve"> 100% test case trong OWASP Benchmark Python đều sử dụng hàm </w:t>
+        <w:t xml:space="preserve"> Các ca kiểm thử đều sử dụng hàm </w:t>
       </w:r>
       <w:r>
         <w:rPr>
@@ -1747,16 +1730,16 @@
         <w:t>escape_for_html(...)</w:t>
       </w:r>
       <w:r>
-        <w:t xml:space="preserve"> ở cuối route để trả về kết quả. Tuy nhiên, rule thô của Semgrep gán cờ toàn bộ lệnh </w:t>
+        <w:t xml:space="preserve"> trong cấu trúc chuỗi multiline </w:t>
       </w:r>
       <w:r>
         <w:rPr>
           <w:rFonts w:ascii="Consolas" w:hAnsi="Consolas"/>
         </w:rPr>
-        <w:t>return RESPONSE</w:t>
+        <w:t>RESPONSE += ...</w:t>
       </w:r>
       <w:r>
-        <w:t>, và bộ lọc cũ của Aegis chưa quét đủ ngữ cảnh multiline nên không nhận diện được hàm escape này, khiến 115 ca an toàn bị báo nhầm là XSS.</w:t>
+        <w:t>. Rule Semgrep gắn cờ toàn bộ lệnh trả về, trong khi bộ trích xuất sanitizer cũ chỉ đọc dòng đầu tiên nên bỏ sót cơ chế làm sạch này.</w:t>
       </w:r>
     </w:p>
     <w:p>
@@ -1770,7 +1753,7 @@
         <w:t>XXE (CWE-611) bị mất Recall:</w:t>
       </w:r>
       <w:r>
-        <w:t xml:space="preserve"> Semgrep bắt mọi dòng </w:t>
+        <w:t xml:space="preserve"> Semgrep bắt mọi lệnh </w:t>
       </w:r>
       <w:r>
         <w:rPr>
@@ -1779,16 +1762,7 @@
         <w:t>import xml.dom.minidom</w:t>
       </w:r>
       <w:r>
-        <w:t xml:space="preserve"> (sinh ra 77 FP). Bộ lọc cũ của Aegis thấy dòng import không có luồng dữ liệu nên triệt tiêu sạch, vô tình triệt tiêu luôn cả 8 ca lỗ hổng thật. Trong thực tế, parser XML của Python chỉ dính XXE khi có cấu hình bật thực thể ngoài </w:t>
-      </w:r>
-      <w:r>
-        <w:rPr>
-          <w:rFonts w:ascii="Consolas" w:hAnsi="Consolas"/>
-        </w:rPr>
-        <w:t>feature_external_ges = True</w:t>
-      </w:r>
-      <w:r>
-        <w:t>.</w:t>
+        <w:t xml:space="preserve"> (sinh ra 77 FP). Bộ lọc cũ của Aegis thấy dòng import không có luồng dữ liệu vấy bẩn nên dập tắt toàn bộ, làm mất 8 ca lỗi thật.</w:t>
       </w:r>
     </w:p>
     <w:p>
@@ -1796,45 +1770,54 @@
         <w:pStyle w:val="Heading2"/>
       </w:pPr>
       <w:r>
-        <w:t>5.2. Quan điểm nghiên cứu: Tuyệt đối không "học vẹt" (overfit) benchmark</w:t>
+        <w:t>5.2. Nguyên tắc nghiên cứu: Tránh bẫy Overfitting, tuân thủ chuẩn công nghiệp</w:t>
       </w:r>
     </w:p>
     <w:p>
       <w:pPr/>
       <w:r>
-        <w:t>Nhóm nhận thức rõ ràng: Nếu chỉ viết luật để bắt đúng tên hàm hay tên biến của OWASP Benchmark thì điểm số có thể tăng rất cao trên giấy tờ, nhưng công cụ sẽ hoàn toàn vô dụng khi đưa vào quét dự án thực tế của doanh nghiệp.</w:t>
+        <w:t xml:space="preserve">Nhóm kiên định quan điểm: </w:t>
+      </w:r>
+      <w:r>
+        <w:rPr>
+          <w:b/>
+        </w:rPr>
+        <w:t>Tuyệt đối không tự chế các luật chắp vá (ad-hoc regex) để khớp tên biến của benchmark</w:t>
+      </w:r>
+      <w:r>
+        <w:t>. Để công cụ có giá trị ứng dụng thực tế trong môi trường doanh nghiệp, nhóm tham chiếu trực tiếp các đặc tả kỹ thuật từ các nền tảng phân tích tĩnh và nghiên cứu quốc tế:</w:t>
+      </w:r>
+    </w:p>
+    <w:p>
+      <w:pPr>
+        <w:pStyle w:val="Heading3"/>
+      </w:pPr>
+      <w:r>
+        <w:t>A. Đặc tả Taint Barrier chuẩn CodeQL (GitHub CodeQL Specification)</w:t>
       </w:r>
     </w:p>
     <w:p>
       <w:pPr/>
       <w:r>
-        <w:t xml:space="preserve">Vì vậy, mục tiêu của đề tài là xây dựng một </w:t>
+        <w:t>Trong CodeQL Python Taint Tracking (</w:t>
       </w:r>
       <w:r>
         <w:rPr>
-          <w:b/>
+          <w:rFonts w:ascii="Consolas" w:hAnsi="Consolas"/>
         </w:rPr>
-        <w:t>giải pháp SAST cấp doanh nghiệp (Enterprise-grade SAST)</w:t>
+        <w:t>semmle.python.dataflow.new.TaintTracking</w:t>
       </w:r>
       <w:r>
-        <w:t xml:space="preserve"> học hỏi từ các nền tảng hàng đầu thế giới (CodeQL, Snyk DeepCode AI, và nghiên cứu Multi-Agent SAST của Tencent năm 2025-2026), giải quyết tận gốc bài toán mệt mỏi vì cảnh báo rác (Alert Fatigue) thông qua 3 trụ cột kỹ thuật:</w:t>
+        <w:t xml:space="preserve">), khái niệm Sanitizer và Guard được chuẩn hóa thông qua vị ngữ </w:t>
       </w:r>
-    </w:p>
-    <w:p>
-      <w:pPr>
-        <w:pStyle w:val="Heading2"/>
-      </w:pPr>
-      <w:r>
-        <w:t>5.3. Ba trụ cột nâng cấp sắp tới</w:t>
-      </w:r>
-    </w:p>
-    <w:p>
-      <w:pPr/>
       <w:r>
         <w:rPr>
-          <w:b/>
+          <w:rFonts w:ascii="Consolas" w:hAnsi="Consolas"/>
         </w:rPr>
-        <w:t>Trụ cột 1: Phân tích khả năng kích hoạt từ ngoài vào (Reachability Analysis)</w:t>
+        <w:t>isBarrier(DataFlow::Node node)</w:t>
+      </w:r>
+      <w:r>
+        <w:t>. Aegis-SAST sẽ áp dụng cơ chế Barrier chuẩn này:</w:t>
       </w:r>
     </w:p>
     <w:p>
@@ -1842,155 +1825,13 @@
         <w:pStyle w:val="ListBullet"/>
       </w:pPr>
       <w:r>
-        <w:t>*Bài toán:* SAST truyền thống báo hàng nghìn lỗi ma vì cứ thấy hàm nhạy cảm là báo, dù hàm đó nằm ở file script nội bộ, cronjob hay dead code.</w:t>
-      </w:r>
-    </w:p>
-    <w:p>
-      <w:pPr>
-        <w:pStyle w:val="ListBullet"/>
-      </w:pPr>
-      <w:r>
-        <w:t>*Giải pháp:* Dựng bản đồ luồng gọi từ Public Entrypoint (Flask/FastAPI route, Django views) xuyên qua Service/Helper đến Sink. Nếu hàm nhạy cảm không thể kích hoạt từ internet thì tự động hạ mức ưu tiên hoặc gắn nhãn unreachable.</w:t>
-      </w:r>
-    </w:p>
-    <w:p>
-      <w:pPr/>
-      <w:r>
         <w:rPr>
           <w:b/>
         </w:rPr>
-        <w:t>Trụ cột 2: Mô hình hóa cơ chế phòng vệ của Framework (Framework Defense Modeling)</w:t>
-      </w:r>
-    </w:p>
-    <w:p>
-      <w:pPr>
-        <w:pStyle w:val="ListBullet"/>
-      </w:pPr>
-      <w:r>
-        <w:t>*Bài toán:* Lập trình viên hiện đại dùng cơ chế an toàn của framework (ORM query builder, Pydantic validation schema, Template auto-escaping) chứ không lọc regex thủ công. SAST không hiểu framework sẽ coi toàn bộ code là có lỗi.</w:t>
-      </w:r>
-    </w:p>
-    <w:p>
-      <w:pPr>
-        <w:pStyle w:val="ListBullet"/>
-      </w:pPr>
-      <w:r>
-        <w:t>*Giải pháp:* Tích hợp nhận diện tầng Data Validation (Pydantic, ép kiểu số nguyên/thực, UUID); nhận diện truy vấn qua ORM (SQLAlchemy, Django ORM); nhận diện cấu hình an toàn của parser XML (</w:t>
+        <w:t>Sanitizer Barrier:</w:t>
       </w:r>
       <w:r>
-        <w:rPr>
-          <w:rFonts w:ascii="Consolas" w:hAnsi="Consolas"/>
-        </w:rPr>
-        <w:t>defusedxml</w:t>
-      </w:r>
-      <w:r>
-        <w:t>, cấm external general entities).</w:t>
-      </w:r>
-    </w:p>
-    <w:p>
-      <w:pPr/>
-      <w:r>
-        <w:rPr>
-          <w:b/>
-        </w:rPr>
-        <w:t>Trụ cột 3: Thẩm định phản biện hai chiều đa tác tử (Multi-Agent Hypothesis-Validation Triage)</w:t>
-      </w:r>
-    </w:p>
-    <w:p>
-      <w:pPr>
-        <w:pStyle w:val="ListBullet"/>
-      </w:pPr>
-      <w:r>
-        <w:t>*Bài toán:* Ném toàn bộ code vào prompt hỏi "code có lỗi không" rất dễ bị AI đoán mò và sinh ảo giác (hallucination).</w:t>
-      </w:r>
-    </w:p>
-    <w:p>
-      <w:pPr>
-        <w:pStyle w:val="ListBullet"/>
-      </w:pPr>
-      <w:r>
-        <w:t>*Giải pháp:* Triển khai luồng phản biện có bằng chứng:</w:t>
-      </w:r>
-    </w:p>
-    <w:p>
-      <w:pPr>
-        <w:pStyle w:val="ListBullet"/>
-      </w:pPr>
-      <w:r>
-        <w:t>Tác tử Auditor: Dựng giả thuyết khai thác cụ thể từ vết luồng dữ liệu (Payload giả định là gì, đi từ source nào vào sink nào).</w:t>
-      </w:r>
-    </w:p>
-    <w:p>
-      <w:pPr>
-        <w:pStyle w:val="ListBullet"/>
-      </w:pPr>
-      <w:r>
-        <w:t>Tác tử Skeptic: Tìm bằng chứng phản bác (Dữ liệu đã qua sanitizer chưa, điều kiện rẽ nhánh có chặn không).</w:t>
-      </w:r>
-    </w:p>
-    <w:p>
-      <w:pPr>
-        <w:pStyle w:val="ListBullet"/>
-      </w:pPr>
-      <w:r>
-        <w:t>Tác tử Judge: Trọng tài ra quyết định dựa trên bảng bằng chứng (Evidence Ledger) và sinh bản vá code an toàn (Remediation Diff).</w:t>
-      </w:r>
-    </w:p>
-    <w:p>
-      <w:pPr/>
-      <w:r>
-        <w:t>---</w:t>
-      </w:r>
-    </w:p>
-    <w:p>
-      <w:pPr>
-        <w:pStyle w:val="Heading1"/>
-      </w:pPr>
-      <w:r>
-        <w:t>6. Kế Hoạch Triển Khai Trong Tuần Tới</w:t>
-      </w:r>
-    </w:p>
-    <w:p>
-      <w:pPr/>
-      <w:r>
-        <w:t>Trong tuần tới, nhóm dự kiến tập trung vào các đầu việc cụ thể sau:</w:t>
-      </w:r>
-    </w:p>
-    <w:p>
-      <w:pPr>
-        <w:pStyle w:val="ListNumber"/>
-      </w:pPr>
-      <w:r>
-        <w:rPr>
-          <w:b/>
-        </w:rPr>
-        <w:t>Về lõi Engine &amp; Sanitizers:</w:t>
-      </w:r>
-    </w:p>
-    <w:p>
-      <w:pPr>
-        <w:pStyle w:val="ListBullet"/>
-      </w:pPr>
-      <w:r>
-        <w:t xml:space="preserve">Cập nhật bộ quét đa dòng trong </w:t>
-      </w:r>
-      <w:r>
-        <w:rPr>
-          <w:rFonts w:ascii="Consolas" w:hAnsi="Consolas"/>
-        </w:rPr>
-        <w:t>TaintBridge</w:t>
-      </w:r>
-      <w:r>
-        <w:t xml:space="preserve"> để nhận diện toàn diện các hàm làm sạch HTML (</w:t>
-      </w:r>
-      <w:r>
-        <w:rPr>
-          <w:rFonts w:ascii="Consolas" w:hAnsi="Consolas"/>
-        </w:rPr>
-        <w:t>escape_for_html</w:t>
-      </w:r>
-      <w:r>
-        <w:t xml:space="preserve">, </w:t>
+        <w:t xml:space="preserve"> Bắt các hàm mã hóa ngữ cảnh (</w:t>
       </w:r>
       <w:r>
         <w:rPr>
@@ -2005,10 +1846,28 @@
         <w:rPr>
           <w:rFonts w:ascii="Consolas" w:hAnsi="Consolas"/>
         </w:rPr>
-        <w:t>bleach</w:t>
+        <w:t>bleach.clean</w:t>
       </w:r>
       <w:r>
-        <w:t>, Jinja2 autoescape), giải quyết dứt điểm 115 False Positive của XSS.</w:t>
+        <w:t xml:space="preserve">, </w:t>
+      </w:r>
+      <w:r>
+        <w:rPr>
+          <w:rFonts w:ascii="Consolas" w:hAnsi="Consolas"/>
+        </w:rPr>
+        <w:t>shlex.quote</w:t>
+      </w:r>
+      <w:r>
+        <w:t xml:space="preserve">, </w:t>
+      </w:r>
+      <w:r>
+        <w:rPr>
+          <w:rFonts w:ascii="Consolas" w:hAnsi="Consolas"/>
+        </w:rPr>
+        <w:t>os.path.basename</w:t>
+      </w:r>
+      <w:r>
+        <w:t>).</w:t>
       </w:r>
     </w:p>
     <w:p>
@@ -2016,7 +1875,115 @@
         <w:pStyle w:val="ListBullet"/>
       </w:pPr>
       <w:r>
-        <w:t>Bổ sung logic kiểm tra cờ cấu hình parser XML (</w:t>
+        <w:rPr>
+          <w:b/>
+        </w:rPr>
+        <w:t>Type Barrier:</w:t>
+      </w:r>
+      <w:r>
+        <w:t xml:space="preserve"> Các hàm ép kiểu dữ liệu an toàn (</w:t>
+      </w:r>
+      <w:r>
+        <w:rPr>
+          <w:rFonts w:ascii="Consolas" w:hAnsi="Consolas"/>
+        </w:rPr>
+        <w:t>int()</w:t>
+      </w:r>
+      <w:r>
+        <w:t xml:space="preserve">, </w:t>
+      </w:r>
+      <w:r>
+        <w:rPr>
+          <w:rFonts w:ascii="Consolas" w:hAnsi="Consolas"/>
+        </w:rPr>
+        <w:t>float()</w:t>
+      </w:r>
+      <w:r>
+        <w:t xml:space="preserve">, </w:t>
+      </w:r>
+      <w:r>
+        <w:rPr>
+          <w:rFonts w:ascii="Consolas" w:hAnsi="Consolas"/>
+        </w:rPr>
+        <w:t>UUID()</w:t>
+      </w:r>
+      <w:r>
+        <w:t>, Pydantic Schema Validator) đóng vai trò là điểm cắt vấy bẩn (untaint barrier).</w:t>
+      </w:r>
+    </w:p>
+    <w:p>
+      <w:pPr>
+        <w:pStyle w:val="Heading3"/>
+      </w:pPr>
+      <w:r>
+        <w:t xml:space="preserve">B. Đặc tả kiểm tra cấu hình XXE chuẩn CodeQL </w:t>
+      </w:r>
+      <w:r>
+        <w:rPr>
+          <w:rFonts w:ascii="Consolas" w:hAnsi="Consolas"/>
+        </w:rPr>
+        <w:t>py/xxe</w:t>
+      </w:r>
+      <w:r>
+        <w:t xml:space="preserve"> (CWE-611)</w:t>
+      </w:r>
+    </w:p>
+    <w:p>
+      <w:pPr/>
+      <w:r>
+        <w:t xml:space="preserve">Theo đặc tả của CodeQL </w:t>
+      </w:r>
+      <w:r>
+        <w:rPr>
+          <w:rFonts w:ascii="Consolas" w:hAnsi="Consolas"/>
+        </w:rPr>
+        <w:t>python/ql/src/Security/CWE-611/Xxe.ql</w:t>
+      </w:r>
+      <w:r>
+        <w:t xml:space="preserve"> và OWASP Cheat Sheet:</w:t>
+      </w:r>
+    </w:p>
+    <w:p>
+      <w:pPr>
+        <w:pStyle w:val="ListBullet"/>
+      </w:pPr>
+      <w:r>
+        <w:t xml:space="preserve">Một parser XML chỉ bị coi là có lỗ hổng XXE khi nhận dữ liệu người dùng </w:t>
+      </w:r>
+      <w:r>
+        <w:rPr>
+          <w:b/>
+        </w:rPr>
+        <w:t>VÀ</w:t>
+      </w:r>
+      <w:r>
+        <w:t xml:space="preserve"> cấu hình parser cho phép phân giải thực thể ngoài.</w:t>
+      </w:r>
+    </w:p>
+    <w:p>
+      <w:pPr>
+        <w:pStyle w:val="ListBullet"/>
+      </w:pPr>
+      <w:r>
+        <w:t xml:space="preserve">Với thư viện </w:t>
+      </w:r>
+      <w:r>
+        <w:rPr>
+          <w:rFonts w:ascii="Consolas" w:hAnsi="Consolas"/>
+        </w:rPr>
+        <w:t>xml.sax</w:t>
+      </w:r>
+      <w:r>
+        <w:t xml:space="preserve"> / </w:t>
+      </w:r>
+      <w:r>
+        <w:rPr>
+          <w:rFonts w:ascii="Consolas" w:hAnsi="Consolas"/>
+        </w:rPr>
+        <w:t>minidom</w:t>
+      </w:r>
+      <w:r>
+        <w:t xml:space="preserve">: Cờ </w:t>
       </w:r>
       <w:r>
         <w:rPr>
@@ -2025,7 +1992,175 @@
         <w:t>feature_external_ges</w:t>
       </w:r>
       <w:r>
-        <w:t>) cho họ XXE để khôi phục 100% Recall và triệt tiêu 77 FP.</w:t>
+        <w:t xml:space="preserve"> hoặc </w:t>
+      </w:r>
+      <w:r>
+        <w:rPr>
+          <w:rFonts w:ascii="Consolas" w:hAnsi="Consolas"/>
+        </w:rPr>
+        <w:t>feature_external_pes</w:t>
+      </w:r>
+      <w:r>
+        <w:t xml:space="preserve"> phải được gán giá trị </w:t>
+      </w:r>
+      <w:r>
+        <w:rPr>
+          <w:rFonts w:ascii="Consolas" w:hAnsi="Consolas"/>
+        </w:rPr>
+        <w:t>True</w:t>
+      </w:r>
+      <w:r>
+        <w:t>. Nếu cờ này không được kích hoạt, parser an toàn theo mặc định $\rightarrow$ Phải coi là Sanitizer Barrier hợp lệ.</w:t>
+      </w:r>
+    </w:p>
+    <w:p>
+      <w:pPr>
+        <w:pStyle w:val="ListBullet"/>
+      </w:pPr>
+      <w:r>
+        <w:t xml:space="preserve">Thư viện </w:t>
+      </w:r>
+      <w:r>
+        <w:rPr>
+          <w:rFonts w:ascii="Consolas" w:hAnsi="Consolas"/>
+        </w:rPr>
+        <w:t>defusedxml</w:t>
+      </w:r>
+      <w:r>
+        <w:t xml:space="preserve"> được định nghĩa mặc định là Barrier an toàn cho toàn bộ luồng XML.</w:t>
+      </w:r>
+    </w:p>
+    <w:p>
+      <w:pPr>
+        <w:pStyle w:val="Heading3"/>
+      </w:pPr>
+      <w:r>
+        <w:t>C. Phân tích khả năng kích hoạt (Reachability Analysis từ Semgrep Pro / CodeQL)</w:t>
+      </w:r>
+    </w:p>
+    <w:p>
+      <w:pPr/>
+      <w:r>
+        <w:t>Trong dự án doanh nghiệp, phần lớn code là tiện ích nội bộ hoặc batch job. Aegis-SAST xây dựng ranh giới tin cậy (Trust Boundary):</w:t>
+      </w:r>
+    </w:p>
+    <w:p>
+      <w:pPr>
+        <w:pStyle w:val="ListBullet"/>
+      </w:pPr>
+      <w:r>
+        <w:t>Xác định điểm vào công khai (</w:t>
+      </w:r>
+      <w:r>
+        <w:rPr>
+          <w:b/>
+        </w:rPr>
+        <w:t>Public Entrypoints</w:t>
+      </w:r>
+      <w:r>
+        <w:t>): Các route controller của Flask (</w:t>
+      </w:r>
+      <w:r>
+        <w:rPr>
+          <w:rFonts w:ascii="Consolas" w:hAnsi="Consolas"/>
+        </w:rPr>
+        <w:t>@app.route</w:t>
+      </w:r>
+      <w:r>
+        <w:t>), FastAPI (</w:t>
+      </w:r>
+      <w:r>
+        <w:rPr>
+          <w:rFonts w:ascii="Consolas" w:hAnsi="Consolas"/>
+        </w:rPr>
+        <w:t>@router</w:t>
+      </w:r>
+      <w:r>
+        <w:t>), Django views.</w:t>
+      </w:r>
+    </w:p>
+    <w:p>
+      <w:pPr>
+        <w:pStyle w:val="ListBullet"/>
+      </w:pPr>
+      <w:r>
+        <w:t>Chỉ gắn cờ nguy hiểm cao (High Risk) khi tồn tại đường dẫn kích hoạt liên hàm từ Public Entrypoint đến Sink. Các hàm nằm ngoài luồng gọi công khai được hạ mức ưu tiên để tránh Alert Fatigue.</w:t>
+      </w:r>
+    </w:p>
+    <w:p>
+      <w:pPr>
+        <w:pStyle w:val="Heading3"/>
+      </w:pPr>
+      <w:r>
+        <w:t>D. Luồng thẩm định phản biện giả thuyết (Hypothesis-Validation từ VulAgent / VulnDetect AI 2026)</w:t>
+      </w:r>
+    </w:p>
+    <w:p>
+      <w:pPr/>
+      <w:r>
+        <w:t>Thay vì sử dụng prompt chung chung "đoán xem code có lỗi không", hệ thống áp dụng luồng kiểm chứng giả thuyết có thể bác bỏ (Falsifiable Hypothesis Testing):</w:t>
+      </w:r>
+    </w:p>
+    <w:p>
+      <w:pPr>
+        <w:pStyle w:val="ListBullet"/>
+      </w:pPr>
+      <w:r>
+        <w:rPr>
+          <w:b/>
+        </w:rPr>
+        <w:t>Auditor Agent:</w:t>
+      </w:r>
+      <w:r>
+        <w:t xml:space="preserve"> Thiết lập giả thuyết tấn công cụ thể (Source, Sink, điều kiện kích hoạt payload).</w:t>
+      </w:r>
+    </w:p>
+    <w:p>
+      <w:pPr>
+        <w:pStyle w:val="ListBullet"/>
+      </w:pPr>
+      <w:r>
+        <w:rPr>
+          <w:b/>
+        </w:rPr>
+        <w:t>Skeptic Agent:</w:t>
+      </w:r>
+      <w:r>
+        <w:t xml:space="preserve"> Tìm kiếm bằng chứng phản bác (Kiểm tra Sanitizer Barrier, điều kiện rẽ nhánh bảo vệ, cấu hình an toàn).</w:t>
+      </w:r>
+    </w:p>
+    <w:p>
+      <w:pPr>
+        <w:pStyle w:val="ListBullet"/>
+      </w:pPr>
+      <w:r>
+        <w:rPr>
+          <w:b/>
+        </w:rPr>
+        <w:t>Judge Agent:</w:t>
+      </w:r>
+      <w:r>
+        <w:t xml:space="preserve"> Đóng vai trò trọng tài, chỉ xác nhận lỗ hổng khi Auditor có đường dẫn đầy đủ và Skeptic không tìm thấy bằng chứng phòng vệ hợp lệ.</w:t>
+      </w:r>
+    </w:p>
+    <w:p>
+      <w:pPr/>
+      <w:r>
+        <w:t>---</w:t>
+      </w:r>
+    </w:p>
+    <w:p>
+      <w:pPr>
+        <w:pStyle w:val="Heading1"/>
+      </w:pPr>
+      <w:r>
+        <w:t>6. Kế Hoạch Triển Khai Trong Tuần Tiếp Theo</w:t>
+      </w:r>
+    </w:p>
+    <w:p>
+      <w:pPr/>
+      <w:r>
+        <w:t>Trong tuần tới, nhóm tập trung triển khai các đầu việc kỹ thuật theo đúng đặc tả tham chiếu:</w:t>
       </w:r>
     </w:p>
     <w:p>
@@ -2036,15 +2171,19 @@
         <w:rPr>
           <w:b/>
         </w:rPr>
-        <w:t>Về Field-Sensitive Taint Analysis:</w:t>
+        <w:t>Chuẩn hóa Taint Barrier cho XSS:</w:t>
       </w:r>
-    </w:p>
-    <w:p>
-      <w:pPr>
-        <w:pStyle w:val="ListBullet"/>
-      </w:pPr>
       <w:r>
-        <w:t>Hoàn thiện bộ theo dõi khóa dữ liệu (Field-sensitive DFG) để phân biệt các trường an toàn vs độc hại trong Dictionary và ConfigParser, xử lý triệt để các bẫy rẽ nhánh hằng số.</w:t>
+        <w:t xml:space="preserve"> Nâng cấp bộ trích xuất Sanitizer trong </w:t>
+      </w:r>
+      <w:r>
+        <w:rPr>
+          <w:rFonts w:ascii="Consolas" w:hAnsi="Consolas"/>
+        </w:rPr>
+        <w:t>TaintBridge</w:t>
+      </w:r>
+      <w:r>
+        <w:t xml:space="preserve"> để quét toàn diện biểu thức gán đa dòng, nhận diện chính xác các hàm mã hóa HTML theo chuẩn OWASP.</w:t>
       </w:r>
     </w:p>
     <w:p>
@@ -2055,15 +2194,28 @@
         <w:rPr>
           <w:b/>
         </w:rPr>
-        <w:t>Về lớp Multi-Agent AI:</w:t>
+        <w:t>Áp dụng kiểm tra cấu hình parser cho XXE:</w:t>
       </w:r>
-    </w:p>
-    <w:p>
-      <w:pPr>
-        <w:pStyle w:val="ListBullet"/>
-      </w:pPr>
       <w:r>
-        <w:t>Thử nghiệm kết nối lớp Multi-Agent Triage với runtime LLM cục bộ (Ollama / vLLM) chạy mô hình mã nguồn mở để đánh giá chi phí token và độ trễ phản hồi.</w:t>
+        <w:t xml:space="preserve"> Cập nhật detector theo đặc tả CodeQL </w:t>
+      </w:r>
+      <w:r>
+        <w:rPr>
+          <w:rFonts w:ascii="Consolas" w:hAnsi="Consolas"/>
+        </w:rPr>
+        <w:t>py/xxe</w:t>
+      </w:r>
+      <w:r>
+        <w:t xml:space="preserve">, kiểm tra cờ </w:t>
+      </w:r>
+      <w:r>
+        <w:rPr>
+          <w:rFonts w:ascii="Consolas" w:hAnsi="Consolas"/>
+        </w:rPr>
+        <w:t>feature_external_ges</w:t>
+      </w:r>
+      <w:r>
+        <w:t xml:space="preserve"> để khôi phục 100% Recall và triệt tiêu 77 False Positive của họ XXE.</w:t>
       </w:r>
     </w:p>
     <w:p>
@@ -2074,15 +2226,38 @@
         <w:rPr>
           <w:b/>
         </w:rPr>
-        <w:t>Về Demo &amp; Báo cáo:</w:t>
+        <w:t>Mô hình hóa Field-Sensitive DFG:</w:t>
+      </w:r>
+      <w:r>
+        <w:t xml:space="preserve"> Lần vết dữ liệu chi tiết theo từng khóa (key-sensitive) cho Dictionary và đối tượng cấu hình, nhận diện chính xác các giá trị hằng số an toàn.</w:t>
       </w:r>
     </w:p>
     <w:p>
       <w:pPr>
-        <w:pStyle w:val="ListBullet"/>
+        <w:pStyle w:val="ListNumber"/>
       </w:pPr>
       <w:r>
-        <w:t>Chuẩn bị slide báo cáo tiến độ và chạy thử kịch bản demo end-to-end trên Web Dashboard để sẵn sàng báo cáo trực tiếp với Thầy.</w:t>
+        <w:rPr>
+          <w:b/>
+        </w:rPr>
+        <w:t>Đo đạc thực nghiệm với Local LLM Runtime:</w:t>
+      </w:r>
+      <w:r>
+        <w:t xml:space="preserve"> Chạy thử nghiệm lớp Multi-Agent Triage với mô hình mã nguồn mở cục bộ (Ollama / vLLM) để đánh giá độ trễ và khả năng giảm nhiễu.</w:t>
+      </w:r>
+    </w:p>
+    <w:p>
+      <w:pPr>
+        <w:pStyle w:val="ListNumber"/>
+      </w:pPr>
+      <w:r>
+        <w:rPr>
+          <w:b/>
+        </w:rPr>
+        <w:t>Chuẩn bị Demo:</w:t>
+      </w:r>
+      <w:r>
+        <w:t xml:space="preserve"> Rà soát kịch bản trình diễn end-to-end trên Dashboard để sẵn sàng báo cáo trực tiếp với Thầy.</w:t>
       </w:r>
     </w:p>
     <w:p>
@@ -2102,13 +2277,13 @@
     <w:p>
       <w:pPr/>
       <w:r>
-        <w:t xml:space="preserve">So với thời điểm báo cáo Tháng 9, đề tài đã có bước tiến lớn: từ việc kiểm thử trên các tập mẫu nhỏ sang </w:t>
+        <w:t xml:space="preserve">Trong hai tuần đầu Tháng 10, đề tài đã đạt được bước chuyển đổi quan trọng: chuyển toàn bộ thực nghiệm sang </w:t>
       </w:r>
       <w:r>
         <w:rPr>
           <w:b/>
         </w:rPr>
-        <w:t>chạy thực nghiệm thành công trên toàn bộ 1,230 test cases của chuẩn mực quốc tế OWASP Benchmark Python</w:t>
+        <w:t>bộ dữ liệu chuẩn quốc tế diện rộng 1,230 test cases</w:t>
       </w:r>
       <w:r>
         <w:t xml:space="preserve">, chứng minh được khả năng </w:t>
@@ -2117,22 +2292,22 @@
         <w:rPr>
           <w:b/>
         </w:rPr>
-        <w:t>triệt tiêu 65% - 89% False Positive</w:t>
+        <w:t>giảm 65% - 89% False Positive</w:t>
       </w:r>
       <w:r>
-        <w:t xml:space="preserve"> của công nghệ DFG kết hợp TaintBridge.</w:t>
+        <w:t xml:space="preserve"> của phương pháp lai ghép AST/DFG.</w:t>
       </w:r>
     </w:p>
     <w:p>
       <w:pPr/>
       <w:r>
-        <w:t>Nhóm vẫn kiên định với định hướng học thuật trung thực: không tinh chỉnh cục bộ theo benchmark mà tập trung giải quyết bài toán cốt lõi của doanh nghiệp là phân tích khả năng kích hoạt (Reachability) và mô hình hóa cơ chế phòng vệ của framework.</w:t>
+        <w:t>Nhóm kiên định bám sát các chuẩn mực kỹ thuật công nghiệp đã được kiểm chứng (CodeQL, Semgrep Pro, VulAgent) để đảm bảo công cụ có giá trị ứng dụng thực tế trong doanh nghiệp, thay vì tinh chỉnh cục bộ theo bài kiểm thử.</w:t>
       </w:r>
     </w:p>
     <w:p>
       <w:pPr/>
       <w:r>
-        <w:t>Nhóm kính mong nhận được thêm những ý kiến đóng góp và định hướng của Thầy để tiếp tục hoàn thiện đề tài trong các tuần tiếp theo.</w:t>
+        <w:t>Nhóm kính mong nhận được thêm những ý kiến đóng góp và chỉ dẫn của Thầy để tiếp tục hoàn thiện đề tài trong giai đoạn tới.</w:t>
       </w:r>
     </w:p>
     <w:sectPr>

</xml_diff>

<commit_message>
docs(thesis): finalize weekly progress report for Oct 2026 with academic rigor
</commit_message>
<xml_diff>
--- a/docs/thesis/90-bao-cao-tien-do-t10-gui-thay-2026-10-11.docx
+++ b/docs/thesis/90-bao-cao-tien-do-t10-gui-thay-2026-10-11.docx
@@ -67,7 +67,7 @@
         <w:t>Ngày báo cáo:</w:t>
       </w:r>
       <w:r>
-        <w:t xml:space="preserve"> 11/10/2026 (Báo cáo định kỳ tuần 1-2 Tháng 10)</w:t>
+        <w:t xml:space="preserve"> 11/10/2026</w:t>
       </w:r>
     </w:p>
     <w:p>
@@ -81,13 +81,30 @@
         <w:pStyle w:val="Heading1"/>
       </w:pPr>
       <w:r>
-        <w:t>1. Mục Đích Bản Cập Nhật</w:t>
+        <w:t>1. Khảo Cứu Các Giải Pháp Quốc Tế &amp; Định Vị Kiến Trúc Của Đề Tài</w:t>
       </w:r>
     </w:p>
     <w:p>
       <w:pPr/>
       <w:r>
-        <w:t>Bản báo cáo này tiếp nối Đề cương cập nhật Tháng 9, nhằm báo cáo với Thầy các tiến triển kỹ thuật và kết quả đo đạc thực nghiệm mới nhất của nhóm trong hai tuần đầu Tháng 10/2026. Trọng tâm của giai đoạn này gồm ba nội dung chính:</w:t>
+        <w:t xml:space="preserve">Để giải quyết bài toán cốt lõi của đề tài là </w:t>
+      </w:r>
+      <w:r>
+        <w:rPr>
+          <w:b/>
+        </w:rPr>
+        <w:t>tối ưu hóa độ chính xác và giảm thiểu tỷ lệ cảnh báo giả (False Positive - FP)</w:t>
+      </w:r>
+      <w:r>
+        <w:t xml:space="preserve"> trong phân tích tĩnh mã nguồn, nhóm đã tiến hành khảo cứu các giải pháp công nghiệp và học thuật tiêu biểu trên thế giới:</w:t>
+      </w:r>
+    </w:p>
+    <w:p>
+      <w:pPr>
+        <w:pStyle w:val="Heading2"/>
+      </w:pPr>
+      <w:r>
+        <w:t>1.1. Khảo cứu các giải pháp phân tích tĩnh công nghiệp</w:t>
       </w:r>
     </w:p>
     <w:p>
@@ -95,7 +112,97 @@
         <w:pStyle w:val="ListNumber"/>
       </w:pPr>
       <w:r>
-        <w:t>Chuyển từ các tập kiểm thử thu nhỏ sang đo đạc thực nghiệm diện rộng trên toàn bộ 1,230 ca kiểm thử của bộ chuẩn mực quốc tế OWASP Benchmark for Python v0.1.</w:t>
+        <w:rPr>
+          <w:b/>
+        </w:rPr>
+        <w:t>GitHub CodeQL:</w:t>
+      </w:r>
+    </w:p>
+    <w:p>
+      <w:pPr>
+        <w:pStyle w:val="ListBullet"/>
+      </w:pPr>
+      <w:r>
+        <w:t>CodeQL sử dụng mô hình dữ liệu hóa mã nguồn (Code-as-Data) và cơ chế phân tích luồng vấy bẩn toàn cục (</w:t>
+      </w:r>
+      <w:r>
+        <w:rPr>
+          <w:rFonts w:ascii="Consolas" w:hAnsi="Consolas"/>
+        </w:rPr>
+        <w:t>DataFlow::Global</w:t>
+      </w:r>
+      <w:r>
+        <w:t xml:space="preserve">, </w:t>
+      </w:r>
+      <w:r>
+        <w:rPr>
+          <w:rFonts w:ascii="Consolas" w:hAnsi="Consolas"/>
+        </w:rPr>
+        <w:t>TaintTracking::Global</w:t>
+      </w:r>
+      <w:r>
+        <w:t>).</w:t>
+      </w:r>
+    </w:p>
+    <w:p>
+      <w:pPr>
+        <w:pStyle w:val="ListBullet"/>
+      </w:pPr>
+      <w:r>
+        <w:t xml:space="preserve">Điểm kỹ thuật quan trọng của CodeQL là việc chuẩn hóa điểm cắt vấy bẩn thành vị ngữ </w:t>
+      </w:r>
+      <w:r>
+        <w:rPr>
+          <w:b/>
+        </w:rPr>
+        <w:t>`isBarrier(DataFlow::Node node)`</w:t>
+      </w:r>
+      <w:r>
+        <w:t xml:space="preserve">. Vị ngữ này bao gồm cả hàm làm sạch (Sanitizer), cơ chế ép kiểu an toàn (Type Barrier như </w:t>
+      </w:r>
+      <w:r>
+        <w:rPr>
+          <w:rFonts w:ascii="Consolas" w:hAnsi="Consolas"/>
+        </w:rPr>
+        <w:t>int()</w:t>
+      </w:r>
+      <w:r>
+        <w:t xml:space="preserve">, </w:t>
+      </w:r>
+      <w:r>
+        <w:rPr>
+          <w:rFonts w:ascii="Consolas" w:hAnsi="Consolas"/>
+        </w:rPr>
+        <w:t>float()</w:t>
+      </w:r>
+      <w:r>
+        <w:t>), và các điều kiện rẽ nhánh bảo vệ (Guard Condition).</w:t>
+      </w:r>
+    </w:p>
+    <w:p>
+      <w:pPr>
+        <w:pStyle w:val="ListBullet"/>
+      </w:pPr>
+      <w:r>
+        <w:t>Với các lỗ hổng cấu hình như XXE (CWE-611), truy vấn chuẩn của CodeQL (</w:t>
+      </w:r>
+      <w:r>
+        <w:rPr>
+          <w:rFonts w:ascii="Consolas" w:hAnsi="Consolas"/>
+        </w:rPr>
+        <w:t>py/xxe</w:t>
+      </w:r>
+      <w:r>
+        <w:t>) không gắn cờ toàn bộ lệnh nhập thư viện XML, mà kiểm tra xem parser có bị kích hoạt cờ phân giải thực thể ngoài (</w:t>
+      </w:r>
+      <w:r>
+        <w:rPr>
+          <w:rFonts w:ascii="Consolas" w:hAnsi="Consolas"/>
+        </w:rPr>
+        <w:t>feature_external_ges = True</w:t>
+      </w:r>
+      <w:r>
+        <w:t>) hay không.</w:t>
       </w:r>
     </w:p>
     <w:p>
@@ -103,7 +210,35 @@
         <w:pStyle w:val="ListNumber"/>
       </w:pPr>
       <w:r>
-        <w:t>Hoàn thiện nghiên cứu cắt lớp (Ablation Study 4 tầng) để chứng minh định lượng tính đóng góp của từng thành phần: Cú pháp luật (Rule-only), Đồ thị luồng dữ liệu (DFG), Tóm tắt liên hàm (Inter-procedural Summary) và Tác tử phản biện (Multi-Agent Triage).</w:t>
+        <w:rPr>
+          <w:b/>
+        </w:rPr>
+        <w:t>Meta Pysa &amp; Zoncolan (Taint Analysis at Scale):</w:t>
+      </w:r>
+    </w:p>
+    <w:p>
+      <w:pPr>
+        <w:pStyle w:val="ListBullet"/>
+      </w:pPr>
+      <w:r>
+        <w:t xml:space="preserve">Meta giải quyết bài toán phân tích hàng trăm triệu dòng code bằng nguyên lý </w:t>
+      </w:r>
+      <w:r>
+        <w:rPr>
+          <w:b/>
+        </w:rPr>
+        <w:t>Models-as-Data</w:t>
+      </w:r>
+      <w:r>
+        <w:t>: tách rời hoàn toàn lõi phân tích (core engine) khỏi các tệp đặc tả luồng dữ liệu (source, sink, sanitizer rules).</w:t>
+      </w:r>
+    </w:p>
+    <w:p>
+      <w:pPr>
+        <w:pStyle w:val="ListBullet"/>
+      </w:pPr>
+      <w:r>
+        <w:t>Các framework web (Django, Flask, Thrift) được mô hình hóa thành tệp đặc tả riêng biệt, giúp engine tái sử dụng ổn định mà không cần chỉnh sửa logic mã nguồn của bộ phân tích.</w:t>
       </w:r>
     </w:p>
     <w:p>
@@ -111,7 +246,119 @@
         <w:pStyle w:val="ListNumber"/>
       </w:pPr>
       <w:r>
-        <w:t>Chuẩn hóa kiến trúc hệ thống theo các đặc tả kỹ thuật chuẩn mực từ các nền tảng SAST hàng đầu (CodeQL, Semgrep Pro, Snyk) và các nghiên cứu mới (VulAgent, VulnDetect AI 2026), thay vì áp dụng các giải pháp chắp vá cục bộ theo bộ benchmark.</w:t>
+        <w:rPr>
+          <w:b/>
+        </w:rPr>
+        <w:t>Semgrep (OSS vs Pro):</w:t>
+      </w:r>
+    </w:p>
+    <w:p>
+      <w:pPr>
+        <w:pStyle w:val="ListBullet"/>
+      </w:pPr>
+      <w:r>
+        <w:t>Semgrep OSS hoạt động dựa trên đối sánh mẫu cú pháp cục bộ trong phạm vi một tệp (intra-file AST pattern match). Cách tiếp cận này có tốc độ nhanh nhưng gặp hạn chế lớn: mù luồng dữ liệu liên hàm/liên file và không phân tích được khả năng kích hoạt (Reachability), dẫn đến tỷ lệ False Positive cao khi quét các framework hiện đại.</w:t>
+      </w:r>
+    </w:p>
+    <w:p>
+      <w:pPr>
+        <w:pStyle w:val="Heading2"/>
+      </w:pPr>
+      <w:r>
+        <w:t>1.2. Khảo cứu các nghiên cứu học thuật mới về Multi-Agent SAST (2025–2026)</w:t>
+      </w:r>
+    </w:p>
+    <w:p>
+      <w:pPr>
+        <w:pStyle w:val="ListBullet"/>
+      </w:pPr>
+      <w:r>
+        <w:rPr>
+          <w:b/>
+        </w:rPr>
+        <w:t>Mô hình kiểm chứng giả thuyết có thể bác bỏ (VulAgent, ACL 2026):</w:t>
+      </w:r>
+      <w:r>
+        <w:t xml:space="preserve"> Nghiên cứu chỉ ra rằng việc đưa toàn bộ mã nguồn vào LLM với các câu lệnh nhắc chung chung ("code có an toàn không?") dẫn đến tình trạng đoán mò và sinh ảo giác. VulAgent đề xuất quy trình hai chiều: tác tử sinh giả thuyết tấn công (Auditor) và tác tử tìm kiếm bằng chứng phòng vệ để bác bỏ giả thuyết (Skeptic).</w:t>
+      </w:r>
+    </w:p>
+    <w:p>
+      <w:pPr>
+        <w:pStyle w:val="ListBullet"/>
+      </w:pPr>
+      <w:r>
+        <w:rPr>
+          <w:b/>
+        </w:rPr>
+        <w:t>Mô hình phối hợp đồ thị tác tử (VulnDetect AI, 2026):</w:t>
+      </w:r>
+      <w:r>
+        <w:t xml:space="preserve"> Kết hợp công cụ phân tích tĩnh truyền thống với luồng tác tử theo kiến trúc đồ thị (LangGraph) để truy xuất tài liệu framework và kiểm tra giá trị trả về trước khi đưa ra phán quyết cuối cùng.</w:t>
+      </w:r>
+    </w:p>
+    <w:p>
+      <w:pPr>
+        <w:pStyle w:val="Heading2"/>
+      </w:pPr>
+      <w:r>
+        <w:t>1.3. Định vị kiến trúc của Aegis-SAST</w:t>
+      </w:r>
+    </w:p>
+    <w:p>
+      <w:pPr/>
+      <w:r>
+        <w:t>Từ các khảo cứu trên, nhóm xác định kiến trúc của Aegis-SAST không tự chế các luật chắp vá cục bộ, mà kế thừa các nguyên lý đã được kiểm chứng:</w:t>
+      </w:r>
+    </w:p>
+    <w:p>
+      <w:pPr>
+        <w:pStyle w:val="ListNumber"/>
+      </w:pPr>
+      <w:r>
+        <w:rPr>
+          <w:b/>
+        </w:rPr>
+        <w:t>Lớp nền tảng phân tích tĩnh (Deterministic Core):</w:t>
+      </w:r>
+      <w:r>
+        <w:t xml:space="preserve"> Kế thừa cơ chế đồ thị luồng điều khiển và luồng dữ liệu (CFG/DFG) dựa trên Tree-sitter, áp dụng đặc tả điểm cắt vấy bẩn (Taint Barrier) theo chuẩn CodeQL và phân tích liên hàm (Inter-procedural Summary).</w:t>
+      </w:r>
+    </w:p>
+    <w:p>
+      <w:pPr>
+        <w:pStyle w:val="ListNumber"/>
+      </w:pPr>
+      <w:r>
+        <w:rPr>
+          <w:b/>
+        </w:rPr>
+        <w:t>Lớp ranh giới tin cậy (Reachability Analysis):</w:t>
+      </w:r>
+      <w:r>
+        <w:t xml:space="preserve"> Xác định đường dẫn từ điểm vào công khai (Public Entrypoints: </w:t>
+      </w:r>
+      <w:r>
+        <w:rPr>
+          <w:rFonts w:ascii="Consolas" w:hAnsi="Consolas"/>
+        </w:rPr>
+        <w:t>@app.route</w:t>
+      </w:r>
+      <w:r>
+        <w:t>, views) xuyên qua Service đến Sink.</w:t>
+      </w:r>
+    </w:p>
+    <w:p>
+      <w:pPr>
+        <w:pStyle w:val="ListNumber"/>
+      </w:pPr>
+      <w:r>
+        <w:rPr>
+          <w:b/>
+        </w:rPr>
+        <w:t>Lớp thẩm định đa tác tử (Multi-Agent Verification):</w:t>
+      </w:r>
+      <w:r>
+        <w:t xml:space="preserve"> Kế thừa mô hình kiểm chứng giả thuyết (Hypothesis-Validation) của VulAgent với ba vai trò có hợp đồng dữ liệu rõ ràng: Auditor (dựng kịch bản khai thác) $\leftrightarrow$ Skeptic (tìm bằng chứng làm sạch/phòng vệ) $\leftrightarrow$ Judge (phán quyết và xuất bằng chứng).</w:t>
       </w:r>
     </w:p>
     <w:p>
@@ -125,499 +372,32 @@
         <w:pStyle w:val="Heading1"/>
       </w:pPr>
       <w:r>
-        <w:t>2. Cập Nhật Tiến Độ Dự Án (5 Blocks Architecture)</w:t>
+        <w:t>2. Các Công Việc Nhóm Đã Hoàn Thành Trong Tuần Qua</w:t>
       </w:r>
     </w:p>
     <w:p>
       <w:pPr/>
       <w:r>
-        <w:t>Dựa trên sơ đồ kiến trúc 5 khối (5 Blocks Architecture) đã báo cáo với Thầy trong Tháng 9, tiến độ hiện tại của đề tài được cập nhật như sau:</w:t>
-      </w:r>
-    </w:p>
-    <w:tbl>
-      <w:tblPr>
-        <w:tblStyle w:val="TableGrid"/>
-        <w:tblW w:type="auto" w:w="0"/>
-        <w:tblLook w:firstColumn="1" w:firstRow="1" w:lastColumn="0" w:lastRow="0" w:noHBand="0" w:noVBand="1" w:val="04A0"/>
-      </w:tblPr>
-      <w:tblGrid>
-        <w:gridCol w:w="1728"/>
-        <w:gridCol w:w="1728"/>
-        <w:gridCol w:w="1728"/>
-        <w:gridCol w:w="1728"/>
-        <w:gridCol w:w="1728"/>
-      </w:tblGrid>
-      <w:tr>
-        <w:tc>
-          <w:tcPr>
-            <w:tcW w:type="dxa" w:w="1728"/>
-          </w:tcPr>
-          <w:p>
-            <w:r/>
-            <w:r>
-              <w:t>Giai Đoạn (Phase)</w:t>
-            </w:r>
-          </w:p>
-        </w:tc>
-        <w:tc>
-          <w:tcPr>
-            <w:tcW w:type="dxa" w:w="1728"/>
-          </w:tcPr>
-          <w:p>
-            <w:r/>
-            <w:r>
-              <w:t>Thành Phần Kỹ Thuật Cốt Lõi</w:t>
-            </w:r>
-          </w:p>
-        </w:tc>
-        <w:tc>
-          <w:tcPr>
-            <w:tcW w:type="dxa" w:w="1728"/>
-          </w:tcPr>
-          <w:p>
-            <w:r/>
-            <w:r>
-              <w:t>Tiến Độ T9</w:t>
-            </w:r>
-          </w:p>
-        </w:tc>
-        <w:tc>
-          <w:tcPr>
-            <w:tcW w:type="dxa" w:w="1728"/>
-          </w:tcPr>
-          <w:p>
-            <w:r/>
-            <w:r>
-              <w:t>Tiến Độ Hiện Tại (T10)</w:t>
-            </w:r>
-          </w:p>
-        </w:tc>
-        <w:tc>
-          <w:tcPr>
-            <w:tcW w:type="dxa" w:w="1728"/>
-          </w:tcPr>
-          <w:p>
-            <w:r/>
-            <w:r>
-              <w:t>Trạng Thái Kỹ Thuật</w:t>
-            </w:r>
-          </w:p>
-        </w:tc>
-      </w:tr>
-      <w:tr>
-        <w:tc>
-          <w:tcPr>
-            <w:tcW w:type="dxa" w:w="1728"/>
-          </w:tcPr>
-          <w:p>
-            <w:r/>
-            <w:r>
-              <w:rPr>
-                <w:b/>
-              </w:rPr>
-              <w:t>Phase 1: Repo Intake &amp; AST Parsing</w:t>
-            </w:r>
-          </w:p>
-        </w:tc>
-        <w:tc>
-          <w:tcPr>
-            <w:tcW w:type="dxa" w:w="1728"/>
-          </w:tcPr>
-          <w:p>
-            <w:r/>
-            <w:r>
-              <w:t>Tree-sitter AST, Symbol Table, Language Intake</w:t>
-            </w:r>
-          </w:p>
-        </w:tc>
-        <w:tc>
-          <w:tcPr>
-            <w:tcW w:type="dxa" w:w="1728"/>
-          </w:tcPr>
-          <w:p>
-            <w:r/>
-            <w:r>
-              <w:t>95%</w:t>
-            </w:r>
-          </w:p>
-        </w:tc>
-        <w:tc>
-          <w:tcPr>
-            <w:tcW w:type="dxa" w:w="1728"/>
-          </w:tcPr>
-          <w:p>
-            <w:r/>
-            <w:r>
-              <w:rPr>
-                <w:b/>
-              </w:rPr>
-              <w:t>95%</w:t>
-            </w:r>
-          </w:p>
-        </w:tc>
-        <w:tc>
-          <w:tcPr>
-            <w:tcW w:type="dxa" w:w="1728"/>
-          </w:tcPr>
-          <w:p>
-            <w:r/>
-            <w:r>
-              <w:t>Ổn định, hỗ trợ đa ngôn ngữ với lane Python chuyên sâu</w:t>
-            </w:r>
-          </w:p>
-        </w:tc>
-      </w:tr>
-      <w:tr>
-        <w:tc>
-          <w:tcPr>
-            <w:tcW w:type="dxa" w:w="1728"/>
-          </w:tcPr>
-          <w:p>
-            <w:r/>
-            <w:r>
-              <w:rPr>
-                <w:b/>
-              </w:rPr>
-              <w:t>Phase 2: SAST Detection Core</w:t>
-            </w:r>
-          </w:p>
-        </w:tc>
-        <w:tc>
-          <w:tcPr>
-            <w:tcW w:type="dxa" w:w="1728"/>
-          </w:tcPr>
-          <w:p>
-            <w:r/>
-            <w:r>
-              <w:t>Taint Engine, CFG/DFG, Sanitizer Filters</w:t>
-            </w:r>
-          </w:p>
-        </w:tc>
-        <w:tc>
-          <w:tcPr>
-            <w:tcW w:type="dxa" w:w="1728"/>
-          </w:tcPr>
-          <w:p>
-            <w:r/>
-            <w:r>
-              <w:t>90%</w:t>
-            </w:r>
-          </w:p>
-        </w:tc>
-        <w:tc>
-          <w:tcPr>
-            <w:tcW w:type="dxa" w:w="1728"/>
-          </w:tcPr>
-          <w:p>
-            <w:r/>
-            <w:r>
-              <w:rPr>
-                <w:b/>
-              </w:rPr>
-              <w:t>92%</w:t>
-            </w:r>
-          </w:p>
-        </w:tc>
-        <w:tc>
-          <w:tcPr>
-            <w:tcW w:type="dxa" w:w="1728"/>
-          </w:tcPr>
-          <w:p>
-            <w:r/>
-            <w:r>
-              <w:t>Tích hợp TaintBridge nối Semgrep OSS và DFG liên hàm</w:t>
-            </w:r>
-          </w:p>
-        </w:tc>
-      </w:tr>
-      <w:tr>
-        <w:tc>
-          <w:tcPr>
-            <w:tcW w:type="dxa" w:w="1728"/>
-          </w:tcPr>
-          <w:p>
-            <w:r/>
-            <w:r>
-              <w:rPr>
-                <w:b/>
-              </w:rPr>
-              <w:t>Phase 3: Finding Normalization</w:t>
-            </w:r>
-          </w:p>
-        </w:tc>
-        <w:tc>
-          <w:tcPr>
-            <w:tcW w:type="dxa" w:w="1728"/>
-          </w:tcPr>
-          <w:p>
-            <w:r/>
-            <w:r>
-              <w:t>Unified Schema, Heuristic Scorer, Evidence Pack</w:t>
-            </w:r>
-          </w:p>
-        </w:tc>
-        <w:tc>
-          <w:tcPr>
-            <w:tcW w:type="dxa" w:w="1728"/>
-          </w:tcPr>
-          <w:p>
-            <w:r/>
-            <w:r>
-              <w:t>90%</w:t>
-            </w:r>
-          </w:p>
-        </w:tc>
-        <w:tc>
-          <w:tcPr>
-            <w:tcW w:type="dxa" w:w="1728"/>
-          </w:tcPr>
-          <w:p>
-            <w:r/>
-            <w:r>
-              <w:rPr>
-                <w:b/>
-              </w:rPr>
-              <w:t>92%</w:t>
-            </w:r>
-          </w:p>
-        </w:tc>
-        <w:tc>
-          <w:tcPr>
-            <w:tcW w:type="dxa" w:w="1728"/>
-          </w:tcPr>
-          <w:p>
-            <w:r/>
-            <w:r>
-              <w:t>Cấu trúc hóa Evidence Bundle 3 bước (Source -&gt; Propagation -&gt; Sink)</w:t>
-            </w:r>
-          </w:p>
-        </w:tc>
-      </w:tr>
-      <w:tr>
-        <w:tc>
-          <w:tcPr>
-            <w:tcW w:type="dxa" w:w="1728"/>
-          </w:tcPr>
-          <w:p>
-            <w:r/>
-            <w:r>
-              <w:rPr>
-                <w:b/>
-              </w:rPr>
-              <w:t>Phase 4: AI Multi-Agent Triage</w:t>
-            </w:r>
-          </w:p>
-        </w:tc>
-        <w:tc>
-          <w:tcPr>
-            <w:tcW w:type="dxa" w:w="1728"/>
-          </w:tcPr>
-          <w:p>
-            <w:r/>
-            <w:r>
-              <w:t>Auditor, Skeptic, Judge, LangGraph Bridge</w:t>
-            </w:r>
-          </w:p>
-        </w:tc>
-        <w:tc>
-          <w:tcPr>
-            <w:tcW w:type="dxa" w:w="1728"/>
-          </w:tcPr>
-          <w:p>
-            <w:r/>
-            <w:r>
-              <w:t>75%</w:t>
-            </w:r>
-          </w:p>
-        </w:tc>
-        <w:tc>
-          <w:tcPr>
-            <w:tcW w:type="dxa" w:w="1728"/>
-          </w:tcPr>
-          <w:p>
-            <w:r/>
-            <w:r>
-              <w:rPr>
-                <w:b/>
-              </w:rPr>
-              <w:t>82%</w:t>
-            </w:r>
-          </w:p>
-        </w:tc>
-        <w:tc>
-          <w:tcPr>
-            <w:tcW w:type="dxa" w:w="1728"/>
-          </w:tcPr>
-          <w:p>
-            <w:r/>
-            <w:r>
-              <w:t>Hoàn thiện luồng phản biện hai chiều, adapter tương thích OpenAI local</w:t>
-            </w:r>
-          </w:p>
-        </w:tc>
-      </w:tr>
-      <w:tr>
-        <w:tc>
-          <w:tcPr>
-            <w:tcW w:type="dxa" w:w="1728"/>
-          </w:tcPr>
-          <w:p>
-            <w:r/>
-            <w:r>
-              <w:rPr>
-                <w:b/>
-              </w:rPr>
-              <w:t>Phase 5: Artifacts, Dashboard &amp; Benchmark</w:t>
-            </w:r>
-          </w:p>
-        </w:tc>
-        <w:tc>
-          <w:tcPr>
-            <w:tcW w:type="dxa" w:w="1728"/>
-          </w:tcPr>
-          <w:p>
-            <w:r/>
-            <w:r>
-              <w:t>Dashboard React/Next.js, SARIF, OWASP Scorer</w:t>
-            </w:r>
-          </w:p>
-        </w:tc>
-        <w:tc>
-          <w:tcPr>
-            <w:tcW w:type="dxa" w:w="1728"/>
-          </w:tcPr>
-          <w:p>
-            <w:r/>
-            <w:r>
-              <w:t>90%</w:t>
-            </w:r>
-          </w:p>
-        </w:tc>
-        <w:tc>
-          <w:tcPr>
-            <w:tcW w:type="dxa" w:w="1728"/>
-          </w:tcPr>
-          <w:p>
-            <w:r/>
-            <w:r>
-              <w:rPr>
-                <w:b/>
-              </w:rPr>
-              <w:t>95%</w:t>
-            </w:r>
-          </w:p>
-        </w:tc>
-        <w:tc>
-          <w:tcPr>
-            <w:tcW w:type="dxa" w:w="1728"/>
-          </w:tcPr>
-          <w:p>
-            <w:r/>
-            <w:r>
-              <w:t>Hoàn thành runner chấm tự động 1,230 cases và REST API điều khiển</w:t>
-            </w:r>
-          </w:p>
-        </w:tc>
-      </w:tr>
-      <w:tr>
-        <w:tc>
-          <w:tcPr>
-            <w:tcW w:type="dxa" w:w="1728"/>
-          </w:tcPr>
-          <w:p>
-            <w:r/>
-            <w:r>
-              <w:rPr>
-                <w:b/>
-              </w:rPr>
-              <w:t>Tổng thể dự án</w:t>
-            </w:r>
-          </w:p>
-        </w:tc>
-        <w:tc>
-          <w:tcPr>
-            <w:tcW w:type="dxa" w:w="1728"/>
-          </w:tcPr>
-          <w:p>
-            <w:r/>
-            <w:r>
-              <w:rPr>
-                <w:b/>
-              </w:rPr>
-              <w:t>Toàn bộ pipeline Aegis-SAST</w:t>
-            </w:r>
-          </w:p>
-        </w:tc>
-        <w:tc>
-          <w:tcPr>
-            <w:tcW w:type="dxa" w:w="1728"/>
-          </w:tcPr>
-          <w:p>
-            <w:r/>
-            <w:r>
-              <w:rPr>
-                <w:b/>
-              </w:rPr>
-              <w:t>88%</w:t>
-            </w:r>
-          </w:p>
-        </w:tc>
-        <w:tc>
-          <w:tcPr>
-            <w:tcW w:type="dxa" w:w="1728"/>
-          </w:tcPr>
-          <w:p>
-            <w:r/>
-            <w:r>
-              <w:rPr>
-                <w:b/>
-              </w:rPr>
-              <w:t>91%</w:t>
-            </w:r>
-          </w:p>
-        </w:tc>
-        <w:tc>
-          <w:tcPr>
-            <w:tcW w:type="dxa" w:w="1728"/>
-          </w:tcPr>
-          <w:p>
-            <w:r/>
-            <w:r>
-              <w:rPr>
-                <w:b/>
-              </w:rPr>
-              <w:t>Đủ điều kiện kiểm thử diện rộng và phục vụ bảo vệ</w:t>
-            </w:r>
-          </w:p>
-        </w:tc>
-      </w:tr>
-    </w:tbl>
-    <w:p>
-      <w:pPr/>
-      <w:r>
-        <w:t>---</w:t>
+        <w:t>Trong tuần vừa qua, nhóm tập trung vào 4 công việc chính:</w:t>
       </w:r>
     </w:p>
     <w:p>
       <w:pPr>
-        <w:pStyle w:val="Heading1"/>
+        <w:pStyle w:val="ListNumber"/>
       </w:pPr>
       <w:r>
-        <w:t>3. Những Công Việc Kỹ Thuật Đã Hoàn Thành Trong Tuần Qua</w:t>
+        <w:rPr>
+          <w:b/>
+        </w:rPr>
+        <w:t>Thực nghiệm diện rộng trên toàn bộ 1,230 test cases OWASP Benchmark Python:</w:t>
       </w:r>
     </w:p>
     <w:p>
       <w:pPr>
-        <w:pStyle w:val="Heading2"/>
+        <w:pStyle w:val="ListBullet"/>
       </w:pPr>
       <w:r>
-        <w:t>3.1. Thực nghiệm diện rộng trên 1,230 test cases OWASP Benchmark Python</w:t>
-      </w:r>
-    </w:p>
-    <w:p>
-      <w:pPr/>
-      <w:r>
-        <w:t>Nhóm đã hoàn thiện runner đo đạc tự động thời gian thực (</w:t>
+        <w:t>Xây dựng runner tự động thời gian thực (</w:t>
       </w:r>
       <w:r>
         <w:rPr>
@@ -626,7 +406,7 @@
         <w:t>scripts/run_owasp_benchmark_fresh.py</w:t>
       </w:r>
       <w:r>
-        <w:t>) quét toàn bộ 1,230 tệp mã nguồn Python độc lập (</w:t>
+        <w:t>) quét và chấm điểm trực tiếp toàn bộ 1,230 tệp mã nguồn độc lập (</w:t>
       </w:r>
       <w:r>
         <w:rPr>
@@ -644,31 +424,7 @@
         <w:t>BenchmarkTest01230.py</w:t>
       </w:r>
       <w:r>
-        <w:t xml:space="preserve">) tại </w:t>
-      </w:r>
-      <w:r>
-        <w:rPr>
-          <w:rFonts w:ascii="Consolas" w:hAnsi="Consolas"/>
-        </w:rPr>
-        <w:t>D:\BenchmarkPython\testcode</w:t>
-      </w:r>
-      <w:r>
-        <w:t>.</w:t>
-      </w:r>
-    </w:p>
-    <w:p>
-      <w:pPr/>
-      <w:r>
-        <w:t>Hệ thống quét với 1,066 rules từ Semgrep Community Registry, sau đó đưa qua bộ cầu nối Tree-sitter DFG (</w:t>
-      </w:r>
-      <w:r>
-        <w:rPr>
-          <w:rFonts w:ascii="Consolas" w:hAnsi="Consolas"/>
-        </w:rPr>
-        <w:t>TaintBridge</w:t>
-      </w:r>
-      <w:r>
-        <w:t xml:space="preserve">) và đối chiếu trực tiếp với ground-truth </w:t>
+        <w:t xml:space="preserve">) đối chiếu với ground-truth chuẩn </w:t>
       </w:r>
       <w:r>
         <w:rPr>
@@ -677,21 +433,34 @@
         <w:t>expectedresults-0.1.csv</w:t>
       </w:r>
       <w:r>
-        <w:t>. Toàn bộ dữ liệu được tính toán động thời gian thực trong 78.38 giây, đảm bảo tính liêm chính học thuật (100% không hardcode).</w:t>
+        <w:t>.</w:t>
       </w:r>
     </w:p>
     <w:p>
       <w:pPr>
-        <w:pStyle w:val="Heading2"/>
+        <w:pStyle w:val="ListBullet"/>
       </w:pPr>
       <w:r>
-        <w:t>3.2. Nghiên cứu cắt lớp (Ablation Study 4 tầng)</w:t>
+        <w:t>Toàn bộ kết quả được tính toán động (100% không hardcode), hoàn thành trong 78.38 giây.</w:t>
       </w:r>
     </w:p>
     <w:p>
-      <w:pPr/>
+      <w:pPr>
+        <w:pStyle w:val="ListNumber"/>
+      </w:pPr>
       <w:r>
-        <w:t xml:space="preserve">Để phục vụ bài báo khoa học và thuyết minh khóa luận, nhóm đã xây dựng runner </w:t>
+        <w:rPr>
+          <w:b/>
+        </w:rPr>
+        <w:t>Thực hiện nghiên cứu cắt lớp (Ablation Study 4 tầng):</w:t>
+      </w:r>
+    </w:p>
+    <w:p>
+      <w:pPr>
+        <w:pStyle w:val="ListBullet"/>
+      </w:pPr>
+      <w:r>
+        <w:t xml:space="preserve">Xây dựng kịch bản kiểm thử độc lập tại </w:t>
       </w:r>
       <w:r>
         <w:rPr>
@@ -700,7 +469,18 @@
         <w:t>scripts/run_ablation_study.py</w:t>
       </w:r>
       <w:r>
-        <w:t xml:space="preserve"> để kiểm chứng độc lập 4 tầng kỹ thuật:</w:t>
+        <w:t xml:space="preserve"> để chứng minh định lượng vai trò của từng thành phần kỹ thuật: Rule-only cú pháp $\rightarrow$ Intra-file DFG $\rightarrow$ Inter-procedural Summary $\rightarrow$ Multi-Agent Triage.</w:t>
+      </w:r>
+    </w:p>
+    <w:p>
+      <w:pPr>
+        <w:pStyle w:val="ListNumber"/>
+      </w:pPr>
+      <w:r>
+        <w:rPr>
+          <w:b/>
+        </w:rPr>
+        <w:t>Hoàn thiện REST API nội bộ và kết nối Dashboard tương tác:</w:t>
       </w:r>
     </w:p>
     <w:p>
@@ -708,75 +488,7 @@
         <w:pStyle w:val="ListBullet"/>
       </w:pPr>
       <w:r>
-        <w:rPr>
-          <w:b/>
-        </w:rPr>
-        <w:t>Tầng 1 (Rule-Only Syntax):</w:t>
-      </w:r>
-      <w:r>
-        <w:t xml:space="preserve"> Chỉ dùng đối sánh mẫu cú pháp bề mặt.</w:t>
-      </w:r>
-    </w:p>
-    <w:p>
-      <w:pPr>
-        <w:pStyle w:val="ListBullet"/>
-      </w:pPr>
-      <w:r>
-        <w:rPr>
-          <w:b/>
-        </w:rPr>
-        <w:t>Tầng 2 (Intra-file DFG Taint):</w:t>
-      </w:r>
-      <w:r>
-        <w:t xml:space="preserve"> Bổ sung đồ thị luồng dữ liệu trong phạm vi file đơn.</w:t>
-      </w:r>
-    </w:p>
-    <w:p>
-      <w:pPr>
-        <w:pStyle w:val="ListBullet"/>
-      </w:pPr>
-      <w:r>
-        <w:rPr>
-          <w:b/>
-        </w:rPr>
-        <w:t>Tầng 3 (Cross-file Inter-procedural Summary):</w:t>
-      </w:r>
-      <w:r>
-        <w:t xml:space="preserve"> Bổ sung bộ tóm tắt hàm liên file để giải quyết điểm mù chuỗi khai thác đa module.</w:t>
-      </w:r>
-    </w:p>
-    <w:p>
-      <w:pPr>
-        <w:pStyle w:val="ListBullet"/>
-      </w:pPr>
-      <w:r>
-        <w:rPr>
-          <w:b/>
-        </w:rPr>
-        <w:t>Tầng 4 (Multi-Agent Skeptic Triage):</w:t>
-      </w:r>
-      <w:r>
-        <w:t xml:space="preserve"> Bổ sung tác tử phản biện để kiểm tra cơ chế làm sạch và điều kiện rẽ nhánh.</w:t>
-      </w:r>
-    </w:p>
-    <w:p>
-      <w:pPr/>
-      <w:r>
-        <w:t>Kết quả định lượng chứng minh độ chính xác cải thiện rõ rệt: từ 33.3% ở Tầng 1 lên 100% ở Tầng 4 trên chuỗi khai thác đa module.</w:t>
-      </w:r>
-    </w:p>
-    <w:p>
-      <w:pPr>
-        <w:pStyle w:val="Heading2"/>
-      </w:pPr>
-      <w:r>
-        <w:t>3.3. Hoàn thiện REST API nội bộ và Dashboard tương tác phục vụ Demo</w:t>
-      </w:r>
-    </w:p>
-    <w:p>
-      <w:pPr/>
-      <w:r>
-        <w:t xml:space="preserve">Nhóm đã triển khai module </w:t>
+        <w:t xml:space="preserve">Triển khai module </w:t>
       </w:r>
       <w:r>
         <w:rPr>
@@ -785,7 +497,7 @@
         <w:t>aegis_sast/api/routes.py</w:t>
       </w:r>
       <w:r>
-        <w:t xml:space="preserve"> cung cấp các API endpoint:</w:t>
+        <w:t xml:space="preserve"> hỗ trợ khởi chạy tiến trình quét nền bất đồng bộ, theo dõi tiến độ theo thời gian thực và trích xuất finding chuẩn hóa.</w:t>
       </w:r>
     </w:p>
     <w:p>
@@ -793,7 +505,18 @@
         <w:pStyle w:val="ListBullet"/>
       </w:pPr>
       <w:r>
-        <w:t>Kích hoạt tiến trình quét nền bất đồng bộ và trả về Task ID.</w:t>
+        <w:t>Nối thành công Dashboard React/Next.js vào backend API để trực quan hóa đường dẫn khai thác (Taint Flow Trace) và bảng bằng chứng phản biện (Evidence Ledger).</w:t>
+      </w:r>
+    </w:p>
+    <w:p>
+      <w:pPr>
+        <w:pStyle w:val="ListNumber"/>
+      </w:pPr>
+      <w:r>
+        <w:rPr>
+          <w:b/>
+        </w:rPr>
+        <w:t>Tự động hóa kiểm thử liên tục (CI/CD):</w:t>
       </w:r>
     </w:p>
     <w:p>
@@ -801,44 +524,7 @@
         <w:pStyle w:val="ListBullet"/>
       </w:pPr>
       <w:r>
-        <w:t>Theo dõi trạng thái tiến trình quét theo thời gian thực (real-time progress tracking).</w:t>
-      </w:r>
-    </w:p>
-    <w:p>
-      <w:pPr>
-        <w:pStyle w:val="ListBullet"/>
-      </w:pPr>
-      <w:r>
-        <w:t>Cung cấp danh sách finding chuẩn hóa phục vụ giao diện người dùng.</w:t>
-      </w:r>
-    </w:p>
-    <w:p>
-      <w:pPr/>
-      <w:r>
-        <w:t>Dashboard (</w:t>
-      </w:r>
-      <w:r>
-        <w:rPr>
-          <w:rFonts w:ascii="Consolas" w:hAnsi="Consolas"/>
-        </w:rPr>
-        <w:t>apps/findings-dashboard</w:t>
-      </w:r>
-      <w:r>
-        <w:t>) hiện đã kết nối trực tiếp với backend API, cho phép trực quan hóa đường dẫn vấy bẩn (Taint Flow Trace), hiển thị bảng bằng chứng phản biện (Evidence Ledger của Auditor/Skeptic/Judge) và cung cấp gợi ý bản vá bảo mật (Remediation Patch Diff).</w:t>
-      </w:r>
-    </w:p>
-    <w:p>
-      <w:pPr>
-        <w:pStyle w:val="Heading2"/>
-      </w:pPr>
-      <w:r>
-        <w:t>3.4. Tự động hóa CI/CD với GitHub Actions</w:t>
-      </w:r>
-    </w:p>
-    <w:p>
-      <w:pPr/>
-      <w:r>
-        <w:t xml:space="preserve">Nhóm đã thiết lập workflow </w:t>
+        <w:t xml:space="preserve">Thiết lập workflow </w:t>
       </w:r>
       <w:r>
         <w:rPr>
@@ -847,7 +533,7 @@
         <w:t>.github/workflows/aegis-scan.yml</w:t>
       </w:r>
       <w:r>
-        <w:t xml:space="preserve"> trên GitHub. Mỗi lượt cập nhật mã nguồn đều tự động kích hoạt bộ kiểm thử gồm 278 unit tests nhằm ngăn ngừa lỗi hồi quy (regression) trong quá trình phát triển.</w:t>
+        <w:t xml:space="preserve"> trên GitHub để tự động chạy kiểm thử bộ 278 unit tests của hệ thống sau mỗi lần cập nhật mã nguồn.</w:t>
       </w:r>
     </w:p>
     <w:p>
@@ -861,7 +547,7 @@
         <w:pStyle w:val="Heading1"/>
       </w:pPr>
       <w:r>
-        <w:t>4. Báo Cáo Số Liệu Thực Nghiệm Mới Nhất</w:t>
+        <w:t>3. Kết Quả Đo Đạc Thực Nghiệm Định Lượng</w:t>
       </w:r>
     </w:p>
     <w:p>
@@ -869,13 +555,13 @@
         <w:pStyle w:val="Heading2"/>
       </w:pPr>
       <w:r>
-        <w:t>4.1. Bảng số liệu toàn cục trên 1,230 test cases OWASP Benchmark Python</w:t>
+        <w:t>3.1. Kết quả trên toàn bộ 1,230 test cases OWASP Benchmark Python</w:t>
       </w:r>
     </w:p>
     <w:p>
       <w:pPr/>
       <w:r>
-        <w:t>Kết quả đối chiếu trên 677 test cases nằm trong phạm vi tập luật:</w:t>
+        <w:t>Đánh giá đối chiếu trên 677 test cases thuộc phạm vi các họ lỗ hổng được hỗ trợ:</w:t>
       </w:r>
     </w:p>
     <w:tbl>
@@ -1226,26 +912,26 @@
         <w:rPr>
           <w:b/>
         </w:rPr>
-        <w:t>Phân tích kỹ thuật từ kết quả:</w:t>
+        <w:t>Nhận xét kỹ thuật:</w:t>
       </w:r>
     </w:p>
     <w:p>
       <w:pPr>
-        <w:pStyle w:val="ListNumber"/>
+        <w:pStyle w:val="ListBullet"/>
       </w:pPr>
       <w:r>
         <w:rPr>
           <w:b/>
         </w:rPr>
-        <w:t>Triệt tiêu 65.00% False Positive:</w:t>
+        <w:t>Khử 65.00% False Positive:</w:t>
       </w:r>
       <w:r>
-        <w:t xml:space="preserve"> Aegis-SAST loại bỏ thành công 416 cảnh báo giả mà Semgrep nguyên bản báo nhầm (từ 640 FP xuống còn 224 FP).</w:t>
+        <w:t xml:space="preserve"> Aegis-SAST triệt tiêu được 416 cảnh báo giả mà Semgrep nguyên bản báo nhầm (từ 640 FP xuống 224 FP).</w:t>
       </w:r>
     </w:p>
     <w:p>
       <w:pPr>
-        <w:pStyle w:val="ListNumber"/>
+        <w:pStyle w:val="ListBullet"/>
       </w:pPr>
       <w:r>
         <w:rPr>
@@ -1254,12 +940,12 @@
         <w:t>Precision tăng gần gấp đôi:</w:t>
       </w:r>
       <w:r>
-        <w:t xml:space="preserve"> Tăng từ 16.88% lên 33.13% (tăng tương đối +96.27%).</w:t>
+        <w:t xml:space="preserve"> Từ 16.88% lên 33.13% (tăng tương đối +96.27%).</w:t>
       </w:r>
     </w:p>
     <w:p>
       <w:pPr>
-        <w:pStyle w:val="ListNumber"/>
+        <w:pStyle w:val="ListBullet"/>
       </w:pPr>
       <w:r>
         <w:rPr>
@@ -1268,7 +954,7 @@
         <w:t>F1-Score cải thiện 50%:</w:t>
       </w:r>
       <w:r>
-        <w:t xml:space="preserve"> Tăng từ 0.2574 lên 0.3861.</w:t>
+        <w:t xml:space="preserve"> Từ 0.2574 lên 0.3861.</w:t>
       </w:r>
     </w:p>
     <w:p>
@@ -1276,13 +962,13 @@
         <w:pStyle w:val="Heading2"/>
       </w:pPr>
       <w:r>
-        <w:t>4.2. Bảng số liệu trên 4 họ lỗ hổng trọng tâm (Core 4 Families)</w:t>
+        <w:t>3.2. Kết quả bóc tách trên 4 họ lỗ hổng trọng tâm (Core 4 Families)</w:t>
       </w:r>
     </w:p>
     <w:p>
       <w:pPr/>
       <w:r>
-        <w:t>Khi đánh giá riêng trên 4 họ lỗ hổng mục tiêu mà nhóm tập trung thiết kế mô hình đồ thị DFG (Command Injection CWE-78, Path Traversal CWE-22, Insecure Deserialization CWE-502, SQL Injection CWE-89):</w:t>
+        <w:t>Khi đánh giá trên 4 họ lỗ hổng mà nhóm đã thiết kế mô hình DFG và Sanitizer chuyên sâu (CWE-78 Command Injection, CWE-22 Path Traversal, CWE-502 Deserialization, CWE-89 SQL Injection):</w:t>
       </w:r>
     </w:p>
     <w:tbl>
@@ -1610,16 +1296,16 @@
         <w:pStyle w:val="ListBullet"/>
       </w:pPr>
       <w:r>
-        <w:t xml:space="preserve">Trên 4 họ mục tiêu, Aegis-SAST </w:t>
+        <w:t xml:space="preserve">Trên 4 họ trọng tâm, Aegis-SAST </w:t>
       </w:r>
       <w:r>
         <w:rPr>
           <w:b/>
         </w:rPr>
-        <w:t>triệt tiêu 89.66% False Positive</w:t>
+        <w:t>triệt tiêu tới 89.66% False Positive</w:t>
       </w:r>
       <w:r>
-        <w:t xml:space="preserve"> (từ 348 FP xuống còn 36 FP).</w:t>
+        <w:t xml:space="preserve"> (từ 348 FP xuống 36 FP).</w:t>
       </w:r>
     </w:p>
     <w:p>
@@ -1627,7 +1313,25 @@
         <w:pStyle w:val="ListBullet"/>
       </w:pPr>
       <w:r>
-        <w:t>Precision tăng gần 4 lần (từ 16.75% lên 62.11%), F1 tăng hơn gấp đôi (từ 26.97% lên 60.20%).</w:t>
+        <w:t xml:space="preserve">Precision đạt </w:t>
+      </w:r>
+      <w:r>
+        <w:rPr>
+          <w:b/>
+        </w:rPr>
+        <w:t>62.11%</w:t>
+      </w:r>
+      <w:r>
+        <w:t xml:space="preserve"> (gấp gần 4 lần Semgrep 16.75%), F1 đạt </w:t>
+      </w:r>
+      <w:r>
+        <w:rPr>
+          <w:b/>
+        </w:rPr>
+        <w:t>60.20%</w:t>
+      </w:r>
+      <w:r>
+        <w:t xml:space="preserve"> (so với 26.97% của Semgrep).</w:t>
       </w:r>
     </w:p>
     <w:p>
@@ -1644,7 +1348,7 @@
         <w:t>Path Traversal (CWE-22)</w:t>
       </w:r>
       <w:r>
-        <w:t xml:space="preserve">: Giảm 93% False Positive (từ 329 xuống 23 FP) nhờ mô hình nhận diện hàm chuẩn hóa </w:t>
+        <w:t xml:space="preserve">: Giảm 93% False Positive (từ 329 xuống 23 FP) nhờ mô hình nhận diện hàm chuẩn hóa đường dẫn </w:t>
       </w:r>
       <w:r>
         <w:rPr>
@@ -1679,7 +1383,7 @@
         <w:t>SQL Injection (CWE-89)</w:t>
       </w:r>
       <w:r>
-        <w:t>: Đạt Precision 100% (FP = 0).</w:t>
+        <w:t>: Đạt Precision 100% tuyệt đối (FP = 0).</w:t>
       </w:r>
     </w:p>
     <w:p>
@@ -1693,21 +1397,13 @@
         <w:pStyle w:val="Heading1"/>
       </w:pPr>
       <w:r>
-        <w:t>5. Tham Chiếu Kiến Trúc Chuẩn Doanh Nghiệp (Không Tối Ưu Cục Bộ Theo Benchmark)</w:t>
-      </w:r>
-    </w:p>
-    <w:p>
-      <w:pPr>
-        <w:pStyle w:val="Heading2"/>
-      </w:pPr>
-      <w:r>
-        <w:t>5.1. Phân tích nguyên nhân điểm tổng thể bị giới hạn</w:t>
+        <w:t>4. Những Khó Khăn &amp; Hạn Chế Kỹ Thuật Đang Gặp Phải</w:t>
       </w:r>
     </w:p>
     <w:p>
       <w:pPr/>
       <w:r>
-        <w:t>Khi đánh giá trên toàn bộ 10 họ lỗi, điểm F1 dừng ở mức 38.61% do hơn 70% số lượng False Positive còn lại tập trung ở hai nhóm:</w:t>
+        <w:t>Nhóm xin báo cáo trung thực với Thầy 4 khó khăn kỹ thuật cốt lõi hiện nay:</w:t>
       </w:r>
     </w:p>
     <w:p>
@@ -1718,10 +1414,15 @@
         <w:rPr>
           <w:b/>
         </w:rPr>
-        <w:t>XSS (CWE-79) với 115 FP:</w:t>
+        <w:t>Hiện tượng bị kéo tụt điểm khi mở rộng ra 10 họ lỗ hổng:</w:t>
       </w:r>
+    </w:p>
+    <w:p>
+      <w:pPr>
+        <w:pStyle w:val="ListBullet"/>
+      </w:pPr>
       <w:r>
-        <w:t xml:space="preserve"> Các ca kiểm thử đều sử dụng hàm </w:t>
+        <w:t xml:space="preserve">Trong 224 FP còn lại của hệ thống, riêng họ XSS chiếm 115 FP. Nguyên nhân do toàn bộ test case của benchmark đều dùng hàm </w:t>
       </w:r>
       <w:r>
         <w:rPr>
@@ -1730,7 +1431,7 @@
         <w:t>escape_for_html(...)</w:t>
       </w:r>
       <w:r>
-        <w:t xml:space="preserve"> trong cấu trúc chuỗi multiline </w:t>
+        <w:t xml:space="preserve"> trong cấu trúc chuỗi trả về đa dòng (</w:t>
       </w:r>
       <w:r>
         <w:rPr>
@@ -1739,7 +1440,24 @@
         <w:t>RESPONSE += ...</w:t>
       </w:r>
       <w:r>
-        <w:t>. Rule Semgrep gắn cờ toàn bộ lệnh trả về, trong khi bộ trích xuất sanitizer cũ chỉ đọc dòng đầu tiên nên bỏ sót cơ chế làm sạch này.</w:t>
+        <w:t>). Bộ trích xuất sanitizer cũ của nhóm chỉ đọc dòng đầu nên bỏ sót hàm escape này.</w:t>
+      </w:r>
+    </w:p>
+    <w:p>
+      <w:pPr>
+        <w:pStyle w:val="ListBullet"/>
+      </w:pPr>
+      <w:r>
+        <w:t xml:space="preserve">Đối với họ XXE, Semgrep bắt bừa mọi dòng </w:t>
+      </w:r>
+      <w:r>
+        <w:rPr>
+          <w:rFonts w:ascii="Consolas" w:hAnsi="Consolas"/>
+        </w:rPr>
+        <w:t>import xml.dom.minidom</w:t>
+      </w:r>
+      <w:r>
+        <w:t xml:space="preserve"> (77 FP). Bộ lọc cũ thấy dòng import không có luồng dữ liệu nên dập tắt toàn bộ, làm mất luôn cả 8 ca lỗ hổng thật (Recall XXE về 0).</w:t>
       </w:r>
     </w:p>
     <w:p>
@@ -1750,74 +1468,7 @@
         <w:rPr>
           <w:b/>
         </w:rPr>
-        <w:t>XXE (CWE-611) bị mất Recall:</w:t>
-      </w:r>
-      <w:r>
-        <w:t xml:space="preserve"> Semgrep bắt mọi lệnh </w:t>
-      </w:r>
-      <w:r>
-        <w:rPr>
-          <w:rFonts w:ascii="Consolas" w:hAnsi="Consolas"/>
-        </w:rPr>
-        <w:t>import xml.dom.minidom</w:t>
-      </w:r>
-      <w:r>
-        <w:t xml:space="preserve"> (sinh ra 77 FP). Bộ lọc cũ của Aegis thấy dòng import không có luồng dữ liệu vấy bẩn nên dập tắt toàn bộ, làm mất 8 ca lỗi thật.</w:t>
-      </w:r>
-    </w:p>
-    <w:p>
-      <w:pPr>
-        <w:pStyle w:val="Heading2"/>
-      </w:pPr>
-      <w:r>
-        <w:t>5.2. Nguyên tắc nghiên cứu: Tránh bẫy Overfitting, tuân thủ chuẩn công nghiệp</w:t>
-      </w:r>
-    </w:p>
-    <w:p>
-      <w:pPr/>
-      <w:r>
-        <w:t xml:space="preserve">Nhóm kiên định quan điểm: </w:t>
-      </w:r>
-      <w:r>
-        <w:rPr>
-          <w:b/>
-        </w:rPr>
-        <w:t>Tuyệt đối không tự chế các luật chắp vá (ad-hoc regex) để khớp tên biến của benchmark</w:t>
-      </w:r>
-      <w:r>
-        <w:t>. Để công cụ có giá trị ứng dụng thực tế trong môi trường doanh nghiệp, nhóm tham chiếu trực tiếp các đặc tả kỹ thuật từ các nền tảng phân tích tĩnh và nghiên cứu quốc tế:</w:t>
-      </w:r>
-    </w:p>
-    <w:p>
-      <w:pPr>
-        <w:pStyle w:val="Heading3"/>
-      </w:pPr>
-      <w:r>
-        <w:t>A. Đặc tả Taint Barrier chuẩn CodeQL (GitHub CodeQL Specification)</w:t>
-      </w:r>
-    </w:p>
-    <w:p>
-      <w:pPr/>
-      <w:r>
-        <w:t>Trong CodeQL Python Taint Tracking (</w:t>
-      </w:r>
-      <w:r>
-        <w:rPr>
-          <w:rFonts w:ascii="Consolas" w:hAnsi="Consolas"/>
-        </w:rPr>
-        <w:t>semmle.python.dataflow.new.TaintTracking</w:t>
-      </w:r>
-      <w:r>
-        <w:t xml:space="preserve">), khái niệm Sanitizer và Guard được chuẩn hóa thông qua vị ngữ </w:t>
-      </w:r>
-      <w:r>
-        <w:rPr>
-          <w:rFonts w:ascii="Consolas" w:hAnsi="Consolas"/>
-        </w:rPr>
-        <w:t>isBarrier(DataFlow::Node node)</w:t>
-      </w:r>
-      <w:r>
-        <w:t>. Aegis-SAST sẽ áp dụng cơ chế Barrier chuẩn này:</w:t>
+        <w:t>Rủi ro tối ưu hóa cục bộ theo bài kiểm thử (Overfitting Benchmark):</w:t>
       </w:r>
     </w:p>
     <w:p>
@@ -1825,13 +1476,102 @@
         <w:pStyle w:val="ListBullet"/>
       </w:pPr>
       <w:r>
+        <w:t>Trong benchmark có nhiều mẫu gán bẫy hằng số (như đọc key cố định từ Dictionary hay ConfigParser). Nếu nhóm chỉ viết code để bắt đúng các tên biến này thì điểm số sẽ cao nhưng vô dụng trên mã nguồn thực tế của doanh nghiệp. Nhóm cần giải quyết ở mức trừu tượng hóa phân tích trường (Field-sensitive analysis).</w:t>
+      </w:r>
+    </w:p>
+    <w:p>
+      <w:pPr>
+        <w:pStyle w:val="ListNumber"/>
+      </w:pPr>
+      <w:r>
         <w:rPr>
           <w:b/>
         </w:rPr>
-        <w:t>Sanitizer Barrier:</w:t>
+        <w:t>Bài toán đóng gói ngữ cảnh cho tác tử LLM:</w:t>
+      </w:r>
+    </w:p>
+    <w:p>
+      <w:pPr>
+        <w:pStyle w:val="ListBullet"/>
+      </w:pPr>
+      <w:r>
+        <w:t>Không thể đưa toàn bộ cây AST hay mã nguồn cả file vào prompt vì chi phí token lớn và độ trễ cao. Nhóm đang phải giải quyết bài toán trích xuất lát cắt mã nguồn tối thiểu (Slicing Context Window) chỉ chứa Source, Propagation path, Sanitizer và Sink để cung cấp cho tác tử.</w:t>
+      </w:r>
+    </w:p>
+    <w:p>
+      <w:pPr>
+        <w:pStyle w:val="ListNumber"/>
+      </w:pPr>
+      <w:r>
+        <w:rPr>
+          <w:b/>
+        </w:rPr>
+        <w:t>Sự chênh lệch độ sâu phân tích giữa các ngôn ngữ:</w:t>
+      </w:r>
+    </w:p>
+    <w:p>
+      <w:pPr>
+        <w:pStyle w:val="ListBullet"/>
+      </w:pPr>
+      <w:r>
+        <w:t>Lane Python hiện đi sâu nhất với DFG liên hàm và tóm tắt hàm. Trong khi đó, lane Java và JavaScript mới dừng ở mức phân tích cú pháp trong phạm vi file (intra-file), chưa có độ sâu tương đương.</w:t>
+      </w:r>
+    </w:p>
+    <w:p>
+      <w:pPr/>
+      <w:r>
+        <w:t>---</w:t>
+      </w:r>
+    </w:p>
+    <w:p>
+      <w:pPr>
+        <w:pStyle w:val="Heading1"/>
+      </w:pPr>
+      <w:r>
+        <w:t>5. Kế Hoạch Triển Khai Trong Tuần Tiếp Theo</w:t>
+      </w:r>
+    </w:p>
+    <w:p>
+      <w:pPr/>
+      <w:r>
+        <w:t>Dựa trên các khảo cứu quốc tế và kết quả đo đạc thực tế, nhóm dự kiến thực hiện các công việc sau trong tuần tới:</w:t>
+      </w:r>
+    </w:p>
+    <w:p>
+      <w:pPr>
+        <w:pStyle w:val="ListNumber"/>
+      </w:pPr>
+      <w:r>
+        <w:rPr>
+          <w:b/>
+        </w:rPr>
+        <w:t>Chuẩn hóa Taint Barrier cho XSS theo chuẩn OWASP:</w:t>
+      </w:r>
+    </w:p>
+    <w:p>
+      <w:pPr>
+        <w:pStyle w:val="ListBullet"/>
+      </w:pPr>
+      <w:r>
+        <w:t xml:space="preserve">Cập nhật hàm trích xuất Sanitizer trong </w:t>
       </w:r>
       <w:r>
-        <w:t xml:space="preserve"> Bắt các hàm mã hóa ngữ cảnh (</w:t>
+        <w:rPr>
+          <w:rFonts w:ascii="Consolas" w:hAnsi="Consolas"/>
+        </w:rPr>
+        <w:t>TaintBridge</w:t>
+      </w:r>
+      <w:r>
+        <w:t xml:space="preserve"> để phân tích đầy đủ biểu thức gán đa dòng, nhận diện chính xác các hàm mã hóa HTML (</w:t>
+      </w:r>
+      <w:r>
+        <w:rPr>
+          <w:rFonts w:ascii="Consolas" w:hAnsi="Consolas"/>
+        </w:rPr>
+        <w:t>escape_for_html</w:t>
+      </w:r>
+      <w:r>
+        <w:t xml:space="preserve">, </w:t>
       </w:r>
       <w:r>
         <w:rPr>
@@ -1846,7 +1586,7 @@
         <w:rPr>
           <w:rFonts w:ascii="Consolas" w:hAnsi="Consolas"/>
         </w:rPr>
-        <w:t>bleach.clean</w:t>
+        <w:t>markupsafe.escape</w:t>
       </w:r>
       <w:r>
         <w:t xml:space="preserve">, </w:t>
@@ -1855,19 +1595,21 @@
         <w:rPr>
           <w:rFonts w:ascii="Consolas" w:hAnsi="Consolas"/>
         </w:rPr>
-        <w:t>shlex.quote</w:t>
+        <w:t>bleach.clean</w:t>
       </w:r>
       <w:r>
-        <w:t xml:space="preserve">, </w:t>
+        <w:t>), giải quyết triệt để 115 False Positive của họ XSS.</w:t>
       </w:r>
+    </w:p>
+    <w:p>
+      <w:pPr>
+        <w:pStyle w:val="ListNumber"/>
+      </w:pPr>
       <w:r>
         <w:rPr>
-          <w:rFonts w:ascii="Consolas" w:hAnsi="Consolas"/>
+          <w:b/>
         </w:rPr>
-        <w:t>os.path.basename</w:t>
-      </w:r>
-      <w:r>
-        <w:t>).</w:t>
+        <w:t>Triển khai kiểm tra cấu hình XXE theo chuẩn CodeQL `py/xxe`:</w:t>
       </w:r>
     </w:p>
     <w:p>
@@ -1875,115 +1617,7 @@
         <w:pStyle w:val="ListBullet"/>
       </w:pPr>
       <w:r>
-        <w:rPr>
-          <w:b/>
-        </w:rPr>
-        <w:t>Type Barrier:</w:t>
-      </w:r>
-      <w:r>
-        <w:t xml:space="preserve"> Các hàm ép kiểu dữ liệu an toàn (</w:t>
-      </w:r>
-      <w:r>
-        <w:rPr>
-          <w:rFonts w:ascii="Consolas" w:hAnsi="Consolas"/>
-        </w:rPr>
-        <w:t>int()</w:t>
-      </w:r>
-      <w:r>
-        <w:t xml:space="preserve">, </w:t>
-      </w:r>
-      <w:r>
-        <w:rPr>
-          <w:rFonts w:ascii="Consolas" w:hAnsi="Consolas"/>
-        </w:rPr>
-        <w:t>float()</w:t>
-      </w:r>
-      <w:r>
-        <w:t xml:space="preserve">, </w:t>
-      </w:r>
-      <w:r>
-        <w:rPr>
-          <w:rFonts w:ascii="Consolas" w:hAnsi="Consolas"/>
-        </w:rPr>
-        <w:t>UUID()</w:t>
-      </w:r>
-      <w:r>
-        <w:t>, Pydantic Schema Validator) đóng vai trò là điểm cắt vấy bẩn (untaint barrier).</w:t>
-      </w:r>
-    </w:p>
-    <w:p>
-      <w:pPr>
-        <w:pStyle w:val="Heading3"/>
-      </w:pPr>
-      <w:r>
-        <w:t xml:space="preserve">B. Đặc tả kiểm tra cấu hình XXE chuẩn CodeQL </w:t>
-      </w:r>
-      <w:r>
-        <w:rPr>
-          <w:rFonts w:ascii="Consolas" w:hAnsi="Consolas"/>
-        </w:rPr>
-        <w:t>py/xxe</w:t>
-      </w:r>
-      <w:r>
-        <w:t xml:space="preserve"> (CWE-611)</w:t>
-      </w:r>
-    </w:p>
-    <w:p>
-      <w:pPr/>
-      <w:r>
-        <w:t xml:space="preserve">Theo đặc tả của CodeQL </w:t>
-      </w:r>
-      <w:r>
-        <w:rPr>
-          <w:rFonts w:ascii="Consolas" w:hAnsi="Consolas"/>
-        </w:rPr>
-        <w:t>python/ql/src/Security/CWE-611/Xxe.ql</w:t>
-      </w:r>
-      <w:r>
-        <w:t xml:space="preserve"> và OWASP Cheat Sheet:</w:t>
-      </w:r>
-    </w:p>
-    <w:p>
-      <w:pPr>
-        <w:pStyle w:val="ListBullet"/>
-      </w:pPr>
-      <w:r>
-        <w:t xml:space="preserve">Một parser XML chỉ bị coi là có lỗ hổng XXE khi nhận dữ liệu người dùng </w:t>
-      </w:r>
-      <w:r>
-        <w:rPr>
-          <w:b/>
-        </w:rPr>
-        <w:t>VÀ</w:t>
-      </w:r>
-      <w:r>
-        <w:t xml:space="preserve"> cấu hình parser cho phép phân giải thực thể ngoài.</w:t>
-      </w:r>
-    </w:p>
-    <w:p>
-      <w:pPr>
-        <w:pStyle w:val="ListBullet"/>
-      </w:pPr>
-      <w:r>
-        <w:t xml:space="preserve">Với thư viện </w:t>
-      </w:r>
-      <w:r>
-        <w:rPr>
-          <w:rFonts w:ascii="Consolas" w:hAnsi="Consolas"/>
-        </w:rPr>
-        <w:t>xml.sax</w:t>
-      </w:r>
-      <w:r>
-        <w:t xml:space="preserve"> / </w:t>
-      </w:r>
-      <w:r>
-        <w:rPr>
-          <w:rFonts w:ascii="Consolas" w:hAnsi="Consolas"/>
-        </w:rPr>
-        <w:t>minidom</w:t>
-      </w:r>
-      <w:r>
-        <w:t xml:space="preserve">: Cờ </w:t>
+        <w:t xml:space="preserve">Bổ sung logic kiểm tra cờ cấu hình parser </w:t>
       </w:r>
       <w:r>
         <w:rPr>
@@ -1992,16 +1626,7 @@
         <w:t>feature_external_ges</w:t>
       </w:r>
       <w:r>
-        <w:t xml:space="preserve"> hoặc </w:t>
-      </w:r>
-      <w:r>
-        <w:rPr>
-          <w:rFonts w:ascii="Consolas" w:hAnsi="Consolas"/>
-        </w:rPr>
-        <w:t>feature_external_pes</w:t>
-      </w:r>
-      <w:r>
-        <w:t xml:space="preserve"> phải được gán giá trị </w:t>
+        <w:t xml:space="preserve">: nếu không được bật </w:t>
       </w:r>
       <w:r>
         <w:rPr>
@@ -2010,15 +1635,7 @@
         <w:t>True</w:t>
       </w:r>
       <w:r>
-        <w:t>. Nếu cờ này không được kích hoạt, parser an toàn theo mặc định $\rightarrow$ Phải coi là Sanitizer Barrier hợp lệ.</w:t>
-      </w:r>
-    </w:p>
-    <w:p>
-      <w:pPr>
-        <w:pStyle w:val="ListBullet"/>
-      </w:pPr>
-      <w:r>
-        <w:t xml:space="preserve">Thư viện </w:t>
+        <w:t xml:space="preserve"> (hoặc sử dụng </w:t>
       </w:r>
       <w:r>
         <w:rPr>
@@ -2027,21 +1644,18 @@
         <w:t>defusedxml</w:t>
       </w:r>
       <w:r>
-        <w:t xml:space="preserve"> được định nghĩa mặc định là Barrier an toàn cho toàn bộ luồng XML.</w:t>
+        <w:t>), hệ thống xác định parser an toàn theo mặc định và coi đây là Barrier hợp lệ. Mục tiêu khôi phục 100% Recall và triệt tiêu 77 False Positive của họ XXE.</w:t>
       </w:r>
     </w:p>
     <w:p>
       <w:pPr>
-        <w:pStyle w:val="Heading3"/>
+        <w:pStyle w:val="ListNumber"/>
       </w:pPr>
       <w:r>
-        <w:t>C. Phân tích khả năng kích hoạt (Reachability Analysis từ Semgrep Pro / CodeQL)</w:t>
-      </w:r>
-    </w:p>
-    <w:p>
-      <w:pPr/>
-      <w:r>
-        <w:t>Trong dự án doanh nghiệp, phần lớn code là tiện ích nội bộ hoặc batch job. Aegis-SAST xây dựng ranh giới tin cậy (Trust Boundary):</w:t>
+        <w:rPr>
+          <w:b/>
+        </w:rPr>
+        <w:t>Phân tích luồng dữ liệu theo trường (Field-Sensitive DFG):</w:t>
       </w:r>
     </w:p>
     <w:p>
@@ -2049,34 +1663,36 @@
         <w:pStyle w:val="ListBullet"/>
       </w:pPr>
       <w:r>
-        <w:t>Xác định điểm vào công khai (</w:t>
-      </w:r>
-      <w:r>
-        <w:rPr>
-          <w:b/>
-        </w:rPr>
-        <w:t>Public Entrypoints</w:t>
-      </w:r>
-      <w:r>
-        <w:t>): Các route controller của Flask (</w:t>
+        <w:t>Theo dõi độc lập từng trường dữ liệu cho Dictionary (</w:t>
       </w:r>
       <w:r>
         <w:rPr>
           <w:rFonts w:ascii="Consolas" w:hAnsi="Consolas"/>
         </w:rPr>
-        <w:t>@app.route</w:t>
+        <w:t>map['key']</w:t>
       </w:r>
       <w:r>
-        <w:t>), FastAPI (</w:t>
+        <w:t>) và ConfigParser (</w:t>
       </w:r>
       <w:r>
         <w:rPr>
           <w:rFonts w:ascii="Consolas" w:hAnsi="Consolas"/>
         </w:rPr>
-        <w:t>@router</w:t>
+        <w:t>conf.get/set</w:t>
       </w:r>
       <w:r>
-        <w:t>), Django views.</w:t>
+        <w:t>) để phân biệt chính xác giữa giá trị an toàn và giá trị bị vấy bẩn.</w:t>
+      </w:r>
+    </w:p>
+    <w:p>
+      <w:pPr>
+        <w:pStyle w:val="ListNumber"/>
+      </w:pPr>
+      <w:r>
+        <w:rPr>
+          <w:b/>
+        </w:rPr>
+        <w:t>Thử nghiệm tích hợp Local LLM Runtime:</w:t>
       </w:r>
     </w:p>
     <w:p>
@@ -2084,21 +1700,18 @@
         <w:pStyle w:val="ListBullet"/>
       </w:pPr>
       <w:r>
-        <w:t>Chỉ gắn cờ nguy hiểm cao (High Risk) khi tồn tại đường dẫn kích hoạt liên hàm từ Public Entrypoint đến Sink. Các hàm nằm ngoài luồng gọi công khai được hạ mức ưu tiên để tránh Alert Fatigue.</w:t>
+        <w:t>Kết nối lớp Multi-Agent Triage với runtime cục bộ (Ollama / vLLM) chạy mô hình mã nguồn mở để đánh giá thực nghiệm về độ trễ, chi phí và chất lượng phản biện.</w:t>
       </w:r>
     </w:p>
     <w:p>
       <w:pPr>
-        <w:pStyle w:val="Heading3"/>
+        <w:pStyle w:val="ListNumber"/>
       </w:pPr>
       <w:r>
-        <w:t>D. Luồng thẩm định phản biện giả thuyết (Hypothesis-Validation từ VulAgent / VulnDetect AI 2026)</w:t>
-      </w:r>
-    </w:p>
-    <w:p>
-      <w:pPr/>
-      <w:r>
-        <w:t>Thay vì sử dụng prompt chung chung "đoán xem code có lỗi không", hệ thống áp dụng luồng kiểm chứng giả thuyết có thể bác bỏ (Falsifiable Hypothesis Testing):</w:t>
+        <w:rPr>
+          <w:b/>
+        </w:rPr>
+        <w:t>Chuẩn bị báo cáo trực tiếp:</w:t>
       </w:r>
     </w:p>
     <w:p>
@@ -2106,41 +1719,7 @@
         <w:pStyle w:val="ListBullet"/>
       </w:pPr>
       <w:r>
-        <w:rPr>
-          <w:b/>
-        </w:rPr>
-        <w:t>Auditor Agent:</w:t>
-      </w:r>
-      <w:r>
-        <w:t xml:space="preserve"> Thiết lập giả thuyết tấn công cụ thể (Source, Sink, điều kiện kích hoạt payload).</w:t>
-      </w:r>
-    </w:p>
-    <w:p>
-      <w:pPr>
-        <w:pStyle w:val="ListBullet"/>
-      </w:pPr>
-      <w:r>
-        <w:rPr>
-          <w:b/>
-        </w:rPr>
-        <w:t>Skeptic Agent:</w:t>
-      </w:r>
-      <w:r>
-        <w:t xml:space="preserve"> Tìm kiếm bằng chứng phản bác (Kiểm tra Sanitizer Barrier, điều kiện rẽ nhánh bảo vệ, cấu hình an toàn).</w:t>
-      </w:r>
-    </w:p>
-    <w:p>
-      <w:pPr>
-        <w:pStyle w:val="ListBullet"/>
-      </w:pPr>
-      <w:r>
-        <w:rPr>
-          <w:b/>
-        </w:rPr>
-        <w:t>Judge Agent:</w:t>
-      </w:r>
-      <w:r>
-        <w:t xml:space="preserve"> Đóng vai trò trọng tài, chỉ xác nhận lỗ hổng khi Auditor có đường dẫn đầy đủ và Skeptic không tìm thấy bằng chứng phòng vệ hợp lệ.</w:t>
+        <w:t>Hoàn thiện kịch bản demo trực quan trên Web Dashboard để báo cáo tiến độ với Thầy trong buổi làm việc sắp tới.</w:t>
       </w:r>
     </w:p>
     <w:p>
@@ -2154,145 +1733,28 @@
         <w:pStyle w:val="Heading1"/>
       </w:pPr>
       <w:r>
-        <w:t>6. Kế Hoạch Triển Khai Trong Tuần Tiếp Theo</w:t>
+        <w:t>6. Kết Luận</w:t>
       </w:r>
     </w:p>
     <w:p>
       <w:pPr/>
       <w:r>
-        <w:t>Trong tuần tới, nhóm tập trung triển khai các đầu việc kỹ thuật theo đúng đặc tả tham chiếu:</w:t>
-      </w:r>
-    </w:p>
-    <w:p>
-      <w:pPr>
-        <w:pStyle w:val="ListNumber"/>
-      </w:pPr>
-      <w:r>
-        <w:rPr>
-          <w:b/>
-        </w:rPr>
-        <w:t>Chuẩn hóa Taint Barrier cho XSS:</w:t>
-      </w:r>
-      <w:r>
-        <w:t xml:space="preserve"> Nâng cấp bộ trích xuất Sanitizer trong </w:t>
-      </w:r>
-      <w:r>
-        <w:rPr>
-          <w:rFonts w:ascii="Consolas" w:hAnsi="Consolas"/>
-        </w:rPr>
-        <w:t>TaintBridge</w:t>
-      </w:r>
-      <w:r>
-        <w:t xml:space="preserve"> để quét toàn diện biểu thức gán đa dòng, nhận diện chính xác các hàm mã hóa HTML theo chuẩn OWASP.</w:t>
-      </w:r>
-    </w:p>
-    <w:p>
-      <w:pPr>
-        <w:pStyle w:val="ListNumber"/>
-      </w:pPr>
-      <w:r>
-        <w:rPr>
-          <w:b/>
-        </w:rPr>
-        <w:t>Áp dụng kiểm tra cấu hình parser cho XXE:</w:t>
-      </w:r>
-      <w:r>
-        <w:t xml:space="preserve"> Cập nhật detector theo đặc tả CodeQL </w:t>
-      </w:r>
-      <w:r>
-        <w:rPr>
-          <w:rFonts w:ascii="Consolas" w:hAnsi="Consolas"/>
-        </w:rPr>
-        <w:t>py/xxe</w:t>
-      </w:r>
-      <w:r>
-        <w:t xml:space="preserve">, kiểm tra cờ </w:t>
-      </w:r>
-      <w:r>
-        <w:rPr>
-          <w:rFonts w:ascii="Consolas" w:hAnsi="Consolas"/>
-        </w:rPr>
-        <w:t>feature_external_ges</w:t>
-      </w:r>
-      <w:r>
-        <w:t xml:space="preserve"> để khôi phục 100% Recall và triệt tiêu 77 False Positive của họ XXE.</w:t>
-      </w:r>
-    </w:p>
-    <w:p>
-      <w:pPr>
-        <w:pStyle w:val="ListNumber"/>
-      </w:pPr>
-      <w:r>
-        <w:rPr>
-          <w:b/>
-        </w:rPr>
-        <w:t>Mô hình hóa Field-Sensitive DFG:</w:t>
-      </w:r>
-      <w:r>
-        <w:t xml:space="preserve"> Lần vết dữ liệu chi tiết theo từng khóa (key-sensitive) cho Dictionary và đối tượng cấu hình, nhận diện chính xác các giá trị hằng số an toàn.</w:t>
-      </w:r>
-    </w:p>
-    <w:p>
-      <w:pPr>
-        <w:pStyle w:val="ListNumber"/>
-      </w:pPr>
-      <w:r>
-        <w:rPr>
-          <w:b/>
-        </w:rPr>
-        <w:t>Đo đạc thực nghiệm với Local LLM Runtime:</w:t>
-      </w:r>
-      <w:r>
-        <w:t xml:space="preserve"> Chạy thử nghiệm lớp Multi-Agent Triage với mô hình mã nguồn mở cục bộ (Ollama / vLLM) để đánh giá độ trễ và khả năng giảm nhiễu.</w:t>
-      </w:r>
-    </w:p>
-    <w:p>
-      <w:pPr>
-        <w:pStyle w:val="ListNumber"/>
-      </w:pPr>
-      <w:r>
-        <w:rPr>
-          <w:b/>
-        </w:rPr>
-        <w:t>Chuẩn bị Demo:</w:t>
-      </w:r>
-      <w:r>
-        <w:t xml:space="preserve"> Rà soát kịch bản trình diễn end-to-end trên Dashboard để sẵn sàng báo cáo trực tiếp với Thầy.</w:t>
-      </w:r>
-    </w:p>
-    <w:p>
-      <w:pPr/>
-      <w:r>
-        <w:t>---</w:t>
-      </w:r>
-    </w:p>
-    <w:p>
-      <w:pPr>
-        <w:pStyle w:val="Heading1"/>
-      </w:pPr>
-      <w:r>
-        <w:t>7. Kết Luận</w:t>
-      </w:r>
-    </w:p>
-    <w:p>
-      <w:pPr/>
-      <w:r>
-        <w:t xml:space="preserve">Trong hai tuần đầu Tháng 10, đề tài đã đạt được bước chuyển đổi quan trọng: chuyển toàn bộ thực nghiệm sang </w:t>
+        <w:t xml:space="preserve">Trong giai đoạn vừa qua, nhóm đã chuyển thành công toàn bộ thực nghiệm sang </w:t>
       </w:r>
       <w:r>
         <w:rPr>
           <w:b/>
         </w:rPr>
-        <w:t>bộ dữ liệu chuẩn quốc tế diện rộng 1,230 test cases</w:t>
+        <w:t>bộ chuẩn mực quốc tế diện rộng 1,230 test cases</w:t>
       </w:r>
       <w:r>
-        <w:t xml:space="preserve">, chứng minh được khả năng </w:t>
+        <w:t xml:space="preserve">, chứng minh bằng số liệu thực tế khả năng </w:t>
       </w:r>
       <w:r>
         <w:rPr>
           <w:b/>
         </w:rPr>
-        <w:t>giảm 65% - 89% False Positive</w:t>
+        <w:t>triệt tiêu 65% - 89% cảnh báo giả</w:t>
       </w:r>
       <w:r>
         <w:t xml:space="preserve"> của phương pháp lai ghép AST/DFG.</w:t>
@@ -2301,13 +1763,13 @@
     <w:p>
       <w:pPr/>
       <w:r>
-        <w:t>Nhóm kiên định bám sát các chuẩn mực kỹ thuật công nghiệp đã được kiểm chứng (CodeQL, Semgrep Pro, VulAgent) để đảm bảo công cụ có giá trị ứng dụng thực tế trong doanh nghiệp, thay vì tinh chỉnh cục bộ theo bài kiểm thử.</w:t>
+        <w:t>Nhóm kiên định đi theo các đặc tả kỹ thuật chuẩn mực của các hệ thống quốc tế (CodeQL, Semgrep Pro, VulAgent) nhằm đảm bảo công cụ có giá trị học thuật và khả năng ứng dụng thực tế, thay vì áp dụng các giải pháp chắp vá theo bài kiểm thử.</w:t>
       </w:r>
     </w:p>
     <w:p>
       <w:pPr/>
       <w:r>
-        <w:t>Nhóm kính mong nhận được thêm những ý kiến đóng góp và chỉ dẫn của Thầy để tiếp tục hoàn thiện đề tài trong giai đoạn tới.</w:t>
+        <w:t>Nhóm kính mong nhận được thêm các ý kiến nhận xét và định hướng của Thầy để hoàn thiện đề tài trong giai đoạn tiếp theo.</w:t>
       </w:r>
     </w:p>
     <w:sectPr>

</xml_diff>

<commit_message>
docs(thesis): rewrite weekly report in natural academic prose without code snippets
</commit_message>
<xml_diff>
--- a/docs/thesis/90-bao-cao-tien-do-t10-gui-thay-2026-10-11.docx
+++ b/docs/thesis/90-bao-cao-tien-do-t10-gui-thay-2026-10-11.docx
@@ -55,7 +55,7 @@
         <w:t>Kho lưu trữ mã nguồn:</w:t>
       </w:r>
       <w:r>
-        <w:t xml:space="preserve"> https://github.com/PhucQuan/MultiAgent-SAST (chuyển từ repo cũ SAST_tool4pentester)</w:t>
+        <w:t xml:space="preserve"> https://github.com/PhucQuan/MultiAgent-SAST</w:t>
       </w:r>
     </w:p>
     <w:p>
@@ -81,30 +81,13 @@
         <w:pStyle w:val="Heading1"/>
       </w:pPr>
       <w:r>
-        <w:t>1. Khảo Cứu Các Giải Pháp Quốc Tế &amp; Định Vị Kiến Trúc Của Đề Tài</w:t>
+        <w:t>1. Mục Đích Của Bản Báo Cáo</w:t>
       </w:r>
     </w:p>
     <w:p>
       <w:pPr/>
       <w:r>
-        <w:t xml:space="preserve">Để giải quyết bài toán cốt lõi của đề tài là </w:t>
-      </w:r>
-      <w:r>
-        <w:rPr>
-          <w:b/>
-        </w:rPr>
-        <w:t>tối ưu hóa độ chính xác và giảm thiểu tỷ lệ cảnh báo giả (False Positive - FP)</w:t>
-      </w:r>
-      <w:r>
-        <w:t xml:space="preserve"> trong phân tích tĩnh mã nguồn, nhóm đã tiến hành khảo cứu các giải pháp công nghiệp và học thuật tiêu biểu trên thế giới:</w:t>
-      </w:r>
-    </w:p>
-    <w:p>
-      <w:pPr>
-        <w:pStyle w:val="Heading2"/>
-      </w:pPr>
-      <w:r>
-        <w:t>1.1. Khảo cứu các giải pháp phân tích tĩnh công nghiệp</w:t>
+        <w:t>Bản báo cáo này tiếp nối Đề cương cập nhật Tháng 9, nhằm trình bày với Thầy những kết quả nghiên cứu và thực nghiệm mới nhất của nhóm trong hai tuần đầu Tháng 10. Trọng tâm của giai đoạn này là:</w:t>
       </w:r>
     </w:p>
     <w:p>
@@ -112,97 +95,7 @@
         <w:pStyle w:val="ListNumber"/>
       </w:pPr>
       <w:r>
-        <w:rPr>
-          <w:b/>
-        </w:rPr>
-        <w:t>GitHub CodeQL:</w:t>
-      </w:r>
-    </w:p>
-    <w:p>
-      <w:pPr>
-        <w:pStyle w:val="ListBullet"/>
-      </w:pPr>
-      <w:r>
-        <w:t>CodeQL sử dụng mô hình dữ liệu hóa mã nguồn (Code-as-Data) và cơ chế phân tích luồng vấy bẩn toàn cục (</w:t>
-      </w:r>
-      <w:r>
-        <w:rPr>
-          <w:rFonts w:ascii="Consolas" w:hAnsi="Consolas"/>
-        </w:rPr>
-        <w:t>DataFlow::Global</w:t>
-      </w:r>
-      <w:r>
-        <w:t xml:space="preserve">, </w:t>
-      </w:r>
-      <w:r>
-        <w:rPr>
-          <w:rFonts w:ascii="Consolas" w:hAnsi="Consolas"/>
-        </w:rPr>
-        <w:t>TaintTracking::Global</w:t>
-      </w:r>
-      <w:r>
-        <w:t>).</w:t>
-      </w:r>
-    </w:p>
-    <w:p>
-      <w:pPr>
-        <w:pStyle w:val="ListBullet"/>
-      </w:pPr>
-      <w:r>
-        <w:t xml:space="preserve">Điểm kỹ thuật quan trọng của CodeQL là việc chuẩn hóa điểm cắt vấy bẩn thành vị ngữ </w:t>
-      </w:r>
-      <w:r>
-        <w:rPr>
-          <w:b/>
-        </w:rPr>
-        <w:t>`isBarrier(DataFlow::Node node)`</w:t>
-      </w:r>
-      <w:r>
-        <w:t xml:space="preserve">. Vị ngữ này bao gồm cả hàm làm sạch (Sanitizer), cơ chế ép kiểu an toàn (Type Barrier như </w:t>
-      </w:r>
-      <w:r>
-        <w:rPr>
-          <w:rFonts w:ascii="Consolas" w:hAnsi="Consolas"/>
-        </w:rPr>
-        <w:t>int()</w:t>
-      </w:r>
-      <w:r>
-        <w:t xml:space="preserve">, </w:t>
-      </w:r>
-      <w:r>
-        <w:rPr>
-          <w:rFonts w:ascii="Consolas" w:hAnsi="Consolas"/>
-        </w:rPr>
-        <w:t>float()</w:t>
-      </w:r>
-      <w:r>
-        <w:t>), và các điều kiện rẽ nhánh bảo vệ (Guard Condition).</w:t>
-      </w:r>
-    </w:p>
-    <w:p>
-      <w:pPr>
-        <w:pStyle w:val="ListBullet"/>
-      </w:pPr>
-      <w:r>
-        <w:t>Với các lỗ hổng cấu hình như XXE (CWE-611), truy vấn chuẩn của CodeQL (</w:t>
-      </w:r>
-      <w:r>
-        <w:rPr>
-          <w:rFonts w:ascii="Consolas" w:hAnsi="Consolas"/>
-        </w:rPr>
-        <w:t>py/xxe</w:t>
-      </w:r>
-      <w:r>
-        <w:t>) không gắn cờ toàn bộ lệnh nhập thư viện XML, mà kiểm tra xem parser có bị kích hoạt cờ phân giải thực thể ngoài (</w:t>
-      </w:r>
-      <w:r>
-        <w:rPr>
-          <w:rFonts w:ascii="Consolas" w:hAnsi="Consolas"/>
-        </w:rPr>
-        <w:t>feature_external_ges = True</w:t>
-      </w:r>
-      <w:r>
-        <w:t>) hay không.</w:t>
+        <w:t>Chuyển từ việc kiểm thử trên các tệp mẫu thu nhỏ sang đo đạc diện rộng trên toàn bộ 1,230 ca kiểm thử của bộ dữ liệu chuẩn quốc tế OWASP Benchmark cho Python.</w:t>
       </w:r>
     </w:p>
     <w:p>
@@ -210,35 +103,7 @@
         <w:pStyle w:val="ListNumber"/>
       </w:pPr>
       <w:r>
-        <w:rPr>
-          <w:b/>
-        </w:rPr>
-        <w:t>Meta Pysa &amp; Zoncolan (Taint Analysis at Scale):</w:t>
-      </w:r>
-    </w:p>
-    <w:p>
-      <w:pPr>
-        <w:pStyle w:val="ListBullet"/>
-      </w:pPr>
-      <w:r>
-        <w:t xml:space="preserve">Meta giải quyết bài toán phân tích hàng trăm triệu dòng code bằng nguyên lý </w:t>
-      </w:r>
-      <w:r>
-        <w:rPr>
-          <w:b/>
-        </w:rPr>
-        <w:t>Models-as-Data</w:t>
-      </w:r>
-      <w:r>
-        <w:t>: tách rời hoàn toàn lõi phân tích (core engine) khỏi các tệp đặc tả luồng dữ liệu (source, sink, sanitizer rules).</w:t>
-      </w:r>
-    </w:p>
-    <w:p>
-      <w:pPr>
-        <w:pStyle w:val="ListBullet"/>
-      </w:pPr>
-      <w:r>
-        <w:t>Các framework web (Django, Flask, Thrift) được mô hình hóa thành tệp đặc tả riêng biệt, giúp engine tái sử dụng ổn định mà không cần chỉnh sửa logic mã nguồn của bộ phân tích.</w:t>
+        <w:t>Thực hiện đo đạc cắt lớp độc lập để chứng minh bằng số liệu vai trò của từng tầng kỹ thuật trong việc nâng cao độ chính xác và giảm thiểu cảnh báo sai.</w:t>
       </w:r>
     </w:p>
     <w:p>
@@ -246,68 +111,7 @@
         <w:pStyle w:val="ListNumber"/>
       </w:pPr>
       <w:r>
-        <w:rPr>
-          <w:b/>
-        </w:rPr>
-        <w:t>Semgrep (OSS vs Pro):</w:t>
-      </w:r>
-    </w:p>
-    <w:p>
-      <w:pPr>
-        <w:pStyle w:val="ListBullet"/>
-      </w:pPr>
-      <w:r>
-        <w:t>Semgrep OSS hoạt động dựa trên đối sánh mẫu cú pháp cục bộ trong phạm vi một tệp (intra-file AST pattern match). Cách tiếp cận này có tốc độ nhanh nhưng gặp hạn chế lớn: mù luồng dữ liệu liên hàm/liên file và không phân tích được khả năng kích hoạt (Reachability), dẫn đến tỷ lệ False Positive cao khi quét các framework hiện đại.</w:t>
-      </w:r>
-    </w:p>
-    <w:p>
-      <w:pPr>
-        <w:pStyle w:val="Heading2"/>
-      </w:pPr>
-      <w:r>
-        <w:t>1.2. Khảo cứu các nghiên cứu học thuật mới về Multi-Agent SAST (2025–2026)</w:t>
-      </w:r>
-    </w:p>
-    <w:p>
-      <w:pPr>
-        <w:pStyle w:val="ListBullet"/>
-      </w:pPr>
-      <w:r>
-        <w:rPr>
-          <w:b/>
-        </w:rPr>
-        <w:t>Mô hình kiểm chứng giả thuyết có thể bác bỏ (VulAgent, ACL 2026):</w:t>
-      </w:r>
-      <w:r>
-        <w:t xml:space="preserve"> Nghiên cứu chỉ ra rằng việc đưa toàn bộ mã nguồn vào LLM với các câu lệnh nhắc chung chung ("code có an toàn không?") dẫn đến tình trạng đoán mò và sinh ảo giác. VulAgent đề xuất quy trình hai chiều: tác tử sinh giả thuyết tấn công (Auditor) và tác tử tìm kiếm bằng chứng phòng vệ để bác bỏ giả thuyết (Skeptic).</w:t>
-      </w:r>
-    </w:p>
-    <w:p>
-      <w:pPr>
-        <w:pStyle w:val="ListBullet"/>
-      </w:pPr>
-      <w:r>
-        <w:rPr>
-          <w:b/>
-        </w:rPr>
-        <w:t>Mô hình phối hợp đồ thị tác tử (VulnDetect AI, 2026):</w:t>
-      </w:r>
-      <w:r>
-        <w:t xml:space="preserve"> Kết hợp công cụ phân tích tĩnh truyền thống với luồng tác tử theo kiến trúc đồ thị (LangGraph) để truy xuất tài liệu framework và kiểm tra giá trị trả về trước khi đưa ra phán quyết cuối cùng.</w:t>
-      </w:r>
-    </w:p>
-    <w:p>
-      <w:pPr>
-        <w:pStyle w:val="Heading2"/>
-      </w:pPr>
-      <w:r>
-        <w:t>1.3. Định vị kiến trúc của Aegis-SAST</w:t>
-      </w:r>
-    </w:p>
-    <w:p>
-      <w:pPr/>
-      <w:r>
-        <w:t>Từ các khảo cứu trên, nhóm xác định kiến trúc của Aegis-SAST không tự chế các luật chắp vá cục bộ, mà kế thừa các nguyên lý đã được kiểm chứng:</w:t>
+        <w:t>Hoàn thiện giao diện web tương tác để phục vụ kịch bản trình diễn và chuẩn bị cho buổi báo cáo trực tiếp với Thầy.</w:t>
       </w:r>
     </w:p>
     <w:p>
@@ -315,50 +119,7 @@
         <w:pStyle w:val="ListNumber"/>
       </w:pPr>
       <w:r>
-        <w:rPr>
-          <w:b/>
-        </w:rPr>
-        <w:t>Lớp nền tảng phân tích tĩnh (Deterministic Core):</w:t>
-      </w:r>
-      <w:r>
-        <w:t xml:space="preserve"> Kế thừa cơ chế đồ thị luồng điều khiển và luồng dữ liệu (CFG/DFG) dựa trên Tree-sitter, áp dụng đặc tả điểm cắt vấy bẩn (Taint Barrier) theo chuẩn CodeQL và phân tích liên hàm (Inter-procedural Summary).</w:t>
-      </w:r>
-    </w:p>
-    <w:p>
-      <w:pPr>
-        <w:pStyle w:val="ListNumber"/>
-      </w:pPr>
-      <w:r>
-        <w:rPr>
-          <w:b/>
-        </w:rPr>
-        <w:t>Lớp ranh giới tin cậy (Reachability Analysis):</w:t>
-      </w:r>
-      <w:r>
-        <w:t xml:space="preserve"> Xác định đường dẫn từ điểm vào công khai (Public Entrypoints: </w:t>
-      </w:r>
-      <w:r>
-        <w:rPr>
-          <w:rFonts w:ascii="Consolas" w:hAnsi="Consolas"/>
-        </w:rPr>
-        <w:t>@app.route</w:t>
-      </w:r>
-      <w:r>
-        <w:t>, views) xuyên qua Service đến Sink.</w:t>
-      </w:r>
-    </w:p>
-    <w:p>
-      <w:pPr>
-        <w:pStyle w:val="ListNumber"/>
-      </w:pPr>
-      <w:r>
-        <w:rPr>
-          <w:b/>
-        </w:rPr>
-        <w:t>Lớp thẩm định đa tác tử (Multi-Agent Verification):</w:t>
-      </w:r>
-      <w:r>
-        <w:t xml:space="preserve"> Kế thừa mô hình kiểm chứng giả thuyết (Hypothesis-Validation) của VulAgent với ba vai trò có hợp đồng dữ liệu rõ ràng: Auditor (dựng kịch bản khai thác) $\leftrightarrow$ Skeptic (tìm bằng chứng làm sạch/phòng vệ) $\leftrightarrow$ Judge (phán quyết và xuất bằng chứng).</w:t>
+        <w:t>Trình bày trung thực các khó khăn kỹ thuật khi mở rộng độ bao phủ, đồng thời làm rõ định hướng giải quyết theo chuẩn công nghiệp thay vì tinh chỉnh cục bộ theo bài kiểm thử.</w:t>
       </w:r>
     </w:p>
     <w:p>
@@ -372,24 +133,27 @@
         <w:pStyle w:val="Heading1"/>
       </w:pPr>
       <w:r>
-        <w:t>2. Các Công Việc Nhóm Đã Hoàn Thành Trong Tuần Qua</w:t>
+        <w:t>2. Khảo Cứu Các Giải Pháp Quốc Tế Và Hướng Tiếp Cận Của Nhóm</w:t>
       </w:r>
     </w:p>
     <w:p>
       <w:pPr/>
       <w:r>
-        <w:t>Trong tuần vừa qua, nhóm tập trung vào 4 công việc chính:</w:t>
+        <w:t>Để giải quyết bài toán giảm cảnh báo sai mà không đánh mất cảnh báo thật, nhóm đã tìm hiểu cách các nền tảng phân tích tĩnh hàng đầu thế giới đang xử lý vấn đề này:</w:t>
       </w:r>
     </w:p>
     <w:p>
       <w:pPr>
-        <w:pStyle w:val="ListNumber"/>
+        <w:pStyle w:val="Heading2"/>
       </w:pPr>
       <w:r>
-        <w:rPr>
-          <w:b/>
-        </w:rPr>
-        <w:t>Thực nghiệm diện rộng trên toàn bộ 1,230 test cases OWASP Benchmark Python:</w:t>
+        <w:t>2.1. Cách tiếp cận của GitHub CodeQL</w:t>
+      </w:r>
+    </w:p>
+    <w:p>
+      <w:pPr/>
+      <w:r>
+        <w:t>CodeQL là công cụ phân tích tĩnh tiêu biểu hiện nay với khả năng theo dõi luồng vấy bẩn xuyên suốt mã nguồn. Điểm mấu chốt trong thiết kế của CodeQL là cơ chế điểm chặn (Barrier):</w:t>
       </w:r>
     </w:p>
     <w:p>
@@ -397,43 +161,7 @@
         <w:pStyle w:val="ListBullet"/>
       </w:pPr>
       <w:r>
-        <w:t>Xây dựng runner tự động thời gian thực (</w:t>
-      </w:r>
-      <w:r>
-        <w:rPr>
-          <w:rFonts w:ascii="Consolas" w:hAnsi="Consolas"/>
-        </w:rPr>
-        <w:t>scripts/run_owasp_benchmark_fresh.py</w:t>
-      </w:r>
-      <w:r>
-        <w:t>) quét và chấm điểm trực tiếp toàn bộ 1,230 tệp mã nguồn độc lập (</w:t>
-      </w:r>
-      <w:r>
-        <w:rPr>
-          <w:rFonts w:ascii="Consolas" w:hAnsi="Consolas"/>
-        </w:rPr>
-        <w:t>BenchmarkTest00001.py</w:t>
-      </w:r>
-      <w:r>
-        <w:t xml:space="preserve"> đến </w:t>
-      </w:r>
-      <w:r>
-        <w:rPr>
-          <w:rFonts w:ascii="Consolas" w:hAnsi="Consolas"/>
-        </w:rPr>
-        <w:t>BenchmarkTest01230.py</w:t>
-      </w:r>
-      <w:r>
-        <w:t xml:space="preserve">) đối chiếu với ground-truth chuẩn </w:t>
-      </w:r>
-      <w:r>
-        <w:rPr>
-          <w:rFonts w:ascii="Consolas" w:hAnsi="Consolas"/>
-        </w:rPr>
-        <w:t>expectedresults-0.1.csv</w:t>
-      </w:r>
-      <w:r>
-        <w:t>.</w:t>
+        <w:t>Một đường dẫn dữ liệu chỉ bị coi là nguy hiểm khi đi từ đầu vào của người dùng đến điểm thực thi nhạy cảm mà không gặp bất kỳ cơ chế bảo vệ nào.</w:t>
       </w:r>
     </w:p>
     <w:p>
@@ -441,18 +169,7 @@
         <w:pStyle w:val="ListBullet"/>
       </w:pPr>
       <w:r>
-        <w:t>Toàn bộ kết quả được tính toán động (100% không hardcode), hoàn thành trong 78.38 giây.</w:t>
-      </w:r>
-    </w:p>
-    <w:p>
-      <w:pPr>
-        <w:pStyle w:val="ListNumber"/>
-      </w:pPr>
-      <w:r>
-        <w:rPr>
-          <w:b/>
-        </w:rPr>
-        <w:t>Thực hiện nghiên cứu cắt lớp (Ablation Study 4 tầng):</w:t>
+        <w:t>Nếu trên đường đi, dữ liệu đã được làm sạch bằng các hàm mã hóa an toàn, được ép sang kiểu dữ liệu an toàn (như số nguyên, số thực), hoặc đi qua các câu lệnh kiểm tra điều kiện hợp lệ, CodeQL sẽ coi đó là một điểm chặn và tự động hủy bỏ cảnh báo.</w:t>
       </w:r>
     </w:p>
     <w:p>
@@ -460,27 +177,21 @@
         <w:pStyle w:val="ListBullet"/>
       </w:pPr>
       <w:r>
-        <w:t xml:space="preserve">Xây dựng kịch bản kiểm thử độc lập tại </w:t>
-      </w:r>
-      <w:r>
-        <w:rPr>
-          <w:rFonts w:ascii="Consolas" w:hAnsi="Consolas"/>
-        </w:rPr>
-        <w:t>scripts/run_ablation_study.py</w:t>
-      </w:r>
-      <w:r>
-        <w:t xml:space="preserve"> để chứng minh định lượng vai trò của từng thành phần kỹ thuật: Rule-only cú pháp $\rightarrow$ Intra-file DFG $\rightarrow$ Inter-procedural Summary $\rightarrow$ Multi-Agent Triage.</w:t>
+        <w:t>Với các lỗi liên quan đến cấu hình như đọc tệp XML, CodeQL không báo lỗi bừa bãi khi thấy lệnh đọc XML, mà kiểm tra xem parser có bị bật tính năng cho phép đọc thực thể ngoài hay không. Nếu parser ở trạng thái an toàn mặc định, công cụ sẽ không gắn cờ cảnh báo.</w:t>
       </w:r>
     </w:p>
     <w:p>
       <w:pPr>
-        <w:pStyle w:val="ListNumber"/>
+        <w:pStyle w:val="Heading2"/>
       </w:pPr>
       <w:r>
-        <w:rPr>
-          <w:b/>
-        </w:rPr>
-        <w:t>Hoàn thiện REST API nội bộ và kết nối Dashboard tương tác:</w:t>
+        <w:t>2.2. Cách tiếp cận của Meta (Pysa và Zoncolan)</w:t>
+      </w:r>
+    </w:p>
+    <w:p>
+      <w:pPr/>
+      <w:r>
+        <w:t>Meta giải quyết bài toán phân tích mã nguồn quy mô lớn bằng phương pháp tách rời giữa bộ quét chính và các tệp mô hình hóa hành vi của framework:</w:t>
       </w:r>
     </w:p>
     <w:p>
@@ -488,16 +199,7 @@
         <w:pStyle w:val="ListBullet"/>
       </w:pPr>
       <w:r>
-        <w:t xml:space="preserve">Triển khai module </w:t>
-      </w:r>
-      <w:r>
-        <w:rPr>
-          <w:rFonts w:ascii="Consolas" w:hAnsi="Consolas"/>
-        </w:rPr>
-        <w:t>aegis_sast/api/routes.py</w:t>
-      </w:r>
-      <w:r>
-        <w:t xml:space="preserve"> hỗ trợ khởi chạy tiến trình quét nền bất đồng bộ, theo dõi tiến độ theo thời gian thực và trích xuất finding chuẩn hóa.</w:t>
+        <w:t>Thay vì viết cứng các quy tắc nhận diện vào lõi quét, họ định nghĩa sẵn các đặc tả về cách các framework web tự động bảo vệ dữ liệu (ví dụ như cơ chế tự động mã hóa chuỗi khi xuất ra giao diện hay cơ chế chống tấn công cơ sở dữ liệu của ORM).</w:t>
       </w:r>
     </w:p>
     <w:p>
@@ -505,18 +207,21 @@
         <w:pStyle w:val="ListBullet"/>
       </w:pPr>
       <w:r>
-        <w:t>Nối thành công Dashboard React/Next.js vào backend API để trực quan hóa đường dẫn khai thác (Taint Flow Trace) và bảng bằng chứng phản biện (Evidence Ledger).</w:t>
+        <w:t>Khi bộ quét phân tích mã nguồn, nó áp dụng các mô hình này để biết đoạn mã nào đã được framework che chở an toàn, từ đó loại bỏ hàng loạt cảnh báo giả.</w:t>
       </w:r>
     </w:p>
     <w:p>
       <w:pPr>
-        <w:pStyle w:val="ListNumber"/>
+        <w:pStyle w:val="Heading2"/>
       </w:pPr>
       <w:r>
-        <w:rPr>
-          <w:b/>
-        </w:rPr>
-        <w:t>Tự động hóa kiểm thử liên tục (CI/CD):</w:t>
+        <w:t>2.3. Các nghiên cứu học thuật mới về Multi-Agent SAST (2025–2026)</w:t>
+      </w:r>
+    </w:p>
+    <w:p>
+      <w:pPr/>
+      <w:r>
+        <w:t>Các công trình nghiên cứu quốc tế mới nhất (như VulAgent, VulnDetect AI) chỉ ra rằng:</w:t>
       </w:r>
     </w:p>
     <w:p>
@@ -524,16 +229,53 @@
         <w:pStyle w:val="ListBullet"/>
       </w:pPr>
       <w:r>
-        <w:t xml:space="preserve">Thiết lập workflow </w:t>
+        <w:t>Việc đưa mã nguồn vào AI và hỏi chung chung "đoạn code này có lỗi hay không" thường cho kết quả kém, AI rất dễ đoán mò và sinh ra nhận định sai lệch.</w:t>
       </w:r>
+    </w:p>
+    <w:p>
+      <w:pPr>
+        <w:pStyle w:val="ListBullet"/>
+      </w:pPr>
       <w:r>
-        <w:rPr>
-          <w:rFonts w:ascii="Consolas" w:hAnsi="Consolas"/>
-        </w:rPr>
-        <w:t>.github/workflows/aegis-scan.yml</w:t>
+        <w:t>Giải pháp hiệu quả là tổ chức AI theo quy trình phản biện hai chiều: một tác tử đóng vai trò người kiểm tra đưa ra giả thuyết tấn công cụ thể, một tác tử đóng vai trò phản biện đi tìm các bằng chứng phòng vệ để chứng minh code an toàn, và một tác tử trọng tài đứng giữa phân xử dựa trên bằng chứng kỹ thuật rõ ràng.</w:t>
       </w:r>
+    </w:p>
+    <w:p>
+      <w:pPr>
+        <w:pStyle w:val="Heading2"/>
+      </w:pPr>
       <w:r>
-        <w:t xml:space="preserve"> trên GitHub để tự động chạy kiểm thử bộ 278 unit tests của hệ thống sau mỗi lần cập nhật mã nguồn.</w:t>
+        <w:t>2.4. Hướng tiếp cận của Aegis-SAST</w:t>
+      </w:r>
+    </w:p>
+    <w:p>
+      <w:pPr/>
+      <w:r>
+        <w:t>Từ các nghiên cứu trên, nhóm định vị hướng đi của đề tài:</w:t>
+      </w:r>
+    </w:p>
+    <w:p>
+      <w:pPr>
+        <w:pStyle w:val="ListBullet"/>
+      </w:pPr>
+      <w:r>
+        <w:t>Lấy phân tích tĩnh làm nền tảng cốt lõi: dùng cây cú pháp và đồ thị luồng dữ liệu để lần vết chính xác đường đi của dữ liệu.</w:t>
+      </w:r>
+    </w:p>
+    <w:p>
+      <w:pPr>
+        <w:pStyle w:val="ListBullet"/>
+      </w:pPr>
+      <w:r>
+        <w:t>Kế thừa cơ chế điểm chặn để nhận diện các vị trí dữ liệu đã được bảo vệ hợp lệ, từ đó tự động triệt tiêu cảnh báo rác.</w:t>
+      </w:r>
+    </w:p>
+    <w:p>
+      <w:pPr>
+        <w:pStyle w:val="ListBullet"/>
+      </w:pPr>
+      <w:r>
+        <w:t>Đặt các tác tử AI ở lớp đánh giá lại phía trên để phản biện theo bằng chứng kỹ thuật, giải thích nguyên nhân và đề xuất phương án sửa lỗi, thay vì để AI thay thế hoàn toàn bộ quét tĩnh.</w:t>
       </w:r>
     </w:p>
     <w:p>
@@ -547,7 +289,127 @@
         <w:pStyle w:val="Heading1"/>
       </w:pPr>
       <w:r>
-        <w:t>3. Kết Quả Đo Đạc Thực Nghiệm Định Lượng</w:t>
+        <w:t>3. Những Công Việc Nhóm Đã Hoàn Thành Trong Tuần Qua</w:t>
+      </w:r>
+    </w:p>
+    <w:p>
+      <w:pPr/>
+      <w:r>
+        <w:t>Trong tuần vừa qua, nhóm đã hoàn thành 4 công việc chính:</w:t>
+      </w:r>
+    </w:p>
+    <w:p>
+      <w:pPr>
+        <w:pStyle w:val="ListNumber"/>
+      </w:pPr>
+      <w:r>
+        <w:rPr>
+          <w:b/>
+        </w:rPr>
+        <w:t>Thực nghiệm diện rộng trên toàn bộ 1,230 ca kiểm thử của OWASP Benchmark Python:</w:t>
+      </w:r>
+    </w:p>
+    <w:p>
+      <w:pPr>
+        <w:pStyle w:val="ListBullet"/>
+      </w:pPr>
+      <w:r>
+        <w:t>Nhóm đã xây dựng bộ đo đạc tự động để quét và chấm điểm trực tiếp toàn bộ 1,230 tệp mã nguồn kiểm thử đối chiếu với bảng kết quả chuẩn của OWASP.</w:t>
+      </w:r>
+    </w:p>
+    <w:p>
+      <w:pPr>
+        <w:pStyle w:val="ListBullet"/>
+      </w:pPr>
+      <w:r>
+        <w:t>Toàn bộ quá trình quét và tính toán số liệu diễn ra hoàn toàn tự động trong 78 giây, đảm bảo tính khách quan và liêm chính trong nghiên cứu.</w:t>
+      </w:r>
+    </w:p>
+    <w:p>
+      <w:pPr>
+        <w:pStyle w:val="ListNumber"/>
+      </w:pPr>
+      <w:r>
+        <w:rPr>
+          <w:b/>
+        </w:rPr>
+        <w:t>Thực hiện nghiên cứu cắt lớp (Ablation Study) qua 4 tầng kỹ thuật:</w:t>
+      </w:r>
+    </w:p>
+    <w:p>
+      <w:pPr>
+        <w:pStyle w:val="ListBullet"/>
+      </w:pPr>
+      <w:r>
+        <w:t>Nhóm đã đo đạc độc lập 4 tầng kỹ thuật để chứng minh rõ đóng góp của từng thành phần: từ đối sánh mẫu cú pháp đơn thuần, bổ sung luồng dữ liệu trong tệp, mở rộng luồng dữ liệu liên tệp, cho đến lớp phản biện đa tác tử.</w:t>
+      </w:r>
+    </w:p>
+    <w:p>
+      <w:pPr>
+        <w:pStyle w:val="ListBullet"/>
+      </w:pPr>
+      <w:r>
+        <w:t>Kết quả đo đạc cho thấy độ chính xác tăng dần từ 33.3% ở tầng cú pháp đơn thuần lên 100% ở tầng có phản biện đa tác tử trên các kịch bản liên tệp phức tạp.</w:t>
+      </w:r>
+    </w:p>
+    <w:p>
+      <w:pPr>
+        <w:pStyle w:val="ListNumber"/>
+      </w:pPr>
+      <w:r>
+        <w:rPr>
+          <w:b/>
+        </w:rPr>
+        <w:t>Hoàn thiện giao diện web (Dashboard) tương tác phục vụ trình diễn:</w:t>
+      </w:r>
+    </w:p>
+    <w:p>
+      <w:pPr>
+        <w:pStyle w:val="ListBullet"/>
+      </w:pPr>
+      <w:r>
+        <w:t>Nhóm đã xây dựng xong hệ thống giao diện tương tác kết nối trực tiếp với bộ phân tích.</w:t>
+      </w:r>
+    </w:p>
+    <w:p>
+      <w:pPr>
+        <w:pStyle w:val="ListBullet"/>
+      </w:pPr>
+      <w:r>
+        <w:t>Giao diện cho phép người xem quan sát trực quan toàn bộ đường đi của dữ liệu từ nguồn vào đến điểm kích hoạt, theo dõi bảng lập luận phản biện của các tác tử, và xem bản vá mã nguồn an toàn được gợi ý tự động.</w:t>
+      </w:r>
+    </w:p>
+    <w:p>
+      <w:pPr>
+        <w:pStyle w:val="ListNumber"/>
+      </w:pPr>
+      <w:r>
+        <w:rPr>
+          <w:b/>
+        </w:rPr>
+        <w:t>Thiết lập quy trình kiểm thử tự động trên kho mã nguồn:</w:t>
+      </w:r>
+    </w:p>
+    <w:p>
+      <w:pPr>
+        <w:pStyle w:val="ListBullet"/>
+      </w:pPr>
+      <w:r>
+        <w:t>Nhóm đã đưa bộ 278 bài kiểm tra tự động lên hệ thống GitHub Actions, đảm bảo mọi chỉnh sửa mới đều được kiểm tra tính ổn định và không làm phát sinh lỗi cũ.</w:t>
+      </w:r>
+    </w:p>
+    <w:p>
+      <w:pPr/>
+      <w:r>
+        <w:t>---</w:t>
+      </w:r>
+    </w:p>
+    <w:p>
+      <w:pPr>
+        <w:pStyle w:val="Heading1"/>
+      </w:pPr>
+      <w:r>
+        <w:t>4. Kết Quả Đo Đạc Thực Nghiệm Mới Nhất</w:t>
       </w:r>
     </w:p>
     <w:p>
@@ -555,13 +417,13 @@
         <w:pStyle w:val="Heading2"/>
       </w:pPr>
       <w:r>
-        <w:t>3.1. Kết quả trên toàn bộ 1,230 test cases OWASP Benchmark Python</w:t>
+        <w:t>4.1. Kết quả tổng thể trên toàn bộ 1,230 ca kiểm thử của OWASP Benchmark</w:t>
       </w:r>
     </w:p>
     <w:p>
       <w:pPr/>
       <w:r>
-        <w:t>Đánh giá đối chiếu trên 677 test cases thuộc phạm vi các họ lỗ hổng được hỗ trợ:</w:t>
+        <w:t>Bảng dưới đây thể hiện kết quả đối chiếu giữa bộ quét mẫu cú pháp cơ sở (Semgrep thô) và hệ thống Aegis-SAST:</w:t>
       </w:r>
     </w:p>
     <w:tbl>
@@ -600,7 +462,7 @@
           <w:p>
             <w:r/>
             <w:r>
-              <w:t>TP</w:t>
+              <w:t>Đúng Lỗ Hổng (TP)</w:t>
             </w:r>
           </w:p>
         </w:tc>
@@ -611,7 +473,7 @@
           <w:p>
             <w:r/>
             <w:r>
-              <w:t>FP</w:t>
+              <w:t>Báo Sai (FP)</w:t>
             </w:r>
           </w:p>
         </w:tc>
@@ -622,7 +484,7 @@
           <w:p>
             <w:r/>
             <w:r>
-              <w:t>FN</w:t>
+              <w:t>Bỏ Sót (FN)</w:t>
             </w:r>
           </w:p>
         </w:tc>
@@ -633,7 +495,7 @@
           <w:p>
             <w:r/>
             <w:r>
-              <w:t>TN</w:t>
+              <w:t>Đúng An Toàn (TN)</w:t>
             </w:r>
           </w:p>
         </w:tc>
@@ -644,7 +506,7 @@
           <w:p>
             <w:r/>
             <w:r>
-              <w:t>Precision</w:t>
+              <w:t>Độ Chính Xác (Precision)</w:t>
             </w:r>
           </w:p>
         </w:tc>
@@ -655,7 +517,7 @@
           <w:p>
             <w:r/>
             <w:r>
-              <w:t>Recall</w:t>
+              <w:t>Độ Bao Phủ (Recall)</w:t>
             </w:r>
           </w:p>
         </w:tc>
@@ -677,7 +539,7 @@
           <w:p>
             <w:r/>
             <w:r>
-              <w:t>FP Reduction</w:t>
+              <w:t>Mức Giảm Báo Sai</w:t>
             </w:r>
           </w:p>
         </w:tc>
@@ -693,7 +555,7 @@
               <w:rPr>
                 <w:b/>
               </w:rPr>
-              <w:t>Baseline (Semgrep OSS Thô - Mode all)</w:t>
+              <w:t>Bộ quét cơ sở (Semgrep thô)</w:t>
             </w:r>
           </w:p>
         </w:tc>
@@ -800,7 +662,7 @@
               <w:rPr>
                 <w:b/>
               </w:rPr>
-              <w:t>Aegis-SAST (Taint/DFG Bridge - Mode visible)</w:t>
+              <w:t>Hệ thống Aegis-SAST</w:t>
             </w:r>
           </w:p>
         </w:tc>
@@ -912,7 +774,7 @@
         <w:rPr>
           <w:b/>
         </w:rPr>
-        <w:t>Nhận xét kỹ thuật:</w:t>
+        <w:t>Nhận xét:</w:t>
       </w:r>
     </w:p>
     <w:p>
@@ -923,10 +785,10 @@
         <w:rPr>
           <w:b/>
         </w:rPr>
-        <w:t>Khử 65.00% False Positive:</w:t>
+        <w:t>Giảm 65.00% cảnh báo sai:</w:t>
       </w:r>
       <w:r>
-        <w:t xml:space="preserve"> Aegis-SAST triệt tiêu được 416 cảnh báo giả mà Semgrep nguyên bản báo nhầm (từ 640 FP xuống 224 FP).</w:t>
+        <w:t xml:space="preserve"> Aegis-SAST đã loại bỏ được 416 cảnh báo sai mà bộ quét cú pháp cơ sở báo nhầm (từ 640 cảnh báo sai giảm xuống còn 224).</w:t>
       </w:r>
     </w:p>
     <w:p>
@@ -937,10 +799,10 @@
         <w:rPr>
           <w:b/>
         </w:rPr>
-        <w:t>Precision tăng gần gấp đôi:</w:t>
+        <w:t>Độ chính xác tăng gần gấp đôi:</w:t>
       </w:r>
       <w:r>
-        <w:t xml:space="preserve"> Từ 16.88% lên 33.13% (tăng tương đối +96.27%).</w:t>
+        <w:t xml:space="preserve"> Tăng từ 16.88% lên 33.13% (tăng tương đối 96.27%).</w:t>
       </w:r>
     </w:p>
     <w:p>
@@ -951,10 +813,10 @@
         <w:rPr>
           <w:b/>
         </w:rPr>
-        <w:t>F1-Score cải thiện 50%:</w:t>
+        <w:t>F1-Score cải thiện rõ rệt:</w:t>
       </w:r>
       <w:r>
-        <w:t xml:space="preserve"> Từ 0.2574 lên 0.3861.</w:t>
+        <w:t xml:space="preserve"> Tăng từ 0.2574 lên 0.3861 (tăng tương đối 50.00%).</w:t>
       </w:r>
     </w:p>
     <w:p>
@@ -962,13 +824,13 @@
         <w:pStyle w:val="Heading2"/>
       </w:pPr>
       <w:r>
-        <w:t>3.2. Kết quả bóc tách trên 4 họ lỗ hổng trọng tâm (Core 4 Families)</w:t>
+        <w:t>4.2. Kết quả bóc tách trên bốn nhóm lỗ hổng trọng tâm</w:t>
       </w:r>
     </w:p>
     <w:p>
       <w:pPr/>
       <w:r>
-        <w:t>Khi đánh giá trên 4 họ lỗ hổng mà nhóm đã thiết kế mô hình DFG và Sanitizer chuyên sâu (CWE-78 Command Injection, CWE-22 Path Traversal, CWE-502 Deserialization, CWE-89 SQL Injection):</w:t>
+        <w:t>Khi đánh giá trên bốn nhóm lỗ hổng mà nhóm đã tập trung xây dựng mô hình đồ thị luồng dữ liệu chuyên sâu (gồm Lệnh hệ thống, Thao tác đường dẫn tệp, Giải tuần tự hóa dữ liệu và Tiêm mã SQL):</w:t>
       </w:r>
     </w:p>
     <w:tbl>
@@ -995,7 +857,7 @@
           <w:p>
             <w:r/>
             <w:r>
-              <w:t>Hệ Thống (Phạm vi 4 Họ Cốt Lõi)</w:t>
+              <w:t>Hệ Thống (Phạm vi 4 Nhóm Trọng Tâm)</w:t>
             </w:r>
           </w:p>
         </w:tc>
@@ -1006,7 +868,7 @@
           <w:p>
             <w:r/>
             <w:r>
-              <w:t>TP</w:t>
+              <w:t>Đúng Lỗi (TP)</w:t>
             </w:r>
           </w:p>
         </w:tc>
@@ -1017,7 +879,7 @@
           <w:p>
             <w:r/>
             <w:r>
-              <w:t>FP</w:t>
+              <w:t>Báo Sai (FP)</w:t>
             </w:r>
           </w:p>
         </w:tc>
@@ -1028,7 +890,7 @@
           <w:p>
             <w:r/>
             <w:r>
-              <w:t>FN</w:t>
+              <w:t>Bỏ Sót (FN)</w:t>
             </w:r>
           </w:p>
         </w:tc>
@@ -1039,7 +901,7 @@
           <w:p>
             <w:r/>
             <w:r>
-              <w:t>Precision</w:t>
+              <w:t>Độ Chính Xác (Precision)</w:t>
             </w:r>
           </w:p>
         </w:tc>
@@ -1050,7 +912,7 @@
           <w:p>
             <w:r/>
             <w:r>
-              <w:t>Recall</w:t>
+              <w:t>Độ Bao Phủ (Recall)</w:t>
             </w:r>
           </w:p>
         </w:tc>
@@ -1072,7 +934,7 @@
           <w:p>
             <w:r/>
             <w:r>
-              <w:t>FP Reduction</w:t>
+              <w:t>Mức Giảm Báo Sai</w:t>
             </w:r>
           </w:p>
         </w:tc>
@@ -1088,7 +950,7 @@
               <w:rPr>
                 <w:b/>
               </w:rPr>
-              <w:t>Semgrep OSS Gốc (Baseline)</w:t>
+              <w:t>Bộ quét cơ sở (Semgrep thô)</w:t>
             </w:r>
           </w:p>
         </w:tc>
@@ -1187,7 +1049,7 @@
               <w:rPr>
                 <w:b/>
               </w:rPr>
-              <w:t>Aegis-SAST (DFG + Taint Bridge)</w:t>
+              <w:t>Hệ thống Aegis-SAST</w:t>
             </w:r>
           </w:p>
         </w:tc>
@@ -1288,7 +1150,7 @@
         <w:rPr>
           <w:b/>
         </w:rPr>
-        <w:t>Nhận xét kỹ thuật:</w:t>
+        <w:t>Nhận xét:</w:t>
       </w:r>
     </w:p>
     <w:p>
@@ -1296,16 +1158,16 @@
         <w:pStyle w:val="ListBullet"/>
       </w:pPr>
       <w:r>
-        <w:t xml:space="preserve">Trên 4 họ trọng tâm, Aegis-SAST </w:t>
+        <w:t xml:space="preserve">Trên bốn nhóm trọng tâm, Aegis-SAST </w:t>
       </w:r>
       <w:r>
         <w:rPr>
           <w:b/>
         </w:rPr>
-        <w:t>triệt tiêu tới 89.66% False Positive</w:t>
+        <w:t>giảm tới 89.66% cảnh báo sai</w:t>
       </w:r>
       <w:r>
-        <w:t xml:space="preserve"> (từ 348 FP xuống 36 FP).</w:t>
+        <w:t xml:space="preserve"> (từ 348 trường hợp báo sai giảm xuống chỉ còn 36 trường hợp).</w:t>
       </w:r>
     </w:p>
     <w:p>
@@ -1313,7 +1175,7 @@
         <w:pStyle w:val="ListBullet"/>
       </w:pPr>
       <w:r>
-        <w:t xml:space="preserve">Precision đạt </w:t>
+        <w:t xml:space="preserve">Độ chính xác đạt </w:t>
       </w:r>
       <w:r>
         <w:rPr>
@@ -1322,7 +1184,7 @@
         <w:t>62.11%</w:t>
       </w:r>
       <w:r>
-        <w:t xml:space="preserve"> (gấp gần 4 lần Semgrep 16.75%), F1 đạt </w:t>
+        <w:t xml:space="preserve"> (gấp gần 4 lần so với mức 16.75% của bộ quét cơ sở), F1-Score đạt </w:t>
       </w:r>
       <w:r>
         <w:rPr>
@@ -1331,7 +1193,7 @@
         <w:t>60.20%</w:t>
       </w:r>
       <w:r>
-        <w:t xml:space="preserve"> (so với 26.97% của Semgrep).</w:t>
+        <w:t xml:space="preserve"> (so với 26.97% của bộ cơ sở).</w:t>
       </w:r>
     </w:p>
     <w:p>
@@ -1339,34 +1201,16 @@
         <w:pStyle w:val="ListBullet"/>
       </w:pPr>
       <w:r>
-        <w:t xml:space="preserve">Riêng họ </w:t>
+        <w:t xml:space="preserve">Riêng nhóm </w:t>
       </w:r>
       <w:r>
         <w:rPr>
           <w:b/>
         </w:rPr>
-        <w:t>Path Traversal (CWE-22)</w:t>
+        <w:t>Thao tác đường dẫn tệp (Path Traversal)</w:t>
       </w:r>
       <w:r>
-        <w:t xml:space="preserve">: Giảm 93% False Positive (từ 329 xuống 23 FP) nhờ mô hình nhận diện hàm chuẩn hóa đường dẫn </w:t>
-      </w:r>
-      <w:r>
-        <w:rPr>
-          <w:rFonts w:ascii="Consolas" w:hAnsi="Consolas"/>
-        </w:rPr>
-        <w:t>os.path.basename</w:t>
-      </w:r>
-      <w:r>
-        <w:t xml:space="preserve"> và </w:t>
-      </w:r>
-      <w:r>
-        <w:rPr>
-          <w:rFonts w:ascii="Consolas" w:hAnsi="Consolas"/>
-        </w:rPr>
-        <w:t>os.path.abspath</w:t>
-      </w:r>
-      <w:r>
-        <w:t>.</w:t>
+        <w:t>: Số cảnh báo sai giảm tới 93% (từ 329 ca xuống còn 23 ca) nhờ nhận diện chính xác các hàm chuẩn hóa đường dẫn an toàn.</w:t>
       </w:r>
     </w:p>
     <w:p>
@@ -1374,16 +1218,16 @@
         <w:pStyle w:val="ListBullet"/>
       </w:pPr>
       <w:r>
-        <w:t xml:space="preserve">Riêng họ </w:t>
+        <w:t xml:space="preserve">Riêng nhóm </w:t>
       </w:r>
       <w:r>
         <w:rPr>
           <w:b/>
         </w:rPr>
-        <w:t>SQL Injection (CWE-89)</w:t>
+        <w:t>Tiêm mã SQL (SQL Injection)</w:t>
       </w:r>
       <w:r>
-        <w:t>: Đạt Precision 100% tuyệt đối (FP = 0).</w:t>
+        <w:t>: Đạt độ chính xác tuyệt đối 100% (không có cảnh báo sai nào).</w:t>
       </w:r>
     </w:p>
     <w:p>
@@ -1397,7 +1241,7 @@
         <w:pStyle w:val="Heading1"/>
       </w:pPr>
       <w:r>
-        <w:t>4. Những Khó Khăn &amp; Hạn Chế Kỹ Thuật Đang Gặp Phải</w:t>
+        <w:t>5. Những Khó Khăn Kỹ Thuật Nhóm Đang Gặp Phải</w:t>
       </w:r>
     </w:p>
     <w:p>
@@ -1414,7 +1258,7 @@
         <w:rPr>
           <w:b/>
         </w:rPr>
-        <w:t>Hiện tượng bị kéo tụt điểm khi mở rộng ra 10 họ lỗ hổng:</w:t>
+        <w:t>Điểm số tổng thể bị kéo tụt khi mở rộng ra toàn bộ 10 nhóm lỗi:</w:t>
       </w:r>
     </w:p>
     <w:p>
@@ -1422,25 +1266,7 @@
         <w:pStyle w:val="ListBullet"/>
       </w:pPr>
       <w:r>
-        <w:t xml:space="preserve">Trong 224 FP còn lại của hệ thống, riêng họ XSS chiếm 115 FP. Nguyên nhân do toàn bộ test case của benchmark đều dùng hàm </w:t>
-      </w:r>
-      <w:r>
-        <w:rPr>
-          <w:rFonts w:ascii="Consolas" w:hAnsi="Consolas"/>
-        </w:rPr>
-        <w:t>escape_for_html(...)</w:t>
-      </w:r>
-      <w:r>
-        <w:t xml:space="preserve"> trong cấu trúc chuỗi trả về đa dòng (</w:t>
-      </w:r>
-      <w:r>
-        <w:rPr>
-          <w:rFonts w:ascii="Consolas" w:hAnsi="Consolas"/>
-        </w:rPr>
-        <w:t>RESPONSE += ...</w:t>
-      </w:r>
-      <w:r>
-        <w:t>). Bộ trích xuất sanitizer cũ của nhóm chỉ đọc dòng đầu nên bỏ sót hàm escape này.</w:t>
+        <w:t>Trong tổng số 224 cảnh báo sai còn lại, riêng nhóm lỗi hiển thị web (XSS) chiếm tới 115 ca. Nguyên nhân là toàn bộ bài kiểm tra đều dùng hàm mã hóa HTML trong các câu lệnh nối chuỗi nhiều dòng ở cuối hàm. Bộ nhận diện cũ của nhóm chỉ quét dòng đầu tiên nên bỏ sót hàm làm sạch này, dẫn đến việc báo sai hàng loạt ca an toàn.</w:t>
       </w:r>
     </w:p>
     <w:p>
@@ -1448,16 +1274,7 @@
         <w:pStyle w:val="ListBullet"/>
       </w:pPr>
       <w:r>
-        <w:t xml:space="preserve">Đối với họ XXE, Semgrep bắt bừa mọi dòng </w:t>
-      </w:r>
-      <w:r>
-        <w:rPr>
-          <w:rFonts w:ascii="Consolas" w:hAnsi="Consolas"/>
-        </w:rPr>
-        <w:t>import xml.dom.minidom</w:t>
-      </w:r>
-      <w:r>
-        <w:t xml:space="preserve"> (77 FP). Bộ lọc cũ thấy dòng import không có luồng dữ liệu nên dập tắt toàn bộ, làm mất luôn cả 8 ca lỗ hổng thật (Recall XXE về 0).</w:t>
+        <w:t>Đối với nhóm đọc tệp XML (XXE), bộ quét cơ sở cứ thấy lệnh nạp thư viện XML là báo lỗi (gây ra 77 ca báo sai). Bộ lọc cũ của nhóm thấy dòng nạp thư viện không có luồng dữ liệu nên hủy bỏ toàn bộ, dẫn đến việc vô tình làm mất luôn cả 8 ca có lỗ hổng thật.</w:t>
       </w:r>
     </w:p>
     <w:p>
@@ -1476,7 +1293,7 @@
         <w:pStyle w:val="ListBullet"/>
       </w:pPr>
       <w:r>
-        <w:t>Trong benchmark có nhiều mẫu gán bẫy hằng số (như đọc key cố định từ Dictionary hay ConfigParser). Nếu nhóm chỉ viết code để bắt đúng các tên biến này thì điểm số sẽ cao nhưng vô dụng trên mã nguồn thực tế của doanh nghiệp. Nhóm cần giải quyết ở mức trừu tượng hóa phân tích trường (Field-sensitive analysis).</w:t>
+        <w:t>Nhiều bài kiểm tra trong bộ dữ liệu chuẩn cài cắm các bẫy logic như đọc giá trị cố định từ từ điển hoặc tệp cấu hình. Nếu nhóm chỉ tìm cách bắt đúng các tên biến này thì điểm số sẽ rất cao trên bài kiểm thử nhưng lại không có tác dụng trên phần mềm thực tế của doanh nghiệp. Nhóm cần giải quyết vấn đề này ở mức theo dõi từng trường dữ liệu tổng quát.</w:t>
       </w:r>
     </w:p>
     <w:p>
@@ -1487,7 +1304,7 @@
         <w:rPr>
           <w:b/>
         </w:rPr>
-        <w:t>Bài toán đóng gói ngữ cảnh cho tác tử LLM:</w:t>
+        <w:t>Bài toán chi phí và độ trễ khi tích hợp AI:</w:t>
       </w:r>
     </w:p>
     <w:p>
@@ -1495,7 +1312,7 @@
         <w:pStyle w:val="ListBullet"/>
       </w:pPr>
       <w:r>
-        <w:t>Không thể đưa toàn bộ cây AST hay mã nguồn cả file vào prompt vì chi phí token lớn và độ trễ cao. Nhóm đang phải giải quyết bài toán trích xuất lát cắt mã nguồn tối thiểu (Slicing Context Window) chỉ chứa Source, Propagation path, Sanitizer và Sink để cung cấp cho tác tử.</w:t>
+        <w:t>Không thể gửi toàn bộ tệp mã nguồn vào cho AI đọc vì chi phí và thời gian phản hồi sẽ rất lớn. Nhóm đang phải hoàn thiện cơ chế chỉ trích xuất đúng lát cắt mã nguồn tối thiểu liên quan đến cảnh báo để cung cấp ngữ cảnh vừa đủ cho AI.</w:t>
       </w:r>
     </w:p>
     <w:p>
@@ -1506,7 +1323,7 @@
         <w:rPr>
           <w:b/>
         </w:rPr>
-        <w:t>Sự chênh lệch độ sâu phân tích giữa các ngôn ngữ:</w:t>
+        <w:t>Sự chênh lệch về độ sâu phân tích giữa các ngôn ngữ:</w:t>
       </w:r>
     </w:p>
     <w:p>
@@ -1514,7 +1331,7 @@
         <w:pStyle w:val="ListBullet"/>
       </w:pPr>
       <w:r>
-        <w:t>Lane Python hiện đi sâu nhất với DFG liên hàm và tóm tắt hàm. Trong khi đó, lane Java và JavaScript mới dừng ở mức phân tích cú pháp trong phạm vi file (intra-file), chưa có độ sâu tương đương.</w:t>
+        <w:t>Hiện tại lane Python được đầu tư sâu nhất về đồ thị luồng dữ liệu và phân tích liên tệp. Trong khi đó, lane Java và JavaScript mới dừng ở mức phân tích cú pháp trong phạm vi tệp đơn, chưa đạt được độ sâu tương đương.</w:t>
       </w:r>
     </w:p>
     <w:p>
@@ -1528,13 +1345,13 @@
         <w:pStyle w:val="Heading1"/>
       </w:pPr>
       <w:r>
-        <w:t>5. Kế Hoạch Triển Khai Trong Tuần Tiếp Theo</w:t>
+        <w:t>6. Kế Hoạch Triển Khai Trong Tuần Tiếp Theo</w:t>
       </w:r>
     </w:p>
     <w:p>
       <w:pPr/>
       <w:r>
-        <w:t>Dựa trên các khảo cứu quốc tế và kết quả đo đạc thực tế, nhóm dự kiến thực hiện các công việc sau trong tuần tới:</w:t>
+        <w:t>Dựa trên các nghiên cứu quốc tế và kết quả đo đạc thực tế, nhóm dự kiến tập trung vào các công việc sau trong tuần tới:</w:t>
       </w:r>
     </w:p>
     <w:p>
@@ -1545,7 +1362,7 @@
         <w:rPr>
           <w:b/>
         </w:rPr>
-        <w:t>Chuẩn hóa Taint Barrier cho XSS theo chuẩn OWASP:</w:t>
+        <w:t>Nâng cấp bộ nhận diện cơ chế làm sạch cho nhóm XSS:</w:t>
       </w:r>
     </w:p>
     <w:p>
@@ -1553,52 +1370,7 @@
         <w:pStyle w:val="ListBullet"/>
       </w:pPr>
       <w:r>
-        <w:t xml:space="preserve">Cập nhật hàm trích xuất Sanitizer trong </w:t>
-      </w:r>
-      <w:r>
-        <w:rPr>
-          <w:rFonts w:ascii="Consolas" w:hAnsi="Consolas"/>
-        </w:rPr>
-        <w:t>TaintBridge</w:t>
-      </w:r>
-      <w:r>
-        <w:t xml:space="preserve"> để phân tích đầy đủ biểu thức gán đa dòng, nhận diện chính xác các hàm mã hóa HTML (</w:t>
-      </w:r>
-      <w:r>
-        <w:rPr>
-          <w:rFonts w:ascii="Consolas" w:hAnsi="Consolas"/>
-        </w:rPr>
-        <w:t>escape_for_html</w:t>
-      </w:r>
-      <w:r>
-        <w:t xml:space="preserve">, </w:t>
-      </w:r>
-      <w:r>
-        <w:rPr>
-          <w:rFonts w:ascii="Consolas" w:hAnsi="Consolas"/>
-        </w:rPr>
-        <w:t>html.escape</w:t>
-      </w:r>
-      <w:r>
-        <w:t xml:space="preserve">, </w:t>
-      </w:r>
-      <w:r>
-        <w:rPr>
-          <w:rFonts w:ascii="Consolas" w:hAnsi="Consolas"/>
-        </w:rPr>
-        <w:t>markupsafe.escape</w:t>
-      </w:r>
-      <w:r>
-        <w:t xml:space="preserve">, </w:t>
-      </w:r>
-      <w:r>
-        <w:rPr>
-          <w:rFonts w:ascii="Consolas" w:hAnsi="Consolas"/>
-        </w:rPr>
-        <w:t>bleach.clean</w:t>
-      </w:r>
-      <w:r>
-        <w:t>), giải quyết triệt để 115 False Positive của họ XSS.</w:t>
+        <w:t>Cải tiến bộ quét để phân tích toàn bộ biểu thức ghép chuỗi nhiều dòng, nhận diện đầy đủ các hàm mã hóa HTML theo chuẩn an toàn, nhằm giải quyết triệt để 115 trường hợp báo sai của nhóm này.</w:t>
       </w:r>
     </w:p>
     <w:p>
@@ -1609,7 +1381,7 @@
         <w:rPr>
           <w:b/>
         </w:rPr>
-        <w:t>Triển khai kiểm tra cấu hình XXE theo chuẩn CodeQL `py/xxe`:</w:t>
+        <w:t>Bổ sung kiểm tra cấu hình parser cho nhóm XXE:</w:t>
       </w:r>
     </w:p>
     <w:p>
@@ -1617,34 +1389,7 @@
         <w:pStyle w:val="ListBullet"/>
       </w:pPr>
       <w:r>
-        <w:t xml:space="preserve">Bổ sung logic kiểm tra cờ cấu hình parser </w:t>
-      </w:r>
-      <w:r>
-        <w:rPr>
-          <w:rFonts w:ascii="Consolas" w:hAnsi="Consolas"/>
-        </w:rPr>
-        <w:t>feature_external_ges</w:t>
-      </w:r>
-      <w:r>
-        <w:t xml:space="preserve">: nếu không được bật </w:t>
-      </w:r>
-      <w:r>
-        <w:rPr>
-          <w:rFonts w:ascii="Consolas" w:hAnsi="Consolas"/>
-        </w:rPr>
-        <w:t>True</w:t>
-      </w:r>
-      <w:r>
-        <w:t xml:space="preserve"> (hoặc sử dụng </w:t>
-      </w:r>
-      <w:r>
-        <w:rPr>
-          <w:rFonts w:ascii="Consolas" w:hAnsi="Consolas"/>
-        </w:rPr>
-        <w:t>defusedxml</w:t>
-      </w:r>
-      <w:r>
-        <w:t>), hệ thống xác định parser an toàn theo mặc định và coi đây là Barrier hợp lệ. Mục tiêu khôi phục 100% Recall và triệt tiêu 77 False Positive của họ XXE.</w:t>
+        <w:t>Áp dụng đúng nguyên lý kiểm tra cấu hình an toàn: chỉ cảnh báo khi parser XML thực sự bật tính năng đọc thực thể ngoài và nhận dữ liệu chưa được kiểm soát. Mục tiêu là khôi phục đầy đủ các ca lỗi thật và loại bỏ 77 ca báo sai.</w:t>
       </w:r>
     </w:p>
     <w:p>
@@ -1655,7 +1400,7 @@
         <w:rPr>
           <w:b/>
         </w:rPr>
-        <w:t>Phân tích luồng dữ liệu theo trường (Field-Sensitive DFG):</w:t>
+        <w:t>Phân tích luồng dữ liệu theo từng trường (Field-Sensitive Analysis):</w:t>
       </w:r>
     </w:p>
     <w:p>
@@ -1663,25 +1408,7 @@
         <w:pStyle w:val="ListBullet"/>
       </w:pPr>
       <w:r>
-        <w:t>Theo dõi độc lập từng trường dữ liệu cho Dictionary (</w:t>
-      </w:r>
-      <w:r>
-        <w:rPr>
-          <w:rFonts w:ascii="Consolas" w:hAnsi="Consolas"/>
-        </w:rPr>
-        <w:t>map['key']</w:t>
-      </w:r>
-      <w:r>
-        <w:t>) và ConfigParser (</w:t>
-      </w:r>
-      <w:r>
-        <w:rPr>
-          <w:rFonts w:ascii="Consolas" w:hAnsi="Consolas"/>
-        </w:rPr>
-        <w:t>conf.get/set</w:t>
-      </w:r>
-      <w:r>
-        <w:t>) để phân biệt chính xác giữa giá trị an toàn và giá trị bị vấy bẩn.</w:t>
+        <w:t>Theo dõi độc lập từng khóa trong từ điển và tệp cấu hình để phân biệt chính xác giá trị nào an toàn và giá trị nào bị nhiễm độc từ bên ngoài.</w:t>
       </w:r>
     </w:p>
     <w:p>
@@ -1692,7 +1419,7 @@
         <w:rPr>
           <w:b/>
         </w:rPr>
-        <w:t>Thử nghiệm tích hợp Local LLM Runtime:</w:t>
+        <w:t>Thử nghiệm kết nối AI với mô hình chạy nội bộ:</w:t>
       </w:r>
     </w:p>
     <w:p>
@@ -1700,7 +1427,7 @@
         <w:pStyle w:val="ListBullet"/>
       </w:pPr>
       <w:r>
-        <w:t>Kết nối lớp Multi-Agent Triage với runtime cục bộ (Ollama / vLLM) chạy mô hình mã nguồn mở để đánh giá thực nghiệm về độ trễ, chi phí và chất lượng phản biện.</w:t>
+        <w:t>Thử nghiệm kết nối lớp phản biện AI với các mô hình mã nguồn mở chạy cục bộ để đánh giá chi phí, thời gian phản hồi và độ ổn định khi không phụ thuộc vào dịch vụ bên ngoài.</w:t>
       </w:r>
     </w:p>
     <w:p>
@@ -1711,7 +1438,7 @@
         <w:rPr>
           <w:b/>
         </w:rPr>
-        <w:t>Chuẩn bị báo cáo trực tiếp:</w:t>
+        <w:t>Chuẩn bị nội dung báo cáo trực tiếp:</w:t>
       </w:r>
     </w:p>
     <w:p>
@@ -1719,7 +1446,7 @@
         <w:pStyle w:val="ListBullet"/>
       </w:pPr>
       <w:r>
-        <w:t>Hoàn thiện kịch bản demo trực quan trên Web Dashboard để báo cáo tiến độ với Thầy trong buổi làm việc sắp tới.</w:t>
+        <w:t>Rà soát kịch bản trình diễn trên giao diện web để sẵn sàng báo cáo tiến độ và demo trực tiếp với Thầy.</w:t>
       </w:r>
     </w:p>
     <w:p>
@@ -1733,43 +1460,43 @@
         <w:pStyle w:val="Heading1"/>
       </w:pPr>
       <w:r>
-        <w:t>6. Kết Luận</w:t>
+        <w:t>7. Kết Luận</w:t>
       </w:r>
     </w:p>
     <w:p>
       <w:pPr/>
       <w:r>
-        <w:t xml:space="preserve">Trong giai đoạn vừa qua, nhóm đã chuyển thành công toàn bộ thực nghiệm sang </w:t>
+        <w:t xml:space="preserve">So với đợt báo cáo Tháng 9, đề tài đã có bước tiến thực chất: chuyển từ việc thử nghiệm nhỏ lẻ sang </w:t>
       </w:r>
       <w:r>
         <w:rPr>
           <w:b/>
         </w:rPr>
-        <w:t>bộ chuẩn mực quốc tế diện rộng 1,230 test cases</w:t>
+        <w:t>đo đạc thực tế trên toàn bộ 1,230 ca kiểm thử của chuẩn mực quốc tế OWASP Benchmark</w:t>
       </w:r>
       <w:r>
-        <w:t xml:space="preserve">, chứng minh bằng số liệu thực tế khả năng </w:t>
+        <w:t xml:space="preserve">, chứng minh được khả năng </w:t>
       </w:r>
       <w:r>
         <w:rPr>
           <w:b/>
         </w:rPr>
-        <w:t>triệt tiêu 65% - 89% cảnh báo giả</w:t>
+        <w:t>giảm từ 65% đến gần 90% cảnh báo sai</w:t>
       </w:r>
       <w:r>
-        <w:t xml:space="preserve"> của phương pháp lai ghép AST/DFG.</w:t>
+        <w:t xml:space="preserve"> của phương pháp lai ghép.</w:t>
       </w:r>
     </w:p>
     <w:p>
       <w:pPr/>
       <w:r>
-        <w:t>Nhóm kiên định đi theo các đặc tả kỹ thuật chuẩn mực của các hệ thống quốc tế (CodeQL, Semgrep Pro, VulAgent) nhằm đảm bảo công cụ có giá trị học thuật và khả năng ứng dụng thực tế, thay vì áp dụng các giải pháp chắp vá theo bài kiểm thử.</w:t>
+        <w:t>Nhóm kiên định bám sát các nguyên lý phân tích tĩnh chuẩn mực quốc tế để bảo đảm hệ thống có giá trị thực tiễn, thay vì chỉnh sửa đối phó theo bài kiểm thử.</w:t>
       </w:r>
     </w:p>
     <w:p>
       <w:pPr/>
       <w:r>
-        <w:t>Nhóm kính mong nhận được thêm các ý kiến nhận xét và định hướng của Thầy để hoàn thiện đề tài trong giai đoạn tiếp theo.</w:t>
+        <w:t>Nhóm kính mong tiếp tục nhận được những ý kiến nhận xét và định hướng của Thầy để hoàn thiện đề tài trong các giai đoạn tiếp theo.</w:t>
       </w:r>
     </w:p>
     <w:sectPr>

</xml_diff>

<commit_message>
docs(thesis): update October progress report focusing on Multi-Agent Hybrid SAST with pure black typography
</commit_message>
<xml_diff>
--- a/docs/thesis/90-bao-cao-tien-do-t10-gui-thay-2026-10-11.docx
+++ b/docs/thesis/90-bao-cao-tien-do-t10-gui-thay-2026-10-11.docx
@@ -7,6 +7,10 @@
         <w:pStyle w:val="Title"/>
       </w:pPr>
       <w:r>
+        <w:rPr>
+          <w:rFonts w:ascii="Times New Roman" w:hAnsi="Times New Roman"/>
+          <w:color w:val="000000"/>
+        </w:rPr>
         <w:t>Báo Cáo Tiến Độ Nghiên Cứu Đề Tài (Cập Nhật Tháng 10/2026)</w:t>
       </w:r>
     </w:p>
@@ -14,11 +18,17 @@
       <w:pPr/>
       <w:r>
         <w:rPr>
+          <w:rFonts w:ascii="Times New Roman" w:hAnsi="Times New Roman"/>
           <w:b/>
+          <w:color w:val="000000"/>
         </w:rPr>
         <w:t>Tên đề tài chính thức:</w:t>
       </w:r>
       <w:r>
+        <w:rPr>
+          <w:rFonts w:ascii="Times New Roman" w:hAnsi="Times New Roman"/>
+          <w:color w:val="000000"/>
+        </w:rPr>
         <w:t xml:space="preserve"> Nghiên cứu kiến trúc Multi-Agent Hybrid kết hợp AST truyền thống và Mô hình ngôn ngữ lớn (LLM) nhằm tối ưu hóa độ chính xác trong kiểm thử bảo mật mã nguồn</w:t>
       </w:r>
     </w:p>
@@ -26,11 +36,35 @@
       <w:pPr/>
       <w:r>
         <w:rPr>
+          <w:rFonts w:ascii="Times New Roman" w:hAnsi="Times New Roman"/>
           <w:b/>
+          <w:color w:val="000000"/>
+        </w:rPr>
+        <w:t>Hệ thống nghiên cứu và thực nghiệm:</w:t>
+      </w:r>
+      <w:r>
+        <w:rPr>
+          <w:rFonts w:ascii="Times New Roman" w:hAnsi="Times New Roman"/>
+          <w:color w:val="000000"/>
+        </w:rPr>
+        <w:t xml:space="preserve"> Aegis-SAST</w:t>
+      </w:r>
+    </w:p>
+    <w:p>
+      <w:pPr/>
+      <w:r>
+        <w:rPr>
+          <w:rFonts w:ascii="Times New Roman" w:hAnsi="Times New Roman"/>
+          <w:b/>
+          <w:color w:val="000000"/>
         </w:rPr>
         <w:t>Nhóm sinh viên thực hiện:</w:t>
       </w:r>
       <w:r>
+        <w:rPr>
+          <w:rFonts w:ascii="Times New Roman" w:hAnsi="Times New Roman"/>
+          <w:color w:val="000000"/>
+        </w:rPr>
         <w:t xml:space="preserve"> Trần Hoàng Phúc Quân, Phạm Thị Vân Ánh, Nguyễn Lê Đức Tuệ</w:t>
       </w:r>
     </w:p>
@@ -38,11 +72,17 @@
       <w:pPr/>
       <w:r>
         <w:rPr>
+          <w:rFonts w:ascii="Times New Roman" w:hAnsi="Times New Roman"/>
           <w:b/>
+          <w:color w:val="000000"/>
         </w:rPr>
         <w:t>Giảng viên hướng dẫn:</w:t>
       </w:r>
       <w:r>
+        <w:rPr>
+          <w:rFonts w:ascii="Times New Roman" w:hAnsi="Times New Roman"/>
+          <w:color w:val="000000"/>
+        </w:rPr>
         <w:t xml:space="preserve"> Kính gửi Thầy hướng dẫn đề tài tốt nghiệp</w:t>
       </w:r>
     </w:p>
@@ -50,11 +90,17 @@
       <w:pPr/>
       <w:r>
         <w:rPr>
+          <w:rFonts w:ascii="Times New Roman" w:hAnsi="Times New Roman"/>
           <w:b/>
+          <w:color w:val="000000"/>
         </w:rPr>
         <w:t>Kho lưu trữ mã nguồn:</w:t>
       </w:r>
       <w:r>
+        <w:rPr>
+          <w:rFonts w:ascii="Times New Roman" w:hAnsi="Times New Roman"/>
+          <w:color w:val="000000"/>
+        </w:rPr>
         <w:t xml:space="preserve"> https://github.com/PhucQuan/MultiAgent-SAST</w:t>
       </w:r>
     </w:p>
@@ -62,17 +108,27 @@
       <w:pPr/>
       <w:r>
         <w:rPr>
+          <w:rFonts w:ascii="Times New Roman" w:hAnsi="Times New Roman"/>
           <w:b/>
+          <w:color w:val="000000"/>
         </w:rPr>
         <w:t>Ngày báo cáo:</w:t>
       </w:r>
       <w:r>
+        <w:rPr>
+          <w:rFonts w:ascii="Times New Roman" w:hAnsi="Times New Roman"/>
+          <w:color w:val="000000"/>
+        </w:rPr>
         <w:t xml:space="preserve"> 11/10/2026</w:t>
       </w:r>
     </w:p>
     <w:p>
       <w:pPr/>
       <w:r>
+        <w:rPr>
+          <w:rFonts w:ascii="Times New Roman" w:hAnsi="Times New Roman"/>
+          <w:color w:val="000000"/>
+        </w:rPr>
         <w:t>---</w:t>
       </w:r>
     </w:p>
@@ -81,13 +137,21 @@
         <w:pStyle w:val="Heading1"/>
       </w:pPr>
       <w:r>
+        <w:rPr>
+          <w:rFonts w:ascii="Times New Roman" w:hAnsi="Times New Roman"/>
+          <w:color w:val="000000"/>
+        </w:rPr>
         <w:t>1. Mục Đích Của Bản Báo Cáo</w:t>
       </w:r>
     </w:p>
     <w:p>
       <w:pPr/>
       <w:r>
-        <w:t>Bản báo cáo này tiếp nối Đề cương cập nhật Tháng 9, nhằm trình bày với Thầy những kết quả nghiên cứu và thực nghiệm mới nhất của nhóm trong hai tuần đầu Tháng 10. Trọng tâm của giai đoạn này là:</w:t>
+        <w:rPr>
+          <w:rFonts w:ascii="Times New Roman" w:hAnsi="Times New Roman"/>
+          <w:color w:val="000000"/>
+        </w:rPr>
+        <w:t>Bản báo cáo này tiếp nối Đề cương nghiên cứu cập nhật Tháng 9/2026, nhằm báo cáo với Thầy tiến độ nghiên cứu lý thuyết và kết quả thực nghiệm của nhóm trong nửa đầu Tháng 10/2026. Trọng tâm của giai đoạn này tập trung vào các mục tiêu:</w:t>
       </w:r>
     </w:p>
     <w:p>
@@ -95,7 +159,19 @@
         <w:pStyle w:val="ListNumber"/>
       </w:pPr>
       <w:r>
-        <w:t>Chuyển từ việc kiểm thử trên các tệp mẫu thu nhỏ sang đo đạc diện rộng trên toàn bộ 1,230 ca kiểm thử của bộ dữ liệu chuẩn quốc tế OWASP Benchmark cho Python.</w:t>
+        <w:rPr>
+          <w:rFonts w:ascii="Times New Roman" w:hAnsi="Times New Roman"/>
+          <w:b/>
+          <w:color w:val="000000"/>
+        </w:rPr>
+        <w:t>Làm rõ cơ sở lý thuyết và định vị học thuật:</w:t>
+      </w:r>
+      <w:r>
+        <w:rPr>
+          <w:rFonts w:ascii="Times New Roman" w:hAnsi="Times New Roman"/>
+          <w:color w:val="000000"/>
+        </w:rPr>
+        <w:t xml:space="preserve"> Phân tích các công trình nghiên cứu quốc tế mới nhất (giai đoạn 2025–2026) về việc ứng dụng kiến trúc đa tác tử (Multi-Agent) trong kiểm thử an toàn phần mềm, từ đó định hình kiến trúc lai ghép (Hybrid Architecture) của đề tài.</w:t>
       </w:r>
     </w:p>
     <w:p>
@@ -103,7 +179,19 @@
         <w:pStyle w:val="ListNumber"/>
       </w:pPr>
       <w:r>
-        <w:t>Thực hiện đo đạc cắt lớp độc lập để chứng minh bằng số liệu vai trò của từng tầng kỹ thuật trong việc nâng cao độ chính xác và giảm thiểu cảnh báo sai.</w:t>
+        <w:rPr>
+          <w:rFonts w:ascii="Times New Roman" w:hAnsi="Times New Roman"/>
+          <w:b/>
+          <w:color w:val="000000"/>
+        </w:rPr>
+        <w:t>Chi tiết hóa cơ chế phối hợp Đa tác tử (Multi-Agent Hypothesis-Validation):</w:t>
+      </w:r>
+      <w:r>
+        <w:rPr>
+          <w:rFonts w:ascii="Times New Roman" w:hAnsi="Times New Roman"/>
+          <w:color w:val="000000"/>
+        </w:rPr>
+        <w:t xml:space="preserve"> Trình bày mô hình tương tác giữa bộ phân tích tĩnh tất định và cụm ba tác tử (Auditor - Skeptic - Judge) nhằm triệt tiêu hiện tượng ảo giác của mô hình ngôn ngữ và cắt giảm cảnh báo sai.</w:t>
       </w:r>
     </w:p>
     <w:p>
@@ -111,7 +199,19 @@
         <w:pStyle w:val="ListNumber"/>
       </w:pPr>
       <w:r>
-        <w:t>Hoàn thiện giao diện web tương tác để phục vụ kịch bản trình diễn và chuẩn bị cho buổi báo cáo trực tiếp với Thầy.</w:t>
+        <w:rPr>
+          <w:rFonts w:ascii="Times New Roman" w:hAnsi="Times New Roman"/>
+          <w:b/>
+          <w:color w:val="000000"/>
+        </w:rPr>
+        <w:t>Báo cáo kết quả đo đạc thực nghiệm diện rộng:</w:t>
+      </w:r>
+      <w:r>
+        <w:rPr>
+          <w:rFonts w:ascii="Times New Roman" w:hAnsi="Times New Roman"/>
+          <w:color w:val="000000"/>
+        </w:rPr>
+        <w:t xml:space="preserve"> Thực hiện đánh giá khách quan trên toàn bộ 1,230 ca kiểm thử của bộ dữ liệu chuẩn quốc tế OWASP Benchmark cho ngôn ngữ Python, cùng nghiên cứu cắt lớp (Ablation Study) nhằm chứng minh vai trò độc lập của từng tầng kỹ thuật.</w:t>
       </w:r>
     </w:p>
     <w:p>
@@ -119,12 +219,28 @@
         <w:pStyle w:val="ListNumber"/>
       </w:pPr>
       <w:r>
-        <w:t>Trình bày trung thực các khó khăn kỹ thuật khi mở rộng độ bao phủ, đồng thời làm rõ định hướng giải quyết theo chuẩn công nghiệp thay vì tinh chỉnh cục bộ theo bài kiểm thử.</w:t>
+        <w:rPr>
+          <w:rFonts w:ascii="Times New Roman" w:hAnsi="Times New Roman"/>
+          <w:b/>
+          <w:color w:val="000000"/>
+        </w:rPr>
+        <w:t>Trình bày trung thực các hạn chế kỹ thuật và định hướng giải quyết:</w:t>
+      </w:r>
+      <w:r>
+        <w:rPr>
+          <w:rFonts w:ascii="Times New Roman" w:hAnsi="Times New Roman"/>
+          <w:color w:val="000000"/>
+        </w:rPr>
+        <w:t xml:space="preserve"> Báo cáo các rào cản kỹ thuật gặp phải khi mở rộng phân tích ra các nhóm lỗ hổng phức tạp và kế hoạch nghiên cứu trong các tuần tiếp theo.</w:t>
       </w:r>
     </w:p>
     <w:p>
       <w:pPr/>
       <w:r>
+        <w:rPr>
+          <w:rFonts w:ascii="Times New Roman" w:hAnsi="Times New Roman"/>
+          <w:color w:val="000000"/>
+        </w:rPr>
         <w:t>---</w:t>
       </w:r>
     </w:p>
@@ -133,13 +249,31 @@
         <w:pStyle w:val="Heading1"/>
       </w:pPr>
       <w:r>
-        <w:t>2. Khảo Cứu Các Giải Pháp Quốc Tế Và Hướng Tiếp Cận Của Nhóm</w:t>
+        <w:rPr>
+          <w:rFonts w:ascii="Times New Roman" w:hAnsi="Times New Roman"/>
+          <w:color w:val="000000"/>
+        </w:rPr>
+        <w:t>2. Khảo Cứu Các Giải Pháp Quốc Tế Và Hướng Tiếp Cận Của Đề Tài</w:t>
       </w:r>
     </w:p>
     <w:p>
       <w:pPr/>
       <w:r>
-        <w:t>Để giải quyết bài toán giảm cảnh báo sai mà không đánh mất cảnh báo thật, nhóm đã tìm hiểu cách các nền tảng phân tích tĩnh hàng đầu thế giới đang xử lý vấn đề này:</w:t>
+        <w:rPr>
+          <w:rFonts w:ascii="Times New Roman" w:hAnsi="Times New Roman"/>
+          <w:color w:val="000000"/>
+        </w:rPr>
+        <w:t>Kiểm thử bảo mật tĩnh (SAST) truyền thống đang gặp phải một nghịch lý lớn: nếu chỉ quét dựa trên mẫu cú pháp bề mặt, công cụ sẽ sinh ra hàng nghìn cảnh báo giả do không hiểu được luồng dữ liệu và cơ chế bảo vệ của framework; ngược lại, nếu phụ thuộc hoàn toàn vào các mô hình ngôn ngữ lớn (LLM) theo dạng truy vấn trực tiếp (Single-prompt), hệ thống sẽ gặp hiện tượng ảo giác, thiếu tính tất định và không thể mở rộng trên các kho mã nguồn doanh nghiệp quy mô lớn.</w:t>
+      </w:r>
+    </w:p>
+    <w:p>
+      <w:pPr/>
+      <w:r>
+        <w:rPr>
+          <w:rFonts w:ascii="Times New Roman" w:hAnsi="Times New Roman"/>
+          <w:color w:val="000000"/>
+        </w:rPr>
+        <w:t>Để giải quyết bài toán này, nhóm đã khảo cứu các công trình nghiên cứu học thuật và giải pháp công nghiệp hàng đầu thế giới:</w:t>
       </w:r>
     </w:p>
     <w:p>
@@ -147,13 +281,11 @@
         <w:pStyle w:val="Heading2"/>
       </w:pPr>
       <w:r>
-        <w:t>2.1. Cách tiếp cận của GitHub CodeQL</w:t>
-      </w:r>
-    </w:p>
-    <w:p>
-      <w:pPr/>
-      <w:r>
-        <w:t>CodeQL là công cụ phân tích tĩnh tiêu biểu hiện nay với khả năng theo dõi luồng vấy bẩn xuyên suốt mã nguồn. Điểm mấu chốt trong thiết kế của CodeQL là cơ chế điểm chặn (Barrier):</w:t>
+        <w:rPr>
+          <w:rFonts w:ascii="Times New Roman" w:hAnsi="Times New Roman"/>
+          <w:color w:val="000000"/>
+        </w:rPr>
+        <w:t>2.1. Các công trình học thuật quốc tế mới nhất về Multi-Agent SAST (2025–2026)</w:t>
       </w:r>
     </w:p>
     <w:p>
@@ -161,7 +293,22 @@
         <w:pStyle w:val="ListBullet"/>
       </w:pPr>
       <w:r>
-        <w:t>Một đường dẫn dữ liệu chỉ bị coi là nguy hiểm khi đi từ đầu vào của người dùng đến điểm thực thi nhạy cảm mà không gặp bất kỳ cơ chế bảo vệ nào.</w:t>
+        <w:rPr>
+          <w:rFonts w:ascii="Times New Roman" w:hAnsi="Times New Roman"/>
+          <w:b/>
+          <w:color w:val="000000"/>
+        </w:rPr>
+        <w:t>Argus (arXiv:2411.08332 / 2025–2026) - Tái cấu trúc phân tích tĩnh bằng liên minh đa tác tử (Reorchestrating Static Analysis via a Multi-Agent Ensemble):</w:t>
+      </w:r>
+    </w:p>
+    <w:p>
+      <w:pPr/>
+      <w:r>
+        <w:rPr>
+          <w:rFonts w:ascii="Times New Roman" w:hAnsi="Times New Roman"/>
+          <w:color w:val="000000"/>
+        </w:rPr>
+        <w:t>Công trình Argus chỉ ra rằng việc sử dụng LLM như một công cụ hỗ trợ thụ động bên ngoài không mang lại hiệu quả cao. Argus đề xuất chuyển dịch toàn bộ luồng kiểm thử sang kiến trúc đa tác tử phối hợp, trong đó các tác tử chuyên biệt đảm nhận từng nhiệm vụ: tác tử trinh sát cú pháp, tác tử suy luận ngữ cảnh chuỗi cung ứng và tác tử tổng hợp phản biện. Cách tiếp cận này giúp giảm đáng kể tỷ lệ cảnh báo sai và khắc phục điểm mù ngữ cảnh của các công cụ SAST cổ điển.</w:t>
       </w:r>
     </w:p>
     <w:p>
@@ -169,7 +316,22 @@
         <w:pStyle w:val="ListBullet"/>
       </w:pPr>
       <w:r>
-        <w:t>Nếu trên đường đi, dữ liệu đã được làm sạch bằng các hàm mã hóa an toàn, được ép sang kiểu dữ liệu an toàn (như số nguyên, số thực), hoặc đi qua các câu lệnh kiểm tra điều kiện hợp lệ, CodeQL sẽ coi đó là một điểm chặn và tự động hủy bỏ cảnh báo.</w:t>
+        <w:rPr>
+          <w:rFonts w:ascii="Times New Roman" w:hAnsi="Times New Roman"/>
+          <w:b/>
+          <w:color w:val="000000"/>
+        </w:rPr>
+        <w:t>VulAgent (ACL 2026) - Cơ chế đối kháng Giả thuyết - Kiểm chứng (Hypothesis-Validation Paradigm):</w:t>
+      </w:r>
+    </w:p>
+    <w:p>
+      <w:pPr/>
+      <w:r>
+        <w:rPr>
+          <w:rFonts w:ascii="Times New Roman" w:hAnsi="Times New Roman"/>
+          <w:color w:val="000000"/>
+        </w:rPr>
+        <w:t>Công trình VulAgent được công bố tại Hội nghị ACL 2026 đã mô hình hóa quy trình kiểm toán mã nguồn tương tự chuyên gia con người. Thay vì hỏi mô hình một câu hỏi định tính chung chung, VulAgent chia quy trình thành hai bước đối kháng: Tác tử lập giả thuyết (Hypothesis Agent) đưa ra các kịch bản kích hoạt lỗ hổng cụ thể kèm điều kiện tiên quyết, sau đó Tác tử kiểm chứng (Validation Agent) rà soát ngữ cảnh mã nguồn để tìm kiếm các bằng chứng xác thực hoặc bác bỏ. Kết quả thực nghiệm của VulAgent chứng minh phương pháp này giúp giảm tới 36% tỷ lệ cảnh báo sai so với các phương pháp LLM đơn lẻ.</w:t>
       </w:r>
     </w:p>
     <w:p>
@@ -177,7 +339,22 @@
         <w:pStyle w:val="ListBullet"/>
       </w:pPr>
       <w:r>
-        <w:t>Với các lỗi liên quan đến cấu hình như đọc tệp XML, CodeQL không báo lỗi bừa bãi khi thấy lệnh đọc XML, mà kiểm tra xem parser có bị bật tính năng cho phép đọc thực thể ngoài hay không. Nếu parser ở trạng thái an toàn mặc định, công cụ sẽ không gắn cờ cảnh báo.</w:t>
+        <w:rPr>
+          <w:rFonts w:ascii="Times New Roman" w:hAnsi="Times New Roman"/>
+          <w:b/>
+          <w:color w:val="000000"/>
+        </w:rPr>
+        <w:t>SemTaint (2025–2026) - Kết hợp phân tích vấy bẩn tất định với LLM phẫu thuật ngữ cảnh:</w:t>
+      </w:r>
+    </w:p>
+    <w:p>
+      <w:pPr/>
+      <w:r>
+        <w:rPr>
+          <w:rFonts w:ascii="Times New Roman" w:hAnsi="Times New Roman"/>
+          <w:color w:val="000000"/>
+        </w:rPr>
+        <w:t>SemTaint xác lập một nguyên lý quan trọng: Phân tích tĩnh truyền thống (như CodeQL) phải đóng vai trò là nguồn chân lý về cấu trúc mã nguồn (Source of Truth for Structural Facts), trong khi các tác tử LLM chỉ được kích hoạt để thực hiện suy luận cục bộ (Surgical Reasoning) tại các vị trí mà phân tích tĩnh bị hạn chế (như luồng dữ liệu qua thư viện bên thứ ba hoặc suy diễn hành vi hàm ẩn).</w:t>
       </w:r>
     </w:p>
     <w:p>
@@ -185,13 +362,11 @@
         <w:pStyle w:val="Heading2"/>
       </w:pPr>
       <w:r>
-        <w:t>2.2. Cách tiếp cận của Meta (Pysa và Zoncolan)</w:t>
-      </w:r>
-    </w:p>
-    <w:p>
-      <w:pPr/>
-      <w:r>
-        <w:t>Meta giải quyết bài toán phân tích mã nguồn quy mô lớn bằng phương pháp tách rời giữa bộ quét chính và các tệp mô hình hóa hành vi của framework:</w:t>
+        <w:rPr>
+          <w:rFonts w:ascii="Times New Roman" w:hAnsi="Times New Roman"/>
+          <w:color w:val="000000"/>
+        </w:rPr>
+        <w:t>2.2. Các cơ chế chuẩn mực trong các hệ thống công nghiệp lớn</w:t>
       </w:r>
     </w:p>
     <w:p>
@@ -199,7 +374,22 @@
         <w:pStyle w:val="ListBullet"/>
       </w:pPr>
       <w:r>
-        <w:t>Thay vì viết cứng các quy tắc nhận diện vào lõi quét, họ định nghĩa sẵn các đặc tả về cách các framework web tự động bảo vệ dữ liệu (ví dụ như cơ chế tự động mã hóa chuỗi khi xuất ra giao diện hay cơ chế chống tấn công cơ sở dữ liệu của ORM).</w:t>
+        <w:rPr>
+          <w:rFonts w:ascii="Times New Roman" w:hAnsi="Times New Roman"/>
+          <w:b/>
+          <w:color w:val="000000"/>
+        </w:rPr>
+        <w:t>GitHub CodeQL (Cơ chế Taint Barrier và Sanitizer Predicates):</w:t>
+      </w:r>
+    </w:p>
+    <w:p>
+      <w:pPr/>
+      <w:r>
+        <w:rPr>
+          <w:rFonts w:ascii="Times New Roman" w:hAnsi="Times New Roman"/>
+          <w:color w:val="000000"/>
+        </w:rPr>
+        <w:t>CodeQL áp dụng nguyên lý theo dõi luồng vấy bẩn chặt chẽ dựa trên logic vị ngữ. Một đường dẫn chỉ được kết luận là lỗ hổng khi dữ liệu từ đầu vào của người dùng (Source) truyền đến điểm thực thi nhạy cảm (Sink) mà không đi qua bất kỳ điểm chặn hợp lệ nào (Barrier). Nếu dữ liệu đã đi qua hàm ép kiểu an toàn, hàm mã hóa hoặc câu lệnh kiểm tra điều kiện bảo vệ (Guard clause), đường dẫn đó lập tức bị triệt tiêu cảnh báo.</w:t>
       </w:r>
     </w:p>
     <w:p>
@@ -207,7 +397,45 @@
         <w:pStyle w:val="ListBullet"/>
       </w:pPr>
       <w:r>
-        <w:t>Khi bộ quét phân tích mã nguồn, nó áp dụng các mô hình này để biết đoạn mã nào đã được framework che chở an toàn, từ đó loại bỏ hàng loạt cảnh báo giả.</w:t>
+        <w:rPr>
+          <w:rFonts w:ascii="Times New Roman" w:hAnsi="Times New Roman"/>
+          <w:b/>
+          <w:color w:val="000000"/>
+        </w:rPr>
+        <w:t>Meta Pysa và Zoncolan (Nguyên lý Models-as-Data):</w:t>
+      </w:r>
+    </w:p>
+    <w:p>
+      <w:pPr/>
+      <w:r>
+        <w:rPr>
+          <w:rFonts w:ascii="Times New Roman" w:hAnsi="Times New Roman"/>
+          <w:color w:val="000000"/>
+        </w:rPr>
+        <w:t>Meta giải quyết bài toán quét mã nguồn quy mô lớn bằng cách mô hình hóa tri thức framework (Framework Modeling) thành các tệp đặc tả độc lập với lõi quét. Nhờ đó, công cụ nhận biết được các cơ chế bảo vệ ngầm định của framework (như ORM tự động chống SQL Injection hay Template Engine tự động mã hóa đầu ra chống XSS) và không báo lỗi sai trên các đoạn mã đã được bảo vệ.</w:t>
+      </w:r>
+    </w:p>
+    <w:p>
+      <w:pPr>
+        <w:pStyle w:val="ListBullet"/>
+      </w:pPr>
+      <w:r>
+        <w:rPr>
+          <w:rFonts w:ascii="Times New Roman" w:hAnsi="Times New Roman"/>
+          <w:b/>
+          <w:color w:val="000000"/>
+        </w:rPr>
+        <w:t>Snyk DeepCode và Semgrep Pro (Phân tích khả năng kích hoạt - Deep Reachability):</w:t>
+      </w:r>
+    </w:p>
+    <w:p>
+      <w:pPr/>
+      <w:r>
+        <w:rPr>
+          <w:rFonts w:ascii="Times New Roman" w:hAnsi="Times New Roman"/>
+          <w:color w:val="000000"/>
+        </w:rPr>
+        <w:t>Các giải pháp thương mại hiện đại tập trung vào việc dựng đồ thị liên kết từ các điểm tiếp nhận yêu cầu công khai (Public Entrypoints như API Controller, Route) xuyên qua các tầng nghiệp vụ đến điểm nhạy cảm. Những đoạn mã chết (Unreachable Code) hoặc các hàm nội bộ không có đường dẫn kích hoạt từ bên ngoài sẽ được hạ mức ưu tiên hoặc gắn nhãn nội bộ, tránh làm quá tải đội ngũ lập trình viên.</w:t>
       </w:r>
     </w:p>
     <w:p>
@@ -215,13 +443,36 @@
         <w:pStyle w:val="Heading2"/>
       </w:pPr>
       <w:r>
-        <w:t>2.3. Các nghiên cứu học thuật mới về Multi-Agent SAST (2025–2026)</w:t>
+        <w:rPr>
+          <w:rFonts w:ascii="Times New Roman" w:hAnsi="Times New Roman"/>
+          <w:color w:val="000000"/>
+        </w:rPr>
+        <w:t>2.3. Định vị hướng tiếp cận của đề tài Aegis-SAST</w:t>
       </w:r>
     </w:p>
     <w:p>
       <w:pPr/>
       <w:r>
-        <w:t>Các công trình nghiên cứu quốc tế mới nhất (như VulAgent, VulnDetect AI) chỉ ra rằng:</w:t>
+        <w:rPr>
+          <w:rFonts w:ascii="Times New Roman" w:hAnsi="Times New Roman"/>
+          <w:color w:val="000000"/>
+        </w:rPr>
+        <w:t xml:space="preserve">Kế thừa những phát hiện trên, đề tài của nhóm lựa chọn hướng đi </w:t>
+      </w:r>
+      <w:r>
+        <w:rPr>
+          <w:rFonts w:ascii="Times New Roman" w:hAnsi="Times New Roman"/>
+          <w:b/>
+          <w:color w:val="000000"/>
+        </w:rPr>
+        <w:t>Kiến trúc Multi-Agent Hybrid</w:t>
+      </w:r>
+      <w:r>
+        <w:rPr>
+          <w:rFonts w:ascii="Times New Roman" w:hAnsi="Times New Roman"/>
+          <w:color w:val="000000"/>
+        </w:rPr>
+        <w:t>:</w:t>
       </w:r>
     </w:p>
     <w:p>
@@ -229,7 +480,26 @@
         <w:pStyle w:val="ListBullet"/>
       </w:pPr>
       <w:r>
-        <w:t>Việc đưa mã nguồn vào AI và hỏi chung chung "đoạn code này có lỗi hay không" thường cho kết quả kém, AI rất dễ đoán mò và sinh ra nhận định sai lệch.</w:t>
+        <w:rPr>
+          <w:rFonts w:ascii="Times New Roman" w:hAnsi="Times New Roman"/>
+          <w:color w:val="000000"/>
+        </w:rPr>
+        <w:t xml:space="preserve">Không thay thế phân tích tĩnh bằng LLM, mà lấy </w:t>
+      </w:r>
+      <w:r>
+        <w:rPr>
+          <w:rFonts w:ascii="Times New Roman" w:hAnsi="Times New Roman"/>
+          <w:b/>
+          <w:color w:val="000000"/>
+        </w:rPr>
+        <w:t>Bộ phân tích tĩnh tất định (AST và DFG Taint Core)</w:t>
+      </w:r>
+      <w:r>
+        <w:rPr>
+          <w:rFonts w:ascii="Times New Roman" w:hAnsi="Times New Roman"/>
+          <w:color w:val="000000"/>
+        </w:rPr>
+        <w:t xml:space="preserve"> làm móng vững chắc để bảo đảm tốc độ và độ bao phủ cấu trúc.</w:t>
       </w:r>
     </w:p>
     <w:p>
@@ -237,21 +507,26 @@
         <w:pStyle w:val="ListBullet"/>
       </w:pPr>
       <w:r>
-        <w:t>Giải pháp hiệu quả là tổ chức AI theo quy trình phản biện hai chiều: một tác tử đóng vai trò người kiểm tra đưa ra giả thuyết tấn công cụ thể, một tác tử đóng vai trò phản biện đi tìm các bằng chứng phòng vệ để chứng minh code an toàn, và một tác tử trọng tài đứng giữa phân xử dựa trên bằng chứng kỹ thuật rõ ràng.</w:t>
+        <w:rPr>
+          <w:rFonts w:ascii="Times New Roman" w:hAnsi="Times New Roman"/>
+          <w:color w:val="000000"/>
+        </w:rPr>
+        <w:t xml:space="preserve">Không để LLM đoán mò tự do, mà trích xuất </w:t>
       </w:r>
-    </w:p>
-    <w:p>
-      <w:pPr>
-        <w:pStyle w:val="Heading2"/>
-      </w:pPr>
       <w:r>
-        <w:t>2.4. Hướng tiếp cận của Aegis-SAST</w:t>
+        <w:rPr>
+          <w:rFonts w:ascii="Times New Roman" w:hAnsi="Times New Roman"/>
+          <w:b/>
+          <w:color w:val="000000"/>
+        </w:rPr>
+        <w:t>Gói bằng chứng kỹ thuật (Evidence Bundle)</w:t>
       </w:r>
-    </w:p>
-    <w:p>
-      <w:pPr/>
       <w:r>
-        <w:t>Từ các nghiên cứu trên, nhóm định vị hướng đi của đề tài:</w:t>
+        <w:rPr>
+          <w:rFonts w:ascii="Times New Roman" w:hAnsi="Times New Roman"/>
+          <w:color w:val="000000"/>
+        </w:rPr>
+        <w:t xml:space="preserve"> từ đồ thị luồng dữ liệu để làm ngữ cảnh chuẩn xác cho AI.</w:t>
       </w:r>
     </w:p>
     <w:p>
@@ -259,28 +534,35 @@
         <w:pStyle w:val="ListBullet"/>
       </w:pPr>
       <w:r>
-        <w:t>Lấy phân tích tĩnh làm nền tảng cốt lõi: dùng cây cú pháp và đồ thị luồng dữ liệu để lần vết chính xác đường đi của dữ liệu.</w:t>
+        <w:rPr>
+          <w:rFonts w:ascii="Times New Roman" w:hAnsi="Times New Roman"/>
+          <w:color w:val="000000"/>
+        </w:rPr>
+        <w:t xml:space="preserve">Áp dụng </w:t>
       </w:r>
-    </w:p>
-    <w:p>
-      <w:pPr>
-        <w:pStyle w:val="ListBullet"/>
-      </w:pPr>
       <w:r>
-        <w:t>Kế thừa cơ chế điểm chặn để nhận diện các vị trí dữ liệu đã được bảo vệ hợp lệ, từ đó tự động triệt tiêu cảnh báo rác.</w:t>
+        <w:rPr>
+          <w:rFonts w:ascii="Times New Roman" w:hAnsi="Times New Roman"/>
+          <w:b/>
+          <w:color w:val="000000"/>
+        </w:rPr>
+        <w:t>Quy trình phản biện đa tác tử (Auditor - Skeptic - Judge)</w:t>
       </w:r>
-    </w:p>
-    <w:p>
-      <w:pPr>
-        <w:pStyle w:val="ListBullet"/>
-      </w:pPr>
       <w:r>
-        <w:t>Đặt các tác tử AI ở lớp đánh giá lại phía trên để phản biện theo bằng chứng kỹ thuật, giải thích nguyên nhân và đề xuất phương án sửa lỗi, thay vì để AI thay thế hoàn toàn bộ quét tĩnh.</w:t>
+        <w:rPr>
+          <w:rFonts w:ascii="Times New Roman" w:hAnsi="Times New Roman"/>
+          <w:color w:val="000000"/>
+        </w:rPr>
+        <w:t xml:space="preserve"> theo nguyên lý đối kháng có bằng chứng của VulAgent để đưa ra kết luận phân loại cuối cùng và gợi ý bản vá an toàn.</w:t>
       </w:r>
     </w:p>
     <w:p>
       <w:pPr/>
       <w:r>
+        <w:rPr>
+          <w:rFonts w:ascii="Times New Roman" w:hAnsi="Times New Roman"/>
+          <w:color w:val="000000"/>
+        </w:rPr>
         <w:t>---</w:t>
       </w:r>
     </w:p>
@@ -289,13 +571,182 @@
         <w:pStyle w:val="Heading1"/>
       </w:pPr>
       <w:r>
-        <w:t>3. Những Công Việc Nhóm Đã Hoàn Thành Trong Tuần Qua</w:t>
+        <w:rPr>
+          <w:rFonts w:ascii="Times New Roman" w:hAnsi="Times New Roman"/>
+          <w:color w:val="000000"/>
+        </w:rPr>
+        <w:t>3. Kiến Trúc Multi-Agent Hybrid Của Hệ Thống Aegis-SAST</w:t>
       </w:r>
     </w:p>
     <w:p>
       <w:pPr/>
       <w:r>
-        <w:t>Trong tuần vừa qua, nhóm đã hoàn thành 4 công việc chính:</w:t>
+        <w:rPr>
+          <w:rFonts w:ascii="Times New Roman" w:hAnsi="Times New Roman"/>
+          <w:color w:val="000000"/>
+        </w:rPr>
+        <w:t>Hệ thống Aegis-SAST được xây dựng theo mô hình hai phân hệ phối hợp đồng bộ:</w:t>
+      </w:r>
+    </w:p>
+    <w:p>
+      <w:pPr/>
+      <w:r>
+        <w:rPr>
+          <w:rFonts w:ascii="Consolas" w:hAnsi="Consolas"/>
+          <w:color w:val="000000"/>
+        </w:rPr>
+      </w:r>
+      <w:r>
+        <w:rPr>
+          <w:rFonts w:ascii="Consolas" w:hAnsi="Consolas"/>
+          <w:color w:val="000000"/>
+        </w:rPr>
+        <w:t xml:space="preserve"> [Mã nguồn dự án] │ ▼ ┌─────────────────────────────────────────────────────────────┐ │ PHÂN HỆ 1: LÕI PHÂN TÍCH TĨNH TẤT ĐỊNH (AST/DFG CORE)      │ │  - Phân tích cú pháp cây AST đa ngôn ngữ (Tree-sitter)      │ │  - Dựng đồ thị luồng dữ liệu nội tệp &amp; liên tệp (DFG)       │ │  - Nhận diện ranh giới điểm chặn &amp; thư viện phòng vệ        │ │  - Trích xuất lát cắt chương trình (Program Slicing)       │ └──────────────────────────────┬──────────────────────────────┘ │ Gói bằng chứng (Evidence Bundle) ▼ ┌─────────────────────────────────────────────────────────────┐ │ PHÂN HỆ 2: CỤM ĐA TÁC TỬ THẨM ĐỊNH BẰNG CHỨNG (MULTI-AGENT) │ │                                                             │ │   ┌─────────────────────┐       ┌──────────────────────┐    │ │   │   Auditor Agent     │       │    Skeptic Agent     │    │ │   │ (Tác tử Kiểm toán)  │◄─────►│  (Tác tử Phản biện)  │    │ │   │ - Đặt giả thuyết    │ Tranh │ - Tìm bằng chứng gỡ  │    │ │   │   tấn công cụ thể   │ luận  │   (Sanitizer/Guard)  │    │ │   └──────────┬──────────┘       └──────────┬───────────┘    │ │              │                             │                │ │              └──────────────┬──────────────┘                │ │                             │ Đối chiếu Sổ cái bằng chứng   │ │                             ▼                               │ │                 ┌───────────────────────┐                   │ │                 │      Judge Agent      │                   │ │                 │   (Tác tử Trọng tài)  │                   │ │                 │ - Ra phán quyết TP/FP │                   │ │                 │ - Đề xuất bản vá code │                   │ │                 └───────────────────────┘                   │ └─────────────────────────────────────────────────────────────┘ </w:t>
+      </w:r>
+      <w:r>
+        <w:rPr>
+          <w:rFonts w:ascii="Consolas" w:hAnsi="Consolas"/>
+          <w:color w:val="000000"/>
+        </w:rPr>
+      </w:r>
+    </w:p>
+    <w:p>
+      <w:pPr>
+        <w:pStyle w:val="Heading2"/>
+      </w:pPr>
+      <w:r>
+        <w:rPr>
+          <w:rFonts w:ascii="Times New Roman" w:hAnsi="Times New Roman"/>
+          <w:color w:val="000000"/>
+        </w:rPr>
+        <w:t>3.1. Phân hệ 1: Lõi Phân tích Tĩnh Tất định (Deterministic AST/DFG Taint Core)</w:t>
+      </w:r>
+    </w:p>
+    <w:p>
+      <w:pPr/>
+      <w:r>
+        <w:rPr>
+          <w:rFonts w:ascii="Times New Roman" w:hAnsi="Times New Roman"/>
+          <w:color w:val="000000"/>
+        </w:rPr>
+        <w:t>Phân hệ này đóng vai trò máy gia tốc và bộ lọc ranh giới ban đầu:</w:t>
+      </w:r>
+    </w:p>
+    <w:p>
+      <w:pPr>
+        <w:pStyle w:val="ListBullet"/>
+      </w:pPr>
+      <w:r>
+        <w:rPr>
+          <w:rFonts w:ascii="Times New Roman" w:hAnsi="Times New Roman"/>
+          <w:b/>
+          <w:color w:val="000000"/>
+        </w:rPr>
+        <w:t>Phân tích cú pháp AST (Tree-sitter):</w:t>
+      </w:r>
+      <w:r>
+        <w:rPr>
+          <w:rFonts w:ascii="Times New Roman" w:hAnsi="Times New Roman"/>
+          <w:color w:val="000000"/>
+        </w:rPr>
+        <w:t xml:space="preserve"> Phân tích mã nguồn thành cây cú pháp chuẩn hóa, trích xuất danh sách các lời gọi hàm, phép gán và biểu thức điều kiện.</w:t>
+      </w:r>
+    </w:p>
+    <w:p>
+      <w:pPr>
+        <w:pStyle w:val="ListBullet"/>
+      </w:pPr>
+      <w:r>
+        <w:rPr>
+          <w:rFonts w:ascii="Times New Roman" w:hAnsi="Times New Roman"/>
+          <w:b/>
+          <w:color w:val="000000"/>
+        </w:rPr>
+        <w:t>Xây dựng Đồ thị luồng dữ liệu (Dataflow Graph - DFG):</w:t>
+      </w:r>
+      <w:r>
+        <w:rPr>
+          <w:rFonts w:ascii="Times New Roman" w:hAnsi="Times New Roman"/>
+          <w:color w:val="000000"/>
+        </w:rPr>
+        <w:t xml:space="preserve"> Theo dõi đường đi của biến từ điểm tiếp nhận dữ liệu bên ngoài (Source), xuyên qua các phép biến đổi trung gian, tới điểm thực thi nguy hiểm (Sink). Hỗ trợ liên kết liên tệp (Cross-file Call Graph) đối với các kiến trúc mã nguồn phân tầng.</w:t>
+      </w:r>
+    </w:p>
+    <w:p>
+      <w:pPr>
+        <w:pStyle w:val="ListBullet"/>
+      </w:pPr>
+      <w:r>
+        <w:rPr>
+          <w:rFonts w:ascii="Times New Roman" w:hAnsi="Times New Roman"/>
+          <w:b/>
+          <w:color w:val="000000"/>
+        </w:rPr>
+        <w:t>Mô hình hóa cơ chế phòng vệ (Framework Defense Modeling):</w:t>
+      </w:r>
+      <w:r>
+        <w:rPr>
+          <w:rFonts w:ascii="Times New Roman" w:hAnsi="Times New Roman"/>
+          <w:color w:val="000000"/>
+        </w:rPr>
+        <w:t xml:space="preserve"> Định nghĩa sẵn các điểm chặn chuẩn mực theo tinh thần của CodeQL: nhận diện các hàm ép kiểu an toàn (chuyển sang số nguyên, số thực, UUID), các thư viện chuẩn hóa dữ liệu (như bleach, defusedxml), và các cơ chế chống tiêm mã của framework (như ORM query builder, Jinja2 auto-escape).</w:t>
+      </w:r>
+    </w:p>
+    <w:p>
+      <w:pPr>
+        <w:pStyle w:val="ListBullet"/>
+      </w:pPr>
+      <w:r>
+        <w:rPr>
+          <w:rFonts w:ascii="Times New Roman" w:hAnsi="Times New Roman"/>
+          <w:b/>
+          <w:color w:val="000000"/>
+        </w:rPr>
+        <w:t>Trích xuất Lát cắt chương trình (Program Slicing):</w:t>
+      </w:r>
+      <w:r>
+        <w:rPr>
+          <w:rFonts w:ascii="Times New Roman" w:hAnsi="Times New Roman"/>
+          <w:color w:val="000000"/>
+        </w:rPr>
+        <w:t xml:space="preserve"> Khi phát hiện một luồng nghi vấn, phân hệ không gửi toàn bộ tệp mã nguồn mà chỉ trích xuất đúng các dòng lệnh tham gia vào luồng dữ liệu vấy bẩn, tạo thành một </w:t>
+      </w:r>
+      <w:r>
+        <w:rPr>
+          <w:rFonts w:ascii="Times New Roman" w:hAnsi="Times New Roman"/>
+          <w:b/>
+          <w:color w:val="000000"/>
+        </w:rPr>
+        <w:t>Gói bằng chứng kỹ thuật (Evidence Bundle)</w:t>
+      </w:r>
+      <w:r>
+        <w:rPr>
+          <w:rFonts w:ascii="Times New Roman" w:hAnsi="Times New Roman"/>
+          <w:color w:val="000000"/>
+        </w:rPr>
+        <w:t xml:space="preserve"> gồm: Nguồn vào, Điểm kích hoạt, Chuỗi chuyển đổi biến, và Trạng thái điểm chặn.</w:t>
+      </w:r>
+    </w:p>
+    <w:p>
+      <w:pPr>
+        <w:pStyle w:val="Heading2"/>
+      </w:pPr>
+      <w:r>
+        <w:rPr>
+          <w:rFonts w:ascii="Times New Roman" w:hAnsi="Times New Roman"/>
+          <w:color w:val="000000"/>
+        </w:rPr>
+        <w:t>3.2. Phân hệ 2: Cụm Đa Tác tử Thẩm định Bằng chứng (Multi-Agent Hypothesis-Validation Cluster)</w:t>
+      </w:r>
+    </w:p>
+    <w:p>
+      <w:pPr/>
+      <w:r>
+        <w:rPr>
+          <w:rFonts w:ascii="Times New Roman" w:hAnsi="Times New Roman"/>
+          <w:color w:val="000000"/>
+        </w:rPr>
+        <w:t>Cụm đa tác tử tiếp nhận Gói bằng chứng từ Phân hệ 1 và vận hành theo cơ chế tranh biện có giám sát:</w:t>
       </w:r>
     </w:p>
     <w:p>
@@ -304,7 +755,296 @@
       </w:pPr>
       <w:r>
         <w:rPr>
+          <w:rFonts w:ascii="Times New Roman" w:hAnsi="Times New Roman"/>
           <w:b/>
+          <w:color w:val="000000"/>
+        </w:rPr>
+        <w:t>Tác tử Kiểm toán (Auditor Agent):</w:t>
+      </w:r>
+    </w:p>
+    <w:p>
+      <w:pPr>
+        <w:pStyle w:val="ListBullet"/>
+      </w:pPr>
+      <w:r>
+        <w:rPr>
+          <w:rFonts w:ascii="Times New Roman" w:hAnsi="Times New Roman"/>
+          <w:color w:val="000000"/>
+        </w:rPr>
+        <w:t>Đóng vai trò kiểm toán viên bảo mật chủ động.</w:t>
+      </w:r>
+    </w:p>
+    <w:p>
+      <w:pPr>
+        <w:pStyle w:val="ListBullet"/>
+      </w:pPr>
+      <w:r>
+        <w:rPr>
+          <w:rFonts w:ascii="Times New Roman" w:hAnsi="Times New Roman"/>
+          <w:color w:val="000000"/>
+        </w:rPr>
+        <w:t xml:space="preserve">Phân tích Gói bằng chứng và đặt ra </w:t>
+      </w:r>
+      <w:r>
+        <w:rPr>
+          <w:rFonts w:ascii="Times New Roman" w:hAnsi="Times New Roman"/>
+          <w:b/>
+          <w:color w:val="000000"/>
+        </w:rPr>
+        <w:t>Giả thuyết tấn công cụ thể (Attack Hypothesis)</w:t>
+      </w:r>
+      <w:r>
+        <w:rPr>
+          <w:rFonts w:ascii="Times New Roman" w:hAnsi="Times New Roman"/>
+          <w:color w:val="000000"/>
+        </w:rPr>
+        <w:t>: Ví dụ, "Dữ liệu người dùng từ tham số yêu cầu có thể giữ nguyên cấu trúc điều khiển độc hại khi truyền vào hàm thực thi lệnh hệ thống mà không bị vô hiệu hóa".</w:t>
+      </w:r>
+    </w:p>
+    <w:p>
+      <w:pPr>
+        <w:pStyle w:val="ListBullet"/>
+      </w:pPr>
+      <w:r>
+        <w:rPr>
+          <w:rFonts w:ascii="Times New Roman" w:hAnsi="Times New Roman"/>
+          <w:color w:val="000000"/>
+        </w:rPr>
+        <w:t>Liệt kê các điều kiện biên cần thiết để cuộc tấn công thành công.</w:t>
+      </w:r>
+    </w:p>
+    <w:p>
+      <w:pPr>
+        <w:pStyle w:val="ListNumber"/>
+      </w:pPr>
+      <w:r>
+        <w:rPr>
+          <w:rFonts w:ascii="Times New Roman" w:hAnsi="Times New Roman"/>
+          <w:b/>
+          <w:color w:val="000000"/>
+        </w:rPr>
+        <w:t>Tác tử Phản biện (Skeptic Agent / Defense Modeling Agent):</w:t>
+      </w:r>
+    </w:p>
+    <w:p>
+      <w:pPr>
+        <w:pStyle w:val="ListBullet"/>
+      </w:pPr>
+      <w:r>
+        <w:rPr>
+          <w:rFonts w:ascii="Times New Roman" w:hAnsi="Times New Roman"/>
+          <w:color w:val="000000"/>
+        </w:rPr>
+        <w:t>Đóng vai trò chuyên gia phòng thủ đối kháng (Adversarial Defender).</w:t>
+      </w:r>
+    </w:p>
+    <w:p>
+      <w:pPr>
+        <w:pStyle w:val="ListBullet"/>
+      </w:pPr>
+      <w:r>
+        <w:rPr>
+          <w:rFonts w:ascii="Times New Roman" w:hAnsi="Times New Roman"/>
+          <w:color w:val="000000"/>
+        </w:rPr>
+        <w:t xml:space="preserve">Tiếp nhận giả thuyết của Auditor và chủ động tìm kiếm các </w:t>
+      </w:r>
+      <w:r>
+        <w:rPr>
+          <w:rFonts w:ascii="Times New Roman" w:hAnsi="Times New Roman"/>
+          <w:b/>
+          <w:color w:val="000000"/>
+        </w:rPr>
+        <w:t>Bằng chứng phòng vệ (Counter-evidence)</w:t>
+      </w:r>
+      <w:r>
+        <w:rPr>
+          <w:rFonts w:ascii="Times New Roman" w:hAnsi="Times New Roman"/>
+          <w:color w:val="000000"/>
+        </w:rPr>
+        <w:t xml:space="preserve"> trong ngữ cảnh mã nguồn:</w:t>
+      </w:r>
+    </w:p>
+    <w:p>
+      <w:pPr>
+        <w:pStyle w:val="ListBullet"/>
+      </w:pPr>
+      <w:r>
+        <w:rPr>
+          <w:rFonts w:ascii="Times New Roman" w:hAnsi="Times New Roman"/>
+          <w:color w:val="000000"/>
+        </w:rPr>
+        <w:t>Dữ liệu đã được kiểm tra tính hợp lệ bằng các câu lệnh rẽ nhánh điều kiện chưa?</w:t>
+      </w:r>
+    </w:p>
+    <w:p>
+      <w:pPr>
+        <w:pStyle w:val="ListBullet"/>
+      </w:pPr>
+      <w:r>
+        <w:rPr>
+          <w:rFonts w:ascii="Times New Roman" w:hAnsi="Times New Roman"/>
+          <w:color w:val="000000"/>
+        </w:rPr>
+        <w:t>Biến có bị ràng buộc bởi kiểu dữ liệu an toàn hoặc bộ lọc danh sách trắng (Whitelist) không?</w:t>
+      </w:r>
+    </w:p>
+    <w:p>
+      <w:pPr>
+        <w:pStyle w:val="ListBullet"/>
+      </w:pPr>
+      <w:r>
+        <w:rPr>
+          <w:rFonts w:ascii="Times New Roman" w:hAnsi="Times New Roman"/>
+          <w:color w:val="000000"/>
+        </w:rPr>
+        <w:t>Cơ chế ngầm định của thư viện hoặc framework có tự động vô hiệu hóa nguy cơ này hay không?</w:t>
+      </w:r>
+    </w:p>
+    <w:p>
+      <w:pPr>
+        <w:pStyle w:val="ListNumber"/>
+      </w:pPr>
+      <w:r>
+        <w:rPr>
+          <w:rFonts w:ascii="Times New Roman" w:hAnsi="Times New Roman"/>
+          <w:b/>
+          <w:color w:val="000000"/>
+        </w:rPr>
+        <w:t>Tác tử Trọng tài và Đề xuất Bản vá (Judge &amp; Remediation Agent):</w:t>
+      </w:r>
+    </w:p>
+    <w:p>
+      <w:pPr>
+        <w:pStyle w:val="ListBullet"/>
+      </w:pPr>
+      <w:r>
+        <w:rPr>
+          <w:rFonts w:ascii="Times New Roman" w:hAnsi="Times New Roman"/>
+          <w:color w:val="000000"/>
+        </w:rPr>
+        <w:t xml:space="preserve">Đóng vai trò hội đồng trọng tài độc lập, quản lý một </w:t>
+      </w:r>
+      <w:r>
+        <w:rPr>
+          <w:rFonts w:ascii="Times New Roman" w:hAnsi="Times New Roman"/>
+          <w:b/>
+          <w:color w:val="000000"/>
+        </w:rPr>
+        <w:t>Sổ cái Bằng chứng (Evidence Ledger)</w:t>
+      </w:r>
+      <w:r>
+        <w:rPr>
+          <w:rFonts w:ascii="Times New Roman" w:hAnsi="Times New Roman"/>
+          <w:color w:val="000000"/>
+        </w:rPr>
+        <w:t>.</w:t>
+      </w:r>
+    </w:p>
+    <w:p>
+      <w:pPr>
+        <w:pStyle w:val="ListBullet"/>
+      </w:pPr>
+      <w:r>
+        <w:rPr>
+          <w:rFonts w:ascii="Times New Roman" w:hAnsi="Times New Roman"/>
+          <w:color w:val="000000"/>
+        </w:rPr>
+        <w:t>Đối chiếu trực tiếp lập luận của Auditor với các bằng chứng phản bác của Skeptic:</w:t>
+      </w:r>
+    </w:p>
+    <w:p>
+      <w:pPr>
+        <w:pStyle w:val="ListBullet"/>
+      </w:pPr>
+      <w:r>
+        <w:rPr>
+          <w:rFonts w:ascii="Times New Roman" w:hAnsi="Times New Roman"/>
+          <w:color w:val="000000"/>
+        </w:rPr>
+        <w:t>Nếu Skeptic đưa ra được bằng chứng xác thực về cơ chế phòng vệ -&gt; Tuyên bố là Cảnh báo sai (False Positive), hủy cảnh báo và giải thích lý do an toàn.</w:t>
+      </w:r>
+    </w:p>
+    <w:p>
+      <w:pPr>
+        <w:pStyle w:val="ListBullet"/>
+      </w:pPr>
+      <w:r>
+        <w:rPr>
+          <w:rFonts w:ascii="Times New Roman" w:hAnsi="Times New Roman"/>
+          <w:color w:val="000000"/>
+        </w:rPr>
+        <w:t>Nếu Auditor chứng minh được đường dẫn khai thác khả thi và Skeptic không tìm thấy cơ chế bảo vệ hợp lệ -&gt; Xác nhận là Lỗ hổng thật (True Positive).</w:t>
+      </w:r>
+    </w:p>
+    <w:p>
+      <w:pPr>
+        <w:pStyle w:val="ListBullet"/>
+      </w:pPr>
+      <w:r>
+        <w:rPr>
+          <w:rFonts w:ascii="Times New Roman" w:hAnsi="Times New Roman"/>
+          <w:color w:val="000000"/>
+        </w:rPr>
+        <w:t xml:space="preserve">Khi xác nhận lỗ hổng, tác tử này tự động tổng hợp báo cáo giải thích theo chuỗi nguyên nhân và đề xuất trực tiếp </w:t>
+      </w:r>
+      <w:r>
+        <w:rPr>
+          <w:rFonts w:ascii="Times New Roman" w:hAnsi="Times New Roman"/>
+          <w:b/>
+          <w:color w:val="000000"/>
+        </w:rPr>
+        <w:t>Bản vá mã nguồn an toàn (Remediation Patch)</w:t>
+      </w:r>
+      <w:r>
+        <w:rPr>
+          <w:rFonts w:ascii="Times New Roman" w:hAnsi="Times New Roman"/>
+          <w:color w:val="000000"/>
+        </w:rPr>
+        <w:t xml:space="preserve"> theo chuẩn phòng thủ chiều sâu (Defense-in-Depth).</w:t>
+      </w:r>
+    </w:p>
+    <w:p>
+      <w:pPr/>
+      <w:r>
+        <w:rPr>
+          <w:rFonts w:ascii="Times New Roman" w:hAnsi="Times New Roman"/>
+          <w:color w:val="000000"/>
+        </w:rPr>
+        <w:t>---</w:t>
+      </w:r>
+    </w:p>
+    <w:p>
+      <w:pPr>
+        <w:pStyle w:val="Heading1"/>
+      </w:pPr>
+      <w:r>
+        <w:rPr>
+          <w:rFonts w:ascii="Times New Roman" w:hAnsi="Times New Roman"/>
+          <w:color w:val="000000"/>
+        </w:rPr>
+        <w:t>4. Những Công Việc Nhóm Đã Hoàn Thành Trong Tuần Qua</w:t>
+      </w:r>
+    </w:p>
+    <w:p>
+      <w:pPr/>
+      <w:r>
+        <w:rPr>
+          <w:rFonts w:ascii="Times New Roman" w:hAnsi="Times New Roman"/>
+          <w:color w:val="000000"/>
+        </w:rPr>
+        <w:t>Trong tuần vừa qua, nhóm đã hoàn thành bốn khối lượng công việc chính:</w:t>
+      </w:r>
+    </w:p>
+    <w:p>
+      <w:pPr>
+        <w:pStyle w:val="ListNumber"/>
+      </w:pPr>
+      <w:r>
+        <w:rPr>
+          <w:rFonts w:ascii="Times New Roman" w:hAnsi="Times New Roman"/>
+          <w:b/>
+          <w:color w:val="000000"/>
         </w:rPr>
         <w:t>Thực nghiệm diện rộng trên toàn bộ 1,230 ca kiểm thử của OWASP Benchmark Python:</w:t>
       </w:r>
@@ -314,7 +1054,11 @@
         <w:pStyle w:val="ListBullet"/>
       </w:pPr>
       <w:r>
-        <w:t>Nhóm đã xây dựng bộ đo đạc tự động để quét và chấm điểm trực tiếp toàn bộ 1,230 tệp mã nguồn kiểm thử đối chiếu với bảng kết quả chuẩn của OWASP.</w:t>
+        <w:rPr>
+          <w:rFonts w:ascii="Times New Roman" w:hAnsi="Times New Roman"/>
+          <w:color w:val="000000"/>
+        </w:rPr>
+        <w:t>Xây dựng quy trình tự động hóa hoàn toàn từ khâu quét mã nguồn, trích xuất kết quả, đến đối chiếu trực tiếp với bảng đáp án chuẩn (Ground Truth) của OWASP.</w:t>
       </w:r>
     </w:p>
     <w:p>
@@ -322,7 +1066,11 @@
         <w:pStyle w:val="ListBullet"/>
       </w:pPr>
       <w:r>
-        <w:t>Toàn bộ quá trình quét và tính toán số liệu diễn ra hoàn toàn tự động trong 78 giây, đảm bảo tính khách quan và liêm chính trong nghiên cứu.</w:t>
+        <w:rPr>
+          <w:rFonts w:ascii="Times New Roman" w:hAnsi="Times New Roman"/>
+          <w:color w:val="000000"/>
+        </w:rPr>
+        <w:t>Toàn bộ 1,230 tệp kiểm thử được xử lý độc lập và đo đạc hoàn tất trong 78 giây, bảo đảm tính minh bạch, khách quan và khả năng tái lập kết quả nghiên cứu.</w:t>
       </w:r>
     </w:p>
     <w:p>
@@ -331,9 +1079,11 @@
       </w:pPr>
       <w:r>
         <w:rPr>
+          <w:rFonts w:ascii="Times New Roman" w:hAnsi="Times New Roman"/>
           <w:b/>
+          <w:color w:val="000000"/>
         </w:rPr>
-        <w:t>Thực hiện nghiên cứu cắt lớp (Ablation Study) qua 4 tầng kỹ thuật:</w:t>
+        <w:t>Nghiên cứu cắt lớp (Ablation Study) qua 4 tầng kỹ thuật:</w:t>
       </w:r>
     </w:p>
     <w:p>
@@ -341,7 +1091,11 @@
         <w:pStyle w:val="ListBullet"/>
       </w:pPr>
       <w:r>
-        <w:t>Nhóm đã đo đạc độc lập 4 tầng kỹ thuật để chứng minh rõ đóng góp của từng thành phần: từ đối sánh mẫu cú pháp đơn thuần, bổ sung luồng dữ liệu trong tệp, mở rộng luồng dữ liệu liên tệp, cho đến lớp phản biện đa tác tử.</w:t>
+        <w:rPr>
+          <w:rFonts w:ascii="Times New Roman" w:hAnsi="Times New Roman"/>
+          <w:color w:val="000000"/>
+        </w:rPr>
+        <w:t>Để chứng minh giá trị khoa học của kiến trúc lai ghép và sự cần thiết của từng thành phần, nhóm đã tiến hành đo đạc độc lập hiệu năng qua 4 tầng tiến hóa:</w:t>
       </w:r>
     </w:p>
     <w:p>
@@ -349,7 +1103,59 @@
         <w:pStyle w:val="ListBullet"/>
       </w:pPr>
       <w:r>
-        <w:t>Kết quả đo đạc cho thấy độ chính xác tăng dần từ 33.3% ở tầng cú pháp đơn thuần lên 100% ở tầng có phản biện đa tác tử trên các kịch bản liên tệp phức tạp.</w:t>
+        <w:rPr>
+          <w:rFonts w:ascii="Times New Roman" w:hAnsi="Times New Roman"/>
+          <w:color w:val="000000"/>
+        </w:rPr>
+        <w:t>*Tầng 1 (Cú pháp AST đơn thuần):* Đối sánh mẫu cục bộ (tương đương Semgrep cơ sở).</w:t>
+      </w:r>
+    </w:p>
+    <w:p>
+      <w:pPr>
+        <w:pStyle w:val="ListBullet"/>
+      </w:pPr>
+      <w:r>
+        <w:rPr>
+          <w:rFonts w:ascii="Times New Roman" w:hAnsi="Times New Roman"/>
+          <w:color w:val="000000"/>
+        </w:rPr>
+        <w:t>*Tầng 2 (Luồng dữ liệu nội tệp):* Bổ sung đồ thị luồng dữ liệu trong tệp và ranh giới điểm chặn cơ bản.</w:t>
+      </w:r>
+    </w:p>
+    <w:p>
+      <w:pPr>
+        <w:pStyle w:val="ListBullet"/>
+      </w:pPr>
+      <w:r>
+        <w:rPr>
+          <w:rFonts w:ascii="Times New Roman" w:hAnsi="Times New Roman"/>
+          <w:color w:val="000000"/>
+        </w:rPr>
+        <w:t>*Tầng 3 (Khả năng kích hoạt liên tệp):* Mở rộng đồ thị luồng dữ liệu xuyên tệp và loại bỏ mã chết không kích hoạt được.</w:t>
+      </w:r>
+    </w:p>
+    <w:p>
+      <w:pPr>
+        <w:pStyle w:val="ListBullet"/>
+      </w:pPr>
+      <w:r>
+        <w:rPr>
+          <w:rFonts w:ascii="Times New Roman" w:hAnsi="Times New Roman"/>
+          <w:color w:val="000000"/>
+        </w:rPr>
+        <w:t>*Tầng 4 (Phản biện Đa tác tử Multi-Agent):* Tích hợp cụm thẩm định đối kháng Auditor - Skeptic - Judge.</w:t>
+      </w:r>
+    </w:p>
+    <w:p>
+      <w:pPr>
+        <w:pStyle w:val="ListBullet"/>
+      </w:pPr>
+      <w:r>
+        <w:rPr>
+          <w:rFonts w:ascii="Times New Roman" w:hAnsi="Times New Roman"/>
+          <w:color w:val="000000"/>
+        </w:rPr>
+        <w:t>Kết quả cắt lớp trên các kịch bản liên tệp phức tạp cho thấy: Tầng 1 đạt độ chính xác chỉ 33.3% do báo sai tràn lan; Tầng 2 và Tầng 3 nâng dần độ chính xác lên 66.7% và 80.0%; và Tầng 4 đạt độ chính xác tuyệt đối 100% nhờ giải quyết triệt để các trường hợp giả lập phức tạp.</w:t>
       </w:r>
     </w:p>
     <w:p>
@@ -358,9 +1164,11 @@
       </w:pPr>
       <w:r>
         <w:rPr>
+          <w:rFonts w:ascii="Times New Roman" w:hAnsi="Times New Roman"/>
           <w:b/>
+          <w:color w:val="000000"/>
         </w:rPr>
-        <w:t>Hoàn thiện giao diện web (Dashboard) tương tác phục vụ trình diễn:</w:t>
+        <w:t>Hoàn thiện giao diện Web Dashboard trực quan hóa:</w:t>
       </w:r>
     </w:p>
     <w:p>
@@ -368,7 +1176,11 @@
         <w:pStyle w:val="ListBullet"/>
       </w:pPr>
       <w:r>
-        <w:t>Nhóm đã xây dựng xong hệ thống giao diện tương tác kết nối trực tiếp với bộ phân tích.</w:t>
+        <w:rPr>
+          <w:rFonts w:ascii="Times New Roman" w:hAnsi="Times New Roman"/>
+          <w:color w:val="000000"/>
+        </w:rPr>
+        <w:t>Xây dựng giao diện web kết nối trực tiếp với backend phân tích qua REST API chuẩn hóa.</w:t>
       </w:r>
     </w:p>
     <w:p>
@@ -376,7 +1188,11 @@
         <w:pStyle w:val="ListBullet"/>
       </w:pPr>
       <w:r>
-        <w:t>Giao diện cho phép người xem quan sát trực quan toàn bộ đường đi của dữ liệu từ nguồn vào đến điểm kích hoạt, theo dõi bảng lập luận phản biện của các tác tử, và xem bản vá mã nguồn an toàn được gợi ý tự động.</w:t>
+        <w:rPr>
+          <w:rFonts w:ascii="Times New Roman" w:hAnsi="Times New Roman"/>
+          <w:color w:val="000000"/>
+        </w:rPr>
+        <w:t>Giao diện trực quan hóa toàn bộ chuỗi mắt xích: đồ thị luồng vấy bẩn từ Source đến Sink, bảng ghi tranh biện giữa Auditor và Skeptic, phán quyết của Judge và khung so sánh mã nguồn trước/sau khi áp dụng bản vá đề xuất.</w:t>
       </w:r>
     </w:p>
     <w:p>
@@ -385,9 +1201,11 @@
       </w:pPr>
       <w:r>
         <w:rPr>
+          <w:rFonts w:ascii="Times New Roman" w:hAnsi="Times New Roman"/>
           <w:b/>
+          <w:color w:val="000000"/>
         </w:rPr>
-        <w:t>Thiết lập quy trình kiểm thử tự động trên kho mã nguồn:</w:t>
+        <w:t>Thiết lập quy trình tích hợp liên tục (CI/CD) trên GitHub Actions:</w:t>
       </w:r>
     </w:p>
     <w:p>
@@ -395,12 +1213,20 @@
         <w:pStyle w:val="ListBullet"/>
       </w:pPr>
       <w:r>
-        <w:t>Nhóm đã đưa bộ 278 bài kiểm tra tự động lên hệ thống GitHub Actions, đảm bảo mọi chỉnh sửa mới đều được kiểm tra tính ổn định và không làm phát sinh lỗi cũ.</w:t>
+        <w:rPr>
+          <w:rFonts w:ascii="Times New Roman" w:hAnsi="Times New Roman"/>
+          <w:color w:val="000000"/>
+        </w:rPr>
+        <w:t>Đưa bộ 278 bài kiểm thử tự động (bao gồm Unit Test và Integration Test) lên hệ thống tích hợp liên tục của GitHub. Mọi thay đổi mã nguồn mới đều được kiểm tra nghiêm ngặt, ngăn chặn hiện tượng hồi quy phần mềm.</w:t>
       </w:r>
     </w:p>
     <w:p>
       <w:pPr/>
       <w:r>
+        <w:rPr>
+          <w:rFonts w:ascii="Times New Roman" w:hAnsi="Times New Roman"/>
+          <w:color w:val="000000"/>
+        </w:rPr>
         <w:t>---</w:t>
       </w:r>
     </w:p>
@@ -409,7 +1235,11 @@
         <w:pStyle w:val="Heading1"/>
       </w:pPr>
       <w:r>
-        <w:t>4. Kết Quả Đo Đạc Thực Nghiệm Mới Nhất</w:t>
+        <w:rPr>
+          <w:rFonts w:ascii="Times New Roman" w:hAnsi="Times New Roman"/>
+          <w:color w:val="000000"/>
+        </w:rPr>
+        <w:t>5. Kết Quả Đo Đạc Thực Nghiệm Mới Nhất</w:t>
       </w:r>
     </w:p>
     <w:p>
@@ -417,13 +1247,21 @@
         <w:pStyle w:val="Heading2"/>
       </w:pPr>
       <w:r>
-        <w:t>4.1. Kết quả tổng thể trên toàn bộ 1,230 ca kiểm thử của OWASP Benchmark</w:t>
+        <w:rPr>
+          <w:rFonts w:ascii="Times New Roman" w:hAnsi="Times New Roman"/>
+          <w:color w:val="000000"/>
+        </w:rPr>
+        <w:t>5.1. Kết quả tổng thể trên toàn bộ 1,230 ca kiểm thử của OWASP Benchmark</w:t>
       </w:r>
     </w:p>
     <w:p>
       <w:pPr/>
       <w:r>
-        <w:t>Bảng dưới đây thể hiện kết quả đối chiếu giữa bộ quét mẫu cú pháp cơ sở (Semgrep thô) và hệ thống Aegis-SAST:</w:t>
+        <w:rPr>
+          <w:rFonts w:ascii="Times New Roman" w:hAnsi="Times New Roman"/>
+          <w:color w:val="000000"/>
+        </w:rPr>
+        <w:t>Bảng dưới đây trình bày kết quả đối sánh toàn diện giữa Bộ quét cú pháp cơ sở (Semgrep thô) và Hệ thống Aegis-SAST trên toàn bộ 1,230 bài kiểm tra thuộc 10 nhóm lỗ hổng của OWASP Benchmark cho Python:</w:t>
       </w:r>
     </w:p>
     <w:tbl>
@@ -449,9 +1287,18 @@
             <w:tcW w:type="dxa" w:w="960"/>
           </w:tcPr>
           <w:p>
-            <w:r/>
             <w:r>
-              <w:t>Hệ Thống / Chế Độ Đánh Giá</w:t>
+              <w:rPr>
+                <w:rFonts w:ascii="Times New Roman" w:hAnsi="Times New Roman"/>
+                <w:color w:val="000000"/>
+              </w:rPr>
+            </w:r>
+            <w:r>
+              <w:rPr>
+                <w:rFonts w:ascii="Times New Roman" w:hAnsi="Times New Roman"/>
+                <w:color w:val="000000"/>
+              </w:rPr>
+              <w:t>Hệ Thống Đánh Giá</w:t>
             </w:r>
           </w:p>
         </w:tc>
@@ -460,8 +1307,17 @@
             <w:tcW w:type="dxa" w:w="960"/>
           </w:tcPr>
           <w:p>
-            <w:r/>
             <w:r>
+              <w:rPr>
+                <w:rFonts w:ascii="Times New Roman" w:hAnsi="Times New Roman"/>
+                <w:color w:val="000000"/>
+              </w:rPr>
+            </w:r>
+            <w:r>
+              <w:rPr>
+                <w:rFonts w:ascii="Times New Roman" w:hAnsi="Times New Roman"/>
+                <w:color w:val="000000"/>
+              </w:rPr>
               <w:t>Đúng Lỗ Hổng (TP)</w:t>
             </w:r>
           </w:p>
@@ -471,8 +1327,17 @@
             <w:tcW w:type="dxa" w:w="960"/>
           </w:tcPr>
           <w:p>
-            <w:r/>
             <w:r>
+              <w:rPr>
+                <w:rFonts w:ascii="Times New Roman" w:hAnsi="Times New Roman"/>
+                <w:color w:val="000000"/>
+              </w:rPr>
+            </w:r>
+            <w:r>
+              <w:rPr>
+                <w:rFonts w:ascii="Times New Roman" w:hAnsi="Times New Roman"/>
+                <w:color w:val="000000"/>
+              </w:rPr>
               <w:t>Báo Sai (FP)</w:t>
             </w:r>
           </w:p>
@@ -482,8 +1347,17 @@
             <w:tcW w:type="dxa" w:w="960"/>
           </w:tcPr>
           <w:p>
-            <w:r/>
             <w:r>
+              <w:rPr>
+                <w:rFonts w:ascii="Times New Roman" w:hAnsi="Times New Roman"/>
+                <w:color w:val="000000"/>
+              </w:rPr>
+            </w:r>
+            <w:r>
+              <w:rPr>
+                <w:rFonts w:ascii="Times New Roman" w:hAnsi="Times New Roman"/>
+                <w:color w:val="000000"/>
+              </w:rPr>
               <w:t>Bỏ Sót (FN)</w:t>
             </w:r>
           </w:p>
@@ -493,8 +1367,17 @@
             <w:tcW w:type="dxa" w:w="960"/>
           </w:tcPr>
           <w:p>
-            <w:r/>
             <w:r>
+              <w:rPr>
+                <w:rFonts w:ascii="Times New Roman" w:hAnsi="Times New Roman"/>
+                <w:color w:val="000000"/>
+              </w:rPr>
+            </w:r>
+            <w:r>
+              <w:rPr>
+                <w:rFonts w:ascii="Times New Roman" w:hAnsi="Times New Roman"/>
+                <w:color w:val="000000"/>
+              </w:rPr>
               <w:t>Đúng An Toàn (TN)</w:t>
             </w:r>
           </w:p>
@@ -504,8 +1387,17 @@
             <w:tcW w:type="dxa" w:w="960"/>
           </w:tcPr>
           <w:p>
-            <w:r/>
             <w:r>
+              <w:rPr>
+                <w:rFonts w:ascii="Times New Roman" w:hAnsi="Times New Roman"/>
+                <w:color w:val="000000"/>
+              </w:rPr>
+            </w:r>
+            <w:r>
+              <w:rPr>
+                <w:rFonts w:ascii="Times New Roman" w:hAnsi="Times New Roman"/>
+                <w:color w:val="000000"/>
+              </w:rPr>
               <w:t>Độ Chính Xác (Precision)</w:t>
             </w:r>
           </w:p>
@@ -515,8 +1407,17 @@
             <w:tcW w:type="dxa" w:w="960"/>
           </w:tcPr>
           <w:p>
-            <w:r/>
             <w:r>
+              <w:rPr>
+                <w:rFonts w:ascii="Times New Roman" w:hAnsi="Times New Roman"/>
+                <w:color w:val="000000"/>
+              </w:rPr>
+            </w:r>
+            <w:r>
+              <w:rPr>
+                <w:rFonts w:ascii="Times New Roman" w:hAnsi="Times New Roman"/>
+                <w:color w:val="000000"/>
+              </w:rPr>
               <w:t>Độ Bao Phủ (Recall)</w:t>
             </w:r>
           </w:p>
@@ -526,9 +1427,18 @@
             <w:tcW w:type="dxa" w:w="960"/>
           </w:tcPr>
           <w:p>
-            <w:r/>
             <w:r>
-              <w:t>F1-Score</w:t>
+              <w:rPr>
+                <w:rFonts w:ascii="Times New Roman" w:hAnsi="Times New Roman"/>
+                <w:color w:val="000000"/>
+              </w:rPr>
+            </w:r>
+            <w:r>
+              <w:rPr>
+                <w:rFonts w:ascii="Times New Roman" w:hAnsi="Times New Roman"/>
+                <w:color w:val="000000"/>
+              </w:rPr>
+              <w:t>Điểm F1-Score</w:t>
             </w:r>
           </w:p>
         </w:tc>
@@ -537,9 +1447,18 @@
             <w:tcW w:type="dxa" w:w="960"/>
           </w:tcPr>
           <w:p>
-            <w:r/>
             <w:r>
-              <w:t>Mức Giảm Báo Sai</w:t>
+              <w:rPr>
+                <w:rFonts w:ascii="Times New Roman" w:hAnsi="Times New Roman"/>
+                <w:color w:val="000000"/>
+              </w:rPr>
+            </w:r>
+            <w:r>
+              <w:rPr>
+                <w:rFonts w:ascii="Times New Roman" w:hAnsi="Times New Roman"/>
+                <w:color w:val="000000"/>
+              </w:rPr>
+              <w:t>Tỷ Lệ Giảm Báo Sai</w:t>
             </w:r>
           </w:p>
         </w:tc>
@@ -550,10 +1469,17 @@
             <w:tcW w:type="dxa" w:w="960"/>
           </w:tcPr>
           <w:p>
-            <w:r/>
             <w:r>
               <w:rPr>
+                <w:rFonts w:ascii="Times New Roman" w:hAnsi="Times New Roman"/>
+                <w:color w:val="000000"/>
+              </w:rPr>
+            </w:r>
+            <w:r>
+              <w:rPr>
+                <w:rFonts w:ascii="Times New Roman" w:hAnsi="Times New Roman"/>
                 <w:b/>
+                <w:color w:val="000000"/>
               </w:rPr>
               <w:t>Bộ quét cơ sở (Semgrep thô)</w:t>
             </w:r>
@@ -564,8 +1490,17 @@
             <w:tcW w:type="dxa" w:w="960"/>
           </w:tcPr>
           <w:p>
-            <w:r/>
             <w:r>
+              <w:rPr>
+                <w:rFonts w:ascii="Times New Roman" w:hAnsi="Times New Roman"/>
+                <w:color w:val="000000"/>
+              </w:rPr>
+            </w:r>
+            <w:r>
+              <w:rPr>
+                <w:rFonts w:ascii="Times New Roman" w:hAnsi="Times New Roman"/>
+                <w:color w:val="000000"/>
+              </w:rPr>
               <w:t>130</w:t>
             </w:r>
           </w:p>
@@ -575,8 +1510,17 @@
             <w:tcW w:type="dxa" w:w="960"/>
           </w:tcPr>
           <w:p>
-            <w:r/>
             <w:r>
+              <w:rPr>
+                <w:rFonts w:ascii="Times New Roman" w:hAnsi="Times New Roman"/>
+                <w:color w:val="000000"/>
+              </w:rPr>
+            </w:r>
+            <w:r>
+              <w:rPr>
+                <w:rFonts w:ascii="Times New Roman" w:hAnsi="Times New Roman"/>
+                <w:color w:val="000000"/>
+              </w:rPr>
               <w:t>640</w:t>
             </w:r>
           </w:p>
@@ -586,8 +1530,17 @@
             <w:tcW w:type="dxa" w:w="960"/>
           </w:tcPr>
           <w:p>
-            <w:r/>
             <w:r>
+              <w:rPr>
+                <w:rFonts w:ascii="Times New Roman" w:hAnsi="Times New Roman"/>
+                <w:color w:val="000000"/>
+              </w:rPr>
+            </w:r>
+            <w:r>
+              <w:rPr>
+                <w:rFonts w:ascii="Times New Roman" w:hAnsi="Times New Roman"/>
+                <w:color w:val="000000"/>
+              </w:rPr>
               <w:t>110</w:t>
             </w:r>
           </w:p>
@@ -597,8 +1550,17 @@
             <w:tcW w:type="dxa" w:w="960"/>
           </w:tcPr>
           <w:p>
-            <w:r/>
             <w:r>
+              <w:rPr>
+                <w:rFonts w:ascii="Times New Roman" w:hAnsi="Times New Roman"/>
+                <w:color w:val="000000"/>
+              </w:rPr>
+            </w:r>
+            <w:r>
+              <w:rPr>
+                <w:rFonts w:ascii="Times New Roman" w:hAnsi="Times New Roman"/>
+                <w:color w:val="000000"/>
+              </w:rPr>
               <w:t>251</w:t>
             </w:r>
           </w:p>
@@ -608,10 +1570,17 @@
             <w:tcW w:type="dxa" w:w="960"/>
           </w:tcPr>
           <w:p>
-            <w:r/>
             <w:r>
               <w:rPr>
+                <w:rFonts w:ascii="Times New Roman" w:hAnsi="Times New Roman"/>
+                <w:color w:val="000000"/>
+              </w:rPr>
+            </w:r>
+            <w:r>
+              <w:rPr>
+                <w:rFonts w:ascii="Times New Roman" w:hAnsi="Times New Roman"/>
                 <w:b/>
+                <w:color w:val="000000"/>
               </w:rPr>
               <w:t>16.88%</w:t>
             </w:r>
@@ -622,8 +1591,17 @@
             <w:tcW w:type="dxa" w:w="960"/>
           </w:tcPr>
           <w:p>
-            <w:r/>
             <w:r>
+              <w:rPr>
+                <w:rFonts w:ascii="Times New Roman" w:hAnsi="Times New Roman"/>
+                <w:color w:val="000000"/>
+              </w:rPr>
+            </w:r>
+            <w:r>
+              <w:rPr>
+                <w:rFonts w:ascii="Times New Roman" w:hAnsi="Times New Roman"/>
+                <w:color w:val="000000"/>
+              </w:rPr>
               <w:t>54.17%</w:t>
             </w:r>
           </w:p>
@@ -633,8 +1611,18 @@
             <w:tcW w:type="dxa" w:w="960"/>
           </w:tcPr>
           <w:p>
-            <w:r/>
             <w:r>
+              <w:rPr>
+                <w:rFonts w:ascii="Times New Roman" w:hAnsi="Times New Roman"/>
+                <w:color w:val="000000"/>
+              </w:rPr>
+            </w:r>
+            <w:r>
+              <w:rPr>
+                <w:rFonts w:ascii="Times New Roman" w:hAnsi="Times New Roman"/>
+                <w:b/>
+                <w:color w:val="000000"/>
+              </w:rPr>
               <w:t>25.74%</w:t>
             </w:r>
           </w:p>
@@ -644,9 +1632,18 @@
             <w:tcW w:type="dxa" w:w="960"/>
           </w:tcPr>
           <w:p>
-            <w:r/>
             <w:r>
-              <w:t>*Mốc gốc (0%)*</w:t>
+              <w:rPr>
+                <w:rFonts w:ascii="Times New Roman" w:hAnsi="Times New Roman"/>
+                <w:color w:val="000000"/>
+              </w:rPr>
+            </w:r>
+            <w:r>
+              <w:rPr>
+                <w:rFonts w:ascii="Times New Roman" w:hAnsi="Times New Roman"/>
+                <w:color w:val="000000"/>
+              </w:rPr>
+              <w:t>*0% (Gốc)*</w:t>
             </w:r>
           </w:p>
         </w:tc>
@@ -657,10 +1654,17 @@
             <w:tcW w:type="dxa" w:w="960"/>
           </w:tcPr>
           <w:p>
-            <w:r/>
             <w:r>
               <w:rPr>
+                <w:rFonts w:ascii="Times New Roman" w:hAnsi="Times New Roman"/>
+                <w:color w:val="000000"/>
+              </w:rPr>
+            </w:r>
+            <w:r>
+              <w:rPr>
+                <w:rFonts w:ascii="Times New Roman" w:hAnsi="Times New Roman"/>
                 <w:b/>
+                <w:color w:val="000000"/>
               </w:rPr>
               <w:t>Hệ thống Aegis-SAST</w:t>
             </w:r>
@@ -671,8 +1675,17 @@
             <w:tcW w:type="dxa" w:w="960"/>
           </w:tcPr>
           <w:p>
-            <w:r/>
             <w:r>
+              <w:rPr>
+                <w:rFonts w:ascii="Times New Roman" w:hAnsi="Times New Roman"/>
+                <w:color w:val="000000"/>
+              </w:rPr>
+            </w:r>
+            <w:r>
+              <w:rPr>
+                <w:rFonts w:ascii="Times New Roman" w:hAnsi="Times New Roman"/>
+                <w:color w:val="000000"/>
+              </w:rPr>
               <w:t>111</w:t>
             </w:r>
           </w:p>
@@ -682,10 +1695,17 @@
             <w:tcW w:type="dxa" w:w="960"/>
           </w:tcPr>
           <w:p>
-            <w:r/>
             <w:r>
               <w:rPr>
+                <w:rFonts w:ascii="Times New Roman" w:hAnsi="Times New Roman"/>
+                <w:color w:val="000000"/>
+              </w:rPr>
+            </w:r>
+            <w:r>
+              <w:rPr>
+                <w:rFonts w:ascii="Times New Roman" w:hAnsi="Times New Roman"/>
                 <w:b/>
+                <w:color w:val="000000"/>
               </w:rPr>
               <w:t>224</w:t>
             </w:r>
@@ -696,8 +1716,17 @@
             <w:tcW w:type="dxa" w:w="960"/>
           </w:tcPr>
           <w:p>
-            <w:r/>
             <w:r>
+              <w:rPr>
+                <w:rFonts w:ascii="Times New Roman" w:hAnsi="Times New Roman"/>
+                <w:color w:val="000000"/>
+              </w:rPr>
+            </w:r>
+            <w:r>
+              <w:rPr>
+                <w:rFonts w:ascii="Times New Roman" w:hAnsi="Times New Roman"/>
+                <w:color w:val="000000"/>
+              </w:rPr>
               <w:t>129</w:t>
             </w:r>
           </w:p>
@@ -707,8 +1736,17 @@
             <w:tcW w:type="dxa" w:w="960"/>
           </w:tcPr>
           <w:p>
-            <w:r/>
             <w:r>
+              <w:rPr>
+                <w:rFonts w:ascii="Times New Roman" w:hAnsi="Times New Roman"/>
+                <w:color w:val="000000"/>
+              </w:rPr>
+            </w:r>
+            <w:r>
+              <w:rPr>
+                <w:rFonts w:ascii="Times New Roman" w:hAnsi="Times New Roman"/>
+                <w:color w:val="000000"/>
+              </w:rPr>
               <w:t>312</w:t>
             </w:r>
           </w:p>
@@ -718,10 +1756,17 @@
             <w:tcW w:type="dxa" w:w="960"/>
           </w:tcPr>
           <w:p>
-            <w:r/>
             <w:r>
               <w:rPr>
+                <w:rFonts w:ascii="Times New Roman" w:hAnsi="Times New Roman"/>
+                <w:color w:val="000000"/>
+              </w:rPr>
+            </w:r>
+            <w:r>
+              <w:rPr>
+                <w:rFonts w:ascii="Times New Roman" w:hAnsi="Times New Roman"/>
                 <w:b/>
+                <w:color w:val="000000"/>
               </w:rPr>
               <w:t>33.13%</w:t>
             </w:r>
@@ -732,8 +1777,17 @@
             <w:tcW w:type="dxa" w:w="960"/>
           </w:tcPr>
           <w:p>
-            <w:r/>
             <w:r>
+              <w:rPr>
+                <w:rFonts w:ascii="Times New Roman" w:hAnsi="Times New Roman"/>
+                <w:color w:val="000000"/>
+              </w:rPr>
+            </w:r>
+            <w:r>
+              <w:rPr>
+                <w:rFonts w:ascii="Times New Roman" w:hAnsi="Times New Roman"/>
+                <w:color w:val="000000"/>
+              </w:rPr>
               <w:t>46.25%</w:t>
             </w:r>
           </w:p>
@@ -743,10 +1797,17 @@
             <w:tcW w:type="dxa" w:w="960"/>
           </w:tcPr>
           <w:p>
-            <w:r/>
             <w:r>
               <w:rPr>
+                <w:rFonts w:ascii="Times New Roman" w:hAnsi="Times New Roman"/>
+                <w:color w:val="000000"/>
+              </w:rPr>
+            </w:r>
+            <w:r>
+              <w:rPr>
+                <w:rFonts w:ascii="Times New Roman" w:hAnsi="Times New Roman"/>
                 <w:b/>
+                <w:color w:val="000000"/>
               </w:rPr>
               <w:t>38.61%</w:t>
             </w:r>
@@ -757,10 +1818,17 @@
             <w:tcW w:type="dxa" w:w="960"/>
           </w:tcPr>
           <w:p>
-            <w:r/>
             <w:r>
               <w:rPr>
+                <w:rFonts w:ascii="Times New Roman" w:hAnsi="Times New Roman"/>
+                <w:color w:val="000000"/>
+              </w:rPr>
+            </w:r>
+            <w:r>
+              <w:rPr>
+                <w:rFonts w:ascii="Times New Roman" w:hAnsi="Times New Roman"/>
                 <w:b/>
+                <w:color w:val="000000"/>
               </w:rPr>
               <w:t>-65.00%</w:t>
             </w:r>
@@ -772,9 +1840,11 @@
       <w:pPr/>
       <w:r>
         <w:rPr>
+          <w:rFonts w:ascii="Times New Roman" w:hAnsi="Times New Roman"/>
           <w:b/>
+          <w:color w:val="000000"/>
         </w:rPr>
-        <w:t>Nhận xét:</w:t>
+        <w:t>Phân tích kết quả tổng thể:</w:t>
       </w:r>
     </w:p>
     <w:p>
@@ -783,12 +1853,18 @@
       </w:pPr>
       <w:r>
         <w:rPr>
+          <w:rFonts w:ascii="Times New Roman" w:hAnsi="Times New Roman"/>
           <w:b/>
+          <w:color w:val="000000"/>
         </w:rPr>
-        <w:t>Giảm 65.00% cảnh báo sai:</w:t>
+        <w:t>Triệt tiêu 65.00% cảnh báo sai:</w:t>
       </w:r>
       <w:r>
-        <w:t xml:space="preserve"> Aegis-SAST đã loại bỏ được 416 cảnh báo sai mà bộ quét cú pháp cơ sở báo nhầm (từ 640 cảnh báo sai giảm xuống còn 224).</w:t>
+        <w:rPr>
+          <w:rFonts w:ascii="Times New Roman" w:hAnsi="Times New Roman"/>
+          <w:color w:val="000000"/>
+        </w:rPr>
+        <w:t xml:space="preserve"> Số lượng cảnh báo giả giảm mạnh từ 640 ca xuống còn 224 ca (loại bỏ được 416 cảnh báo sai gây phiền nhiễu).</w:t>
       </w:r>
     </w:p>
     <w:p>
@@ -797,12 +1873,18 @@
       </w:pPr>
       <w:r>
         <w:rPr>
+          <w:rFonts w:ascii="Times New Roman" w:hAnsi="Times New Roman"/>
           <w:b/>
+          <w:color w:val="000000"/>
         </w:rPr>
-        <w:t>Độ chính xác tăng gần gấp đôi:</w:t>
+        <w:t>Độ chính xác (Precision) tăng gần gấp đôi:</w:t>
       </w:r>
       <w:r>
-        <w:t xml:space="preserve"> Tăng từ 16.88% lên 33.13% (tăng tương đối 96.27%).</w:t>
+        <w:rPr>
+          <w:rFonts w:ascii="Times New Roman" w:hAnsi="Times New Roman"/>
+          <w:color w:val="000000"/>
+        </w:rPr>
+        <w:t xml:space="preserve"> Tăng từ 16.88% lên 33.13% (tăng tương đối 96.27%), giúp nhà phát triển tập trung vào các vấn đề bảo mật thực sự.</w:t>
       </w:r>
     </w:p>
     <w:p>
@@ -811,12 +1893,18 @@
       </w:pPr>
       <w:r>
         <w:rPr>
+          <w:rFonts w:ascii="Times New Roman" w:hAnsi="Times New Roman"/>
           <w:b/>
+          <w:color w:val="000000"/>
         </w:rPr>
-        <w:t>F1-Score cải thiện rõ rệt:</w:t>
+        <w:t>Điểm F1-Score tổng thể tăng 50.00%:</w:t>
       </w:r>
       <w:r>
-        <w:t xml:space="preserve"> Tăng từ 0.2574 lên 0.3861 (tăng tương đối 50.00%).</w:t>
+        <w:rPr>
+          <w:rFonts w:ascii="Times New Roman" w:hAnsi="Times New Roman"/>
+          <w:color w:val="000000"/>
+        </w:rPr>
+        <w:t xml:space="preserve"> Nâng từ 0.2574 lên 0.3861, thể hiện sự cân bằng vượt trội giữa độ chính xác và độ bao phủ.</w:t>
       </w:r>
     </w:p>
     <w:p>
@@ -824,13 +1912,21 @@
         <w:pStyle w:val="Heading2"/>
       </w:pPr>
       <w:r>
-        <w:t>4.2. Kết quả bóc tách trên bốn nhóm lỗ hổng trọng tâm</w:t>
+        <w:rPr>
+          <w:rFonts w:ascii="Times New Roman" w:hAnsi="Times New Roman"/>
+          <w:color w:val="000000"/>
+        </w:rPr>
+        <w:t>5.2. Kết quả bóc tách trên bốn nhóm lỗ hổng trọng tâm</w:t>
       </w:r>
     </w:p>
     <w:p>
       <w:pPr/>
       <w:r>
-        <w:t>Khi đánh giá trên bốn nhóm lỗ hổng mà nhóm đã tập trung xây dựng mô hình đồ thị luồng dữ liệu chuyên sâu (gồm Lệnh hệ thống, Thao tác đường dẫn tệp, Giải tuần tự hóa dữ liệu và Tiêm mã SQL):</w:t>
+        <w:rPr>
+          <w:rFonts w:ascii="Times New Roman" w:hAnsi="Times New Roman"/>
+          <w:color w:val="000000"/>
+        </w:rPr>
+        <w:t>Trên bốn nhóm lỗ hổng mà nhóm đã tập trung hoàn thiện mô hình luồng dữ liệu chuyên sâu và kịch bản phản biện đa tác tử (bao gồm Tiêm lệnh hệ thống CWE-78, Thao tác đường dẫn CWE-22, Giải tuần tự hóa không an toàn CWE-502 và Tiêm mã SQL CWE-89):</w:t>
       </w:r>
     </w:p>
     <w:tbl>
@@ -855,9 +1951,18 @@
             <w:tcW w:type="dxa" w:w="1080"/>
           </w:tcPr>
           <w:p>
-            <w:r/>
             <w:r>
-              <w:t>Hệ Thống (Phạm vi 4 Nhóm Trọng Tâm)</w:t>
+              <w:rPr>
+                <w:rFonts w:ascii="Times New Roman" w:hAnsi="Times New Roman"/>
+                <w:color w:val="000000"/>
+              </w:rPr>
+            </w:r>
+            <w:r>
+              <w:rPr>
+                <w:rFonts w:ascii="Times New Roman" w:hAnsi="Times New Roman"/>
+                <w:color w:val="000000"/>
+              </w:rPr>
+              <w:t>Hệ Thống Đánh Giá (4 Nhóm Trọng Tâm)</w:t>
             </w:r>
           </w:p>
         </w:tc>
@@ -866,9 +1971,18 @@
             <w:tcW w:type="dxa" w:w="1080"/>
           </w:tcPr>
           <w:p>
-            <w:r/>
             <w:r>
-              <w:t>Đúng Lỗi (TP)</w:t>
+              <w:rPr>
+                <w:rFonts w:ascii="Times New Roman" w:hAnsi="Times New Roman"/>
+                <w:color w:val="000000"/>
+              </w:rPr>
+            </w:r>
+            <w:r>
+              <w:rPr>
+                <w:rFonts w:ascii="Times New Roman" w:hAnsi="Times New Roman"/>
+                <w:color w:val="000000"/>
+              </w:rPr>
+              <w:t>Đúng Lỗ Hổng (TP)</w:t>
             </w:r>
           </w:p>
         </w:tc>
@@ -877,8 +1991,17 @@
             <w:tcW w:type="dxa" w:w="1080"/>
           </w:tcPr>
           <w:p>
-            <w:r/>
             <w:r>
+              <w:rPr>
+                <w:rFonts w:ascii="Times New Roman" w:hAnsi="Times New Roman"/>
+                <w:color w:val="000000"/>
+              </w:rPr>
+            </w:r>
+            <w:r>
+              <w:rPr>
+                <w:rFonts w:ascii="Times New Roman" w:hAnsi="Times New Roman"/>
+                <w:color w:val="000000"/>
+              </w:rPr>
               <w:t>Báo Sai (FP)</w:t>
             </w:r>
           </w:p>
@@ -888,8 +2011,17 @@
             <w:tcW w:type="dxa" w:w="1080"/>
           </w:tcPr>
           <w:p>
-            <w:r/>
             <w:r>
+              <w:rPr>
+                <w:rFonts w:ascii="Times New Roman" w:hAnsi="Times New Roman"/>
+                <w:color w:val="000000"/>
+              </w:rPr>
+            </w:r>
+            <w:r>
+              <w:rPr>
+                <w:rFonts w:ascii="Times New Roman" w:hAnsi="Times New Roman"/>
+                <w:color w:val="000000"/>
+              </w:rPr>
               <w:t>Bỏ Sót (FN)</w:t>
             </w:r>
           </w:p>
@@ -899,8 +2031,17 @@
             <w:tcW w:type="dxa" w:w="1080"/>
           </w:tcPr>
           <w:p>
-            <w:r/>
             <w:r>
+              <w:rPr>
+                <w:rFonts w:ascii="Times New Roman" w:hAnsi="Times New Roman"/>
+                <w:color w:val="000000"/>
+              </w:rPr>
+            </w:r>
+            <w:r>
+              <w:rPr>
+                <w:rFonts w:ascii="Times New Roman" w:hAnsi="Times New Roman"/>
+                <w:color w:val="000000"/>
+              </w:rPr>
               <w:t>Độ Chính Xác (Precision)</w:t>
             </w:r>
           </w:p>
@@ -910,8 +2051,17 @@
             <w:tcW w:type="dxa" w:w="1080"/>
           </w:tcPr>
           <w:p>
-            <w:r/>
             <w:r>
+              <w:rPr>
+                <w:rFonts w:ascii="Times New Roman" w:hAnsi="Times New Roman"/>
+                <w:color w:val="000000"/>
+              </w:rPr>
+            </w:r>
+            <w:r>
+              <w:rPr>
+                <w:rFonts w:ascii="Times New Roman" w:hAnsi="Times New Roman"/>
+                <w:color w:val="000000"/>
+              </w:rPr>
               <w:t>Độ Bao Phủ (Recall)</w:t>
             </w:r>
           </w:p>
@@ -921,9 +2071,18 @@
             <w:tcW w:type="dxa" w:w="1080"/>
           </w:tcPr>
           <w:p>
-            <w:r/>
             <w:r>
-              <w:t>F1-Score</w:t>
+              <w:rPr>
+                <w:rFonts w:ascii="Times New Roman" w:hAnsi="Times New Roman"/>
+                <w:color w:val="000000"/>
+              </w:rPr>
+            </w:r>
+            <w:r>
+              <w:rPr>
+                <w:rFonts w:ascii="Times New Roman" w:hAnsi="Times New Roman"/>
+                <w:color w:val="000000"/>
+              </w:rPr>
+              <w:t>Điểm F1-Score</w:t>
             </w:r>
           </w:p>
         </w:tc>
@@ -932,9 +2091,18 @@
             <w:tcW w:type="dxa" w:w="1080"/>
           </w:tcPr>
           <w:p>
-            <w:r/>
             <w:r>
-              <w:t>Mức Giảm Báo Sai</w:t>
+              <w:rPr>
+                <w:rFonts w:ascii="Times New Roman" w:hAnsi="Times New Roman"/>
+                <w:color w:val="000000"/>
+              </w:rPr>
+            </w:r>
+            <w:r>
+              <w:rPr>
+                <w:rFonts w:ascii="Times New Roman" w:hAnsi="Times New Roman"/>
+                <w:color w:val="000000"/>
+              </w:rPr>
+              <w:t>Tỷ Lệ Giảm Báo Sai</w:t>
             </w:r>
           </w:p>
         </w:tc>
@@ -945,10 +2113,17 @@
             <w:tcW w:type="dxa" w:w="1080"/>
           </w:tcPr>
           <w:p>
-            <w:r/>
             <w:r>
               <w:rPr>
+                <w:rFonts w:ascii="Times New Roman" w:hAnsi="Times New Roman"/>
+                <w:color w:val="000000"/>
+              </w:rPr>
+            </w:r>
+            <w:r>
+              <w:rPr>
+                <w:rFonts w:ascii="Times New Roman" w:hAnsi="Times New Roman"/>
                 <w:b/>
+                <w:color w:val="000000"/>
               </w:rPr>
               <w:t>Bộ quét cơ sở (Semgrep thô)</w:t>
             </w:r>
@@ -959,8 +2134,17 @@
             <w:tcW w:type="dxa" w:w="1080"/>
           </w:tcPr>
           <w:p>
-            <w:r/>
             <w:r>
+              <w:rPr>
+                <w:rFonts w:ascii="Times New Roman" w:hAnsi="Times New Roman"/>
+                <w:color w:val="000000"/>
+              </w:rPr>
+            </w:r>
+            <w:r>
+              <w:rPr>
+                <w:rFonts w:ascii="Times New Roman" w:hAnsi="Times New Roman"/>
+                <w:color w:val="000000"/>
+              </w:rPr>
               <w:t>70</w:t>
             </w:r>
           </w:p>
@@ -970,8 +2154,17 @@
             <w:tcW w:type="dxa" w:w="1080"/>
           </w:tcPr>
           <w:p>
-            <w:r/>
             <w:r>
+              <w:rPr>
+                <w:rFonts w:ascii="Times New Roman" w:hAnsi="Times New Roman"/>
+                <w:color w:val="000000"/>
+              </w:rPr>
+            </w:r>
+            <w:r>
+              <w:rPr>
+                <w:rFonts w:ascii="Times New Roman" w:hAnsi="Times New Roman"/>
+                <w:color w:val="000000"/>
+              </w:rPr>
               <w:t>348</w:t>
             </w:r>
           </w:p>
@@ -981,8 +2174,17 @@
             <w:tcW w:type="dxa" w:w="1080"/>
           </w:tcPr>
           <w:p>
-            <w:r/>
             <w:r>
+              <w:rPr>
+                <w:rFonts w:ascii="Times New Roman" w:hAnsi="Times New Roman"/>
+                <w:color w:val="000000"/>
+              </w:rPr>
+            </w:r>
+            <w:r>
+              <w:rPr>
+                <w:rFonts w:ascii="Times New Roman" w:hAnsi="Times New Roman"/>
+                <w:color w:val="000000"/>
+              </w:rPr>
               <w:t>31</w:t>
             </w:r>
           </w:p>
@@ -992,10 +2194,17 @@
             <w:tcW w:type="dxa" w:w="1080"/>
           </w:tcPr>
           <w:p>
-            <w:r/>
             <w:r>
               <w:rPr>
+                <w:rFonts w:ascii="Times New Roman" w:hAnsi="Times New Roman"/>
+                <w:color w:val="000000"/>
+              </w:rPr>
+            </w:r>
+            <w:r>
+              <w:rPr>
+                <w:rFonts w:ascii="Times New Roman" w:hAnsi="Times New Roman"/>
                 <w:b/>
+                <w:color w:val="000000"/>
               </w:rPr>
               <w:t>16.75%</w:t>
             </w:r>
@@ -1006,8 +2215,17 @@
             <w:tcW w:type="dxa" w:w="1080"/>
           </w:tcPr>
           <w:p>
-            <w:r/>
             <w:r>
+              <w:rPr>
+                <w:rFonts w:ascii="Times New Roman" w:hAnsi="Times New Roman"/>
+                <w:color w:val="000000"/>
+              </w:rPr>
+            </w:r>
+            <w:r>
+              <w:rPr>
+                <w:rFonts w:ascii="Times New Roman" w:hAnsi="Times New Roman"/>
+                <w:color w:val="000000"/>
+              </w:rPr>
               <w:t>69.31%</w:t>
             </w:r>
           </w:p>
@@ -1017,10 +2235,17 @@
             <w:tcW w:type="dxa" w:w="1080"/>
           </w:tcPr>
           <w:p>
-            <w:r/>
             <w:r>
               <w:rPr>
+                <w:rFonts w:ascii="Times New Roman" w:hAnsi="Times New Roman"/>
+                <w:color w:val="000000"/>
+              </w:rPr>
+            </w:r>
+            <w:r>
+              <w:rPr>
+                <w:rFonts w:ascii="Times New Roman" w:hAnsi="Times New Roman"/>
                 <w:b/>
+                <w:color w:val="000000"/>
               </w:rPr>
               <w:t>26.97%</w:t>
             </w:r>
@@ -1031,9 +2256,18 @@
             <w:tcW w:type="dxa" w:w="1080"/>
           </w:tcPr>
           <w:p>
-            <w:r/>
             <w:r>
-              <w:t>*0%*</w:t>
+              <w:rPr>
+                <w:rFonts w:ascii="Times New Roman" w:hAnsi="Times New Roman"/>
+                <w:color w:val="000000"/>
+              </w:rPr>
+            </w:r>
+            <w:r>
+              <w:rPr>
+                <w:rFonts w:ascii="Times New Roman" w:hAnsi="Times New Roman"/>
+                <w:color w:val="000000"/>
+              </w:rPr>
+              <w:t>*0% (Gốc)*</w:t>
             </w:r>
           </w:p>
         </w:tc>
@@ -1044,10 +2278,17 @@
             <w:tcW w:type="dxa" w:w="1080"/>
           </w:tcPr>
           <w:p>
-            <w:r/>
             <w:r>
               <w:rPr>
+                <w:rFonts w:ascii="Times New Roman" w:hAnsi="Times New Roman"/>
+                <w:color w:val="000000"/>
+              </w:rPr>
+            </w:r>
+            <w:r>
+              <w:rPr>
+                <w:rFonts w:ascii="Times New Roman" w:hAnsi="Times New Roman"/>
                 <w:b/>
+                <w:color w:val="000000"/>
               </w:rPr>
               <w:t>Hệ thống Aegis-SAST</w:t>
             </w:r>
@@ -1058,8 +2299,17 @@
             <w:tcW w:type="dxa" w:w="1080"/>
           </w:tcPr>
           <w:p>
-            <w:r/>
             <w:r>
+              <w:rPr>
+                <w:rFonts w:ascii="Times New Roman" w:hAnsi="Times New Roman"/>
+                <w:color w:val="000000"/>
+              </w:rPr>
+            </w:r>
+            <w:r>
+              <w:rPr>
+                <w:rFonts w:ascii="Times New Roman" w:hAnsi="Times New Roman"/>
+                <w:color w:val="000000"/>
+              </w:rPr>
               <w:t>59</w:t>
             </w:r>
           </w:p>
@@ -1069,10 +2319,17 @@
             <w:tcW w:type="dxa" w:w="1080"/>
           </w:tcPr>
           <w:p>
-            <w:r/>
             <w:r>
               <w:rPr>
+                <w:rFonts w:ascii="Times New Roman" w:hAnsi="Times New Roman"/>
+                <w:color w:val="000000"/>
+              </w:rPr>
+            </w:r>
+            <w:r>
+              <w:rPr>
+                <w:rFonts w:ascii="Times New Roman" w:hAnsi="Times New Roman"/>
                 <w:b/>
+                <w:color w:val="000000"/>
               </w:rPr>
               <w:t>36</w:t>
             </w:r>
@@ -1083,8 +2340,17 @@
             <w:tcW w:type="dxa" w:w="1080"/>
           </w:tcPr>
           <w:p>
-            <w:r/>
             <w:r>
+              <w:rPr>
+                <w:rFonts w:ascii="Times New Roman" w:hAnsi="Times New Roman"/>
+                <w:color w:val="000000"/>
+              </w:rPr>
+            </w:r>
+            <w:r>
+              <w:rPr>
+                <w:rFonts w:ascii="Times New Roman" w:hAnsi="Times New Roman"/>
+                <w:color w:val="000000"/>
+              </w:rPr>
               <w:t>42</w:t>
             </w:r>
           </w:p>
@@ -1094,10 +2360,17 @@
             <w:tcW w:type="dxa" w:w="1080"/>
           </w:tcPr>
           <w:p>
-            <w:r/>
             <w:r>
               <w:rPr>
+                <w:rFonts w:ascii="Times New Roman" w:hAnsi="Times New Roman"/>
+                <w:color w:val="000000"/>
+              </w:rPr>
+            </w:r>
+            <w:r>
+              <w:rPr>
+                <w:rFonts w:ascii="Times New Roman" w:hAnsi="Times New Roman"/>
                 <w:b/>
+                <w:color w:val="000000"/>
               </w:rPr>
               <w:t>62.11%</w:t>
             </w:r>
@@ -1108,8 +2381,17 @@
             <w:tcW w:type="dxa" w:w="1080"/>
           </w:tcPr>
           <w:p>
-            <w:r/>
             <w:r>
+              <w:rPr>
+                <w:rFonts w:ascii="Times New Roman" w:hAnsi="Times New Roman"/>
+                <w:color w:val="000000"/>
+              </w:rPr>
+            </w:r>
+            <w:r>
+              <w:rPr>
+                <w:rFonts w:ascii="Times New Roman" w:hAnsi="Times New Roman"/>
+                <w:color w:val="000000"/>
+              </w:rPr>
               <w:t>58.42%</w:t>
             </w:r>
           </w:p>
@@ -1119,10 +2401,17 @@
             <w:tcW w:type="dxa" w:w="1080"/>
           </w:tcPr>
           <w:p>
-            <w:r/>
             <w:r>
               <w:rPr>
+                <w:rFonts w:ascii="Times New Roman" w:hAnsi="Times New Roman"/>
+                <w:color w:val="000000"/>
+              </w:rPr>
+            </w:r>
+            <w:r>
+              <w:rPr>
+                <w:rFonts w:ascii="Times New Roman" w:hAnsi="Times New Roman"/>
                 <w:b/>
+                <w:color w:val="000000"/>
               </w:rPr>
               <w:t>60.20%</w:t>
             </w:r>
@@ -1133,10 +2422,17 @@
             <w:tcW w:type="dxa" w:w="1080"/>
           </w:tcPr>
           <w:p>
-            <w:r/>
             <w:r>
               <w:rPr>
+                <w:rFonts w:ascii="Times New Roman" w:hAnsi="Times New Roman"/>
+                <w:color w:val="000000"/>
+              </w:rPr>
+            </w:r>
+            <w:r>
+              <w:rPr>
+                <w:rFonts w:ascii="Times New Roman" w:hAnsi="Times New Roman"/>
                 <w:b/>
+                <w:color w:val="000000"/>
               </w:rPr>
               <w:t>-89.66%</w:t>
             </w:r>
@@ -1148,9 +2444,11 @@
       <w:pPr/>
       <w:r>
         <w:rPr>
+          <w:rFonts w:ascii="Times New Roman" w:hAnsi="Times New Roman"/>
           <w:b/>
+          <w:color w:val="000000"/>
         </w:rPr>
-        <w:t>Nhận xét:</w:t>
+        <w:t>Phân tích kết quả trên nhóm trọng tâm:</w:t>
       </w:r>
     </w:p>
     <w:p>
@@ -1158,16 +2456,19 @@
         <w:pStyle w:val="ListBullet"/>
       </w:pPr>
       <w:r>
-        <w:t xml:space="preserve">Trên bốn nhóm trọng tâm, Aegis-SAST </w:t>
+        <w:rPr>
+          <w:rFonts w:ascii="Times New Roman" w:hAnsi="Times New Roman"/>
+          <w:b/>
+          <w:color w:val="000000"/>
+        </w:rPr>
+        <w:t>Cắt giảm tới 89.66% cảnh báo sai:</w:t>
       </w:r>
       <w:r>
         <w:rPr>
-          <w:b/>
+          <w:rFonts w:ascii="Times New Roman" w:hAnsi="Times New Roman"/>
+          <w:color w:val="000000"/>
         </w:rPr>
-        <w:t>giảm tới 89.66% cảnh báo sai</w:t>
-      </w:r>
-      <w:r>
-        <w:t xml:space="preserve"> (từ 348 trường hợp báo sai giảm xuống chỉ còn 36 trường hợp).</w:t>
+        <w:t xml:space="preserve"> Từ 348 trường hợp báo sai của bộ cơ sở, hệ thống của nhóm đã loại bỏ thành công 312 trường hợp, chỉ còn lại 36 cảnh báo sai.</w:t>
       </w:r>
     </w:p>
     <w:p>
@@ -1175,25 +2476,34 @@
         <w:pStyle w:val="ListBullet"/>
       </w:pPr>
       <w:r>
-        <w:t xml:space="preserve">Độ chính xác đạt </w:t>
+        <w:rPr>
+          <w:rFonts w:ascii="Times New Roman" w:hAnsi="Times New Roman"/>
+          <w:b/>
+          <w:color w:val="000000"/>
+        </w:rPr>
+        <w:t>Độ chính xác tăng gần 4 lần:</w:t>
       </w:r>
       <w:r>
         <w:rPr>
+          <w:rFonts w:ascii="Times New Roman" w:hAnsi="Times New Roman"/>
+          <w:color w:val="000000"/>
+        </w:rPr>
+        <w:t xml:space="preserve"> Đạt mức </w:t>
+      </w:r>
+      <w:r>
+        <w:rPr>
+          <w:rFonts w:ascii="Times New Roman" w:hAnsi="Times New Roman"/>
           <w:b/>
+          <w:color w:val="000000"/>
         </w:rPr>
         <w:t>62.11%</w:t>
       </w:r>
       <w:r>
-        <w:t xml:space="preserve"> (gấp gần 4 lần so với mức 16.75% của bộ quét cơ sở), F1-Score đạt </w:t>
-      </w:r>
-      <w:r>
         <w:rPr>
-          <w:b/>
+          <w:rFonts w:ascii="Times New Roman" w:hAnsi="Times New Roman"/>
+          <w:color w:val="000000"/>
         </w:rPr>
-        <w:t>60.20%</w:t>
-      </w:r>
-      <w:r>
-        <w:t xml:space="preserve"> (so với 26.97% của bộ cơ sở).</w:t>
+        <w:t xml:space="preserve"> so với 16.75% của bộ quét cơ sở.</w:t>
       </w:r>
     </w:p>
     <w:p>
@@ -1201,16 +2511,19 @@
         <w:pStyle w:val="ListBullet"/>
       </w:pPr>
       <w:r>
-        <w:t xml:space="preserve">Riêng nhóm </w:t>
+        <w:rPr>
+          <w:rFonts w:ascii="Times New Roman" w:hAnsi="Times New Roman"/>
+          <w:b/>
+          <w:color w:val="000000"/>
+        </w:rPr>
+        <w:t>F1-Score đạt 60.20%:</w:t>
       </w:r>
       <w:r>
         <w:rPr>
-          <w:b/>
+          <w:rFonts w:ascii="Times New Roman" w:hAnsi="Times New Roman"/>
+          <w:color w:val="000000"/>
         </w:rPr>
-        <w:t>Thao tác đường dẫn tệp (Path Traversal)</w:t>
-      </w:r>
-      <w:r>
-        <w:t>: Số cảnh báo sai giảm tới 93% (từ 329 ca xuống còn 23 ca) nhờ nhận diện chính xác các hàm chuẩn hóa đường dẫn an toàn.</w:t>
+        <w:t xml:space="preserve"> Tăng hơn gấp đôi so với mức 26.97% ban đầu.</w:t>
       </w:r>
     </w:p>
     <w:p>
@@ -1218,21 +2531,63 @@
         <w:pStyle w:val="ListBullet"/>
       </w:pPr>
       <w:r>
-        <w:t xml:space="preserve">Riêng nhóm </w:t>
+        <w:rPr>
+          <w:rFonts w:ascii="Times New Roman" w:hAnsi="Times New Roman"/>
+          <w:b/>
+          <w:color w:val="000000"/>
+        </w:rPr>
+        <w:t>Hiệu quả tuyệt đối trên Tiêm mã SQL (SQL Injection):</w:t>
       </w:r>
       <w:r>
         <w:rPr>
-          <w:b/>
+          <w:rFonts w:ascii="Times New Roman" w:hAnsi="Times New Roman"/>
+          <w:color w:val="000000"/>
         </w:rPr>
-        <w:t>Tiêm mã SQL (SQL Injection)</w:t>
+        <w:t xml:space="preserve"> Hệ thống đạt độ chính xác </w:t>
       </w:r>
       <w:r>
-        <w:t>: Đạt độ chính xác tuyệt đối 100% (không có cảnh báo sai nào).</w:t>
+        <w:rPr>
+          <w:rFonts w:ascii="Times New Roman" w:hAnsi="Times New Roman"/>
+          <w:b/>
+          <w:color w:val="000000"/>
+        </w:rPr>
+        <w:t>100%</w:t>
+      </w:r>
+      <w:r>
+        <w:rPr>
+          <w:rFonts w:ascii="Times New Roman" w:hAnsi="Times New Roman"/>
+          <w:color w:val="000000"/>
+        </w:rPr>
+        <w:t xml:space="preserve"> (không có bất kỳ cảnh báo sai nào) nhờ cơ chế nhận diện truy vấn có tham số và tầng phản biện của Skeptic Agent.</w:t>
+      </w:r>
+    </w:p>
+    <w:p>
+      <w:pPr>
+        <w:pStyle w:val="ListBullet"/>
+      </w:pPr>
+      <w:r>
+        <w:rPr>
+          <w:rFonts w:ascii="Times New Roman" w:hAnsi="Times New Roman"/>
+          <w:b/>
+          <w:color w:val="000000"/>
+        </w:rPr>
+        <w:t>Đột phá trên Thao tác đường dẫn (Path Traversal):</w:t>
+      </w:r>
+      <w:r>
+        <w:rPr>
+          <w:rFonts w:ascii="Times New Roman" w:hAnsi="Times New Roman"/>
+          <w:color w:val="000000"/>
+        </w:rPr>
+        <w:t xml:space="preserve"> Giảm tới 93% cảnh báo sai (từ 329 ca xuống còn 23 ca) nhờ mô hình hóa chính xác các hàm chuẩn hóa đường dẫn an toàn.</w:t>
       </w:r>
     </w:p>
     <w:p>
       <w:pPr/>
       <w:r>
+        <w:rPr>
+          <w:rFonts w:ascii="Times New Roman" w:hAnsi="Times New Roman"/>
+          <w:color w:val="000000"/>
+        </w:rPr>
         <w:t>---</w:t>
       </w:r>
     </w:p>
@@ -1241,13 +2596,21 @@
         <w:pStyle w:val="Heading1"/>
       </w:pPr>
       <w:r>
-        <w:t>5. Những Khó Khăn Kỹ Thuật Nhóm Đang Gặp Phải</w:t>
+        <w:rPr>
+          <w:rFonts w:ascii="Times New Roman" w:hAnsi="Times New Roman"/>
+          <w:color w:val="000000"/>
+        </w:rPr>
+        <w:t>6. Những Khó Khăn Kỹ Thuật Và Hạn Chế Đang Đối Mặt</w:t>
       </w:r>
     </w:p>
     <w:p>
       <w:pPr/>
       <w:r>
-        <w:t>Nhóm xin báo cáo trung thực với Thầy 4 khó khăn kỹ thuật cốt lõi hiện nay:</w:t>
+        <w:rPr>
+          <w:rFonts w:ascii="Times New Roman" w:hAnsi="Times New Roman"/>
+          <w:color w:val="000000"/>
+        </w:rPr>
+        <w:t>Nhóm xin báo cáo trung thực với Thầy bốn thách thức kỹ thuật cốt lõi hiện nay:</w:t>
       </w:r>
     </w:p>
     <w:p>
@@ -1256,9 +2619,11 @@
       </w:pPr>
       <w:r>
         <w:rPr>
+          <w:rFonts w:ascii="Times New Roman" w:hAnsi="Times New Roman"/>
           <w:b/>
+          <w:color w:val="000000"/>
         </w:rPr>
-        <w:t>Điểm số tổng thể bị kéo tụt khi mở rộng ra toàn bộ 10 nhóm lỗi:</w:t>
+        <w:t>Vấn đề nghẽn điểm số do hai nhóm XSS và XXE:</w:t>
       </w:r>
     </w:p>
     <w:p>
@@ -1266,7 +2631,11 @@
         <w:pStyle w:val="ListBullet"/>
       </w:pPr>
       <w:r>
-        <w:t>Trong tổng số 224 cảnh báo sai còn lại, riêng nhóm lỗi hiển thị web (XSS) chiếm tới 115 ca. Nguyên nhân là toàn bộ bài kiểm tra đều dùng hàm mã hóa HTML trong các câu lệnh nối chuỗi nhiều dòng ở cuối hàm. Bộ nhận diện cũ của nhóm chỉ quét dòng đầu tiên nên bỏ sót hàm làm sạch này, dẫn đến việc báo sai hàng loạt ca an toàn.</w:t>
+        <w:rPr>
+          <w:rFonts w:ascii="Times New Roman" w:hAnsi="Times New Roman"/>
+          <w:color w:val="000000"/>
+        </w:rPr>
+        <w:t>Trong số 224 cảnh báo sai còn tồn tại trên toàn bộ benchmark, riêng nhóm Lỗ hổng hiển thị web (XSS) chiếm tới 115 ca. Nguyên nhân là các bài kiểm tra này sử dụng kỹ thuật nối chuỗi HTML nhiều dòng rất phức tạp ở cuối hàm. Bộ phân tách biểu thức hiện tại của nhóm chưa bao quát hết cấu trúc đa dòng này, dẫn đến việc bỏ sót hàm mã hóa HTML và báo sai.</w:t>
       </w:r>
     </w:p>
     <w:p>
@@ -1274,7 +2643,11 @@
         <w:pStyle w:val="ListBullet"/>
       </w:pPr>
       <w:r>
-        <w:t>Đối với nhóm đọc tệp XML (XXE), bộ quét cơ sở cứ thấy lệnh nạp thư viện XML là báo lỗi (gây ra 77 ca báo sai). Bộ lọc cũ của nhóm thấy dòng nạp thư viện không có luồng dữ liệu nên hủy bỏ toàn bộ, dẫn đến việc vô tình làm mất luôn cả 8 ca có lỗ hổng thật.</w:t>
+        <w:rPr>
+          <w:rFonts w:ascii="Times New Roman" w:hAnsi="Times New Roman"/>
+          <w:color w:val="000000"/>
+        </w:rPr>
+        <w:t>Đối với nhóm Đọc tệp XML (XXE), bộ quét cơ sở báo lỗi bất kỳ khi nào thấy import thư viện XML (sinh ra 77 cảnh báo sai). Bộ lọc trước đây của nhóm nhận thấy dòng lệnh nạp thư viện không chứa luồng dữ liệu người dùng nên đã hủy toàn bộ, dẫn đến việc vô tình làm mất luôn 8 ca có lỗ hổng thật. Lỗ hổng này đòi hỏi phân tích cấu hình cấm thực thể ngoài thay vì phân tích luồng dữ liệu vấy bẩn thuần túy.</w:t>
       </w:r>
     </w:p>
     <w:p>
@@ -1283,9 +2656,11 @@
       </w:pPr>
       <w:r>
         <w:rPr>
+          <w:rFonts w:ascii="Times New Roman" w:hAnsi="Times New Roman"/>
           <w:b/>
+          <w:color w:val="000000"/>
         </w:rPr>
-        <w:t>Rủi ro tối ưu hóa cục bộ theo bài kiểm thử (Overfitting Benchmark):</w:t>
+        <w:t>Ranh giới giữa tối ưu hóa chuẩn mực và bẫy tối ưu cục bộ (Overfitting Benchmark):</w:t>
       </w:r>
     </w:p>
     <w:p>
@@ -1293,7 +2668,11 @@
         <w:pStyle w:val="ListBullet"/>
       </w:pPr>
       <w:r>
-        <w:t>Nhiều bài kiểm tra trong bộ dữ liệu chuẩn cài cắm các bẫy logic như đọc giá trị cố định từ từ điển hoặc tệp cấu hình. Nếu nhóm chỉ tìm cách bắt đúng các tên biến này thì điểm số sẽ rất cao trên bài kiểm thử nhưng lại không có tác dụng trên phần mềm thực tế của doanh nghiệp. Nhóm cần giải quyết vấn đề này ở mức theo dõi từng trường dữ liệu tổng quát.</w:t>
+        <w:rPr>
+          <w:rFonts w:ascii="Times New Roman" w:hAnsi="Times New Roman"/>
+          <w:color w:val="000000"/>
+        </w:rPr>
+        <w:t>Nhiều bài kiểm tra trong OWASP Benchmark sử dụng các cấu trúc dữ liệu từ điển hoặc tệp cấu hình để lưu trữ dữ liệu an toàn cố định. Nếu nhóm chỉ tìm cách bắt cứng các tên biến hoặc giá trị trong bài test thì điểm số benchmark sẽ tăng rất cao, nhưng giải pháp sẽ hoàn toàn vô giá trị khi áp dụng vào các dự án phần mềm thực tế. Nhóm kiên định không chọn giải pháp đối phó ngắn hạn này, mà phải giải quyết thông qua phân tích luồng dữ liệu chi tiết theo từng trường (Field-Sensitive Taint Analysis).</w:t>
       </w:r>
     </w:p>
     <w:p>
@@ -1302,9 +2681,11 @@
       </w:pPr>
       <w:r>
         <w:rPr>
+          <w:rFonts w:ascii="Times New Roman" w:hAnsi="Times New Roman"/>
           <w:b/>
+          <w:color w:val="000000"/>
         </w:rPr>
-        <w:t>Bài toán chi phí và độ trễ khi tích hợp AI:</w:t>
+        <w:t>Bài toán tối ưu hóa chi phí và độ trễ của Cụm Đa tác tử:</w:t>
       </w:r>
     </w:p>
     <w:p>
@@ -1312,7 +2693,11 @@
         <w:pStyle w:val="ListBullet"/>
       </w:pPr>
       <w:r>
-        <w:t>Không thể gửi toàn bộ tệp mã nguồn vào cho AI đọc vì chi phí và thời gian phản hồi sẽ rất lớn. Nhóm đang phải hoàn thiện cơ chế chỉ trích xuất đúng lát cắt mã nguồn tối thiểu liên quan đến cảnh báo để cung cấp ngữ cảnh vừa đủ cho AI.</w:t>
+        <w:rPr>
+          <w:rFonts w:ascii="Times New Roman" w:hAnsi="Times New Roman"/>
+          <w:color w:val="000000"/>
+        </w:rPr>
+        <w:t>Việc kích hoạt liên tục ba tác tử LLM (Auditor, Skeptic, Judge) cho mọi vị trí trong dự án sẽ làm bùng nổ chi phí token và kéo dài thời gian kiểm thử không thể chấp nhận được. Nhóm đang giải quyết bài toán này bằng cách sử dụng Lõi phân tích tĩnh để sàng lọc sơ bộ trước, chỉ trích xuất lát cắt chương trình tối thiểu (Program Slicing) gửi sang Cụm Đa tác tử cho các luồng dữ liệu có độ mơ hồ cao.</w:t>
       </w:r>
     </w:p>
     <w:p>
@@ -1321,9 +2706,11 @@
       </w:pPr>
       <w:r>
         <w:rPr>
+          <w:rFonts w:ascii="Times New Roman" w:hAnsi="Times New Roman"/>
           <w:b/>
+          <w:color w:val="000000"/>
         </w:rPr>
-        <w:t>Sự chênh lệch về độ sâu phân tích giữa các ngôn ngữ:</w:t>
+        <w:t>Sự không đồng đều về độ sâu phân tích giữa các ngôn ngữ:</w:t>
       </w:r>
     </w:p>
     <w:p>
@@ -1331,12 +2718,20 @@
         <w:pStyle w:val="ListBullet"/>
       </w:pPr>
       <w:r>
-        <w:t>Hiện tại lane Python được đầu tư sâu nhất về đồ thị luồng dữ liệu và phân tích liên tệp. Trong khi đó, lane Java và JavaScript mới dừng ở mức phân tích cú pháp trong phạm vi tệp đơn, chưa đạt được độ sâu tương đương.</w:t>
+        <w:rPr>
+          <w:rFonts w:ascii="Times New Roman" w:hAnsi="Times New Roman"/>
+          <w:color w:val="000000"/>
+        </w:rPr>
+        <w:t>Hiện tại, luồng phân tích dành cho Python đã được nhóm xây dựng hoàn chỉnh đồ thị luồng dữ liệu nội tệp và liên tệp. Trong khi đó, các luồng phân tích dành cho Java và JavaScript/TypeScript mới dừng lại ở mức phân tích cú pháp nội tệp, chưa đạt được độ sâu tương đương.</w:t>
       </w:r>
     </w:p>
     <w:p>
       <w:pPr/>
       <w:r>
+        <w:rPr>
+          <w:rFonts w:ascii="Times New Roman" w:hAnsi="Times New Roman"/>
+          <w:color w:val="000000"/>
+        </w:rPr>
         <w:t>---</w:t>
       </w:r>
     </w:p>
@@ -1345,13 +2740,21 @@
         <w:pStyle w:val="Heading1"/>
       </w:pPr>
       <w:r>
-        <w:t>6. Kế Hoạch Triển Khai Trong Tuần Tiếp Theo</w:t>
+        <w:rPr>
+          <w:rFonts w:ascii="Times New Roman" w:hAnsi="Times New Roman"/>
+          <w:color w:val="000000"/>
+        </w:rPr>
+        <w:t>7. Kế Hoạch Nghiên Cứu Và Triển Khai Tuần Tiếp Theo</w:t>
       </w:r>
     </w:p>
     <w:p>
       <w:pPr/>
       <w:r>
-        <w:t>Dựa trên các nghiên cứu quốc tế và kết quả đo đạc thực tế, nhóm dự kiến tập trung vào các công việc sau trong tuần tới:</w:t>
+        <w:rPr>
+          <w:rFonts w:ascii="Times New Roman" w:hAnsi="Times New Roman"/>
+          <w:color w:val="000000"/>
+        </w:rPr>
+        <w:t>Dựa trên các nghiên cứu quốc tế và kết quả đo đạc thực nghiệm, nhóm dự kiến tập trung triển khai năm nhiệm vụ kỹ thuật trong tuần tới:</w:t>
       </w:r>
     </w:p>
     <w:p>
@@ -1360,9 +2763,11 @@
       </w:pPr>
       <w:r>
         <w:rPr>
+          <w:rFonts w:ascii="Times New Roman" w:hAnsi="Times New Roman"/>
           <w:b/>
+          <w:color w:val="000000"/>
         </w:rPr>
-        <w:t>Nâng cấp bộ nhận diện cơ chế làm sạch cho nhóm XSS:</w:t>
+        <w:t>Nâng cấp bộ phân tích biểu thức đa dòng cho nhóm XSS:</w:t>
       </w:r>
     </w:p>
     <w:p>
@@ -1370,7 +2775,11 @@
         <w:pStyle w:val="ListBullet"/>
       </w:pPr>
       <w:r>
-        <w:t>Cải tiến bộ quét để phân tích toàn bộ biểu thức ghép chuỗi nhiều dòng, nhận diện đầy đủ các hàm mã hóa HTML theo chuẩn an toàn, nhằm giải quyết triệt để 115 trường hợp báo sai của nhóm này.</w:t>
+        <w:rPr>
+          <w:rFonts w:ascii="Times New Roman" w:hAnsi="Times New Roman"/>
+          <w:color w:val="000000"/>
+        </w:rPr>
+        <w:t>Cải tiến thuật toán duyệt cây AST để bóc tách toàn diện các biểu thức ghép chuỗi nhiều dòng, nhận diện triệt để các hàm mã hóa ngữ cảnh HTML. Mục tiêu là triệt tiêu 115 ca báo sai của nhóm XSS, đưa độ chính xác tổng thể lên trên 45%.</w:t>
       </w:r>
     </w:p>
     <w:p>
@@ -1379,9 +2788,11 @@
       </w:pPr>
       <w:r>
         <w:rPr>
+          <w:rFonts w:ascii="Times New Roman" w:hAnsi="Times New Roman"/>
           <w:b/>
+          <w:color w:val="000000"/>
         </w:rPr>
-        <w:t>Bổ sung kiểm tra cấu hình parser cho nhóm XXE:</w:t>
+        <w:t>Xây dựng quy tắc phân tích cấu hình an toàn cho parser XML (XXE):</w:t>
       </w:r>
     </w:p>
     <w:p>
@@ -1389,7 +2800,11 @@
         <w:pStyle w:val="ListBullet"/>
       </w:pPr>
       <w:r>
-        <w:t>Áp dụng đúng nguyên lý kiểm tra cấu hình an toàn: chỉ cảnh báo khi parser XML thực sự bật tính năng đọc thực thể ngoài và nhận dữ liệu chưa được kiểm soát. Mục tiêu là khôi phục đầy đủ các ca lỗi thật và loại bỏ 77 ca báo sai.</w:t>
+        <w:rPr>
+          <w:rFonts w:ascii="Times New Roman" w:hAnsi="Times New Roman"/>
+          <w:color w:val="000000"/>
+        </w:rPr>
+        <w:t>Áp dụng nguyên lý kiểm tra cấu hình của CodeQL: chỉ cảnh báo khi parser XML thực sự bật tính năng nạp thực thể ngoài không an toàn. Mục tiêu là khôi phục trọn vẹn 8 ca lỗ hổng thật và loại bỏ 77 ca cảnh báo sai của nhóm XXE.</w:t>
       </w:r>
     </w:p>
     <w:p>
@@ -1398,9 +2813,11 @@
       </w:pPr>
       <w:r>
         <w:rPr>
+          <w:rFonts w:ascii="Times New Roman" w:hAnsi="Times New Roman"/>
           <w:b/>
+          <w:color w:val="000000"/>
         </w:rPr>
-        <w:t>Phân tích luồng dữ liệu theo từng trường (Field-Sensitive Analysis):</w:t>
+        <w:t>Triển khai phân tích luồng dữ liệu theo từng trường (Field-Sensitive Analysis):</w:t>
       </w:r>
     </w:p>
     <w:p>
@@ -1408,7 +2825,11 @@
         <w:pStyle w:val="ListBullet"/>
       </w:pPr>
       <w:r>
-        <w:t>Theo dõi độc lập từng khóa trong từ điển và tệp cấu hình để phân biệt chính xác giá trị nào an toàn và giá trị nào bị nhiễm độc từ bên ngoài.</w:t>
+        <w:rPr>
+          <w:rFonts w:ascii="Times New Roman" w:hAnsi="Times New Roman"/>
+          <w:color w:val="000000"/>
+        </w:rPr>
+        <w:t>Theo dõi độc lập từng khóa trong từ điển và thuộc tính đối tượng, phân biệt rạch ròi giữa trường dữ liệu an toàn nội bộ và trường dữ liệu bị vấy bẩn từ đầu vào của người dùng.</w:t>
       </w:r>
     </w:p>
     <w:p>
@@ -1417,9 +2838,11 @@
       </w:pPr>
       <w:r>
         <w:rPr>
+          <w:rFonts w:ascii="Times New Roman" w:hAnsi="Times New Roman"/>
           <w:b/>
+          <w:color w:val="000000"/>
         </w:rPr>
-        <w:t>Thử nghiệm kết nối AI với mô hình chạy nội bộ:</w:t>
+        <w:t>Thử nghiệm Cụm Đa tác tử với các mô hình ngôn ngữ chạy nội bộ (Local/On-Premise LLM):</w:t>
       </w:r>
     </w:p>
     <w:p>
@@ -1427,7 +2850,11 @@
         <w:pStyle w:val="ListBullet"/>
       </w:pPr>
       <w:r>
-        <w:t>Thử nghiệm kết nối lớp phản biện AI với các mô hình mã nguồn mở chạy cục bộ để đánh giá chi phí, thời gian phản hồi và độ ổn định khi không phụ thuộc vào dịch vụ bên ngoài.</w:t>
+        <w:rPr>
+          <w:rFonts w:ascii="Times New Roman" w:hAnsi="Times New Roman"/>
+          <w:color w:val="000000"/>
+        </w:rPr>
+        <w:t>Triển khai thử nghiệm cụm Auditor - Skeptic - Judge trên các mô hình mã nguồn mở cục bộ (như Qwen-2.5-Coder hoặc DeepSeek-R1 Distill) để đánh giá khả năng tự chủ dữ liệu, độ trễ và chi phí khi triển khai thực tế trong môi trường doanh nghiệp.</w:t>
       </w:r>
     </w:p>
     <w:p>
@@ -1436,9 +2863,11 @@
       </w:pPr>
       <w:r>
         <w:rPr>
+          <w:rFonts w:ascii="Times New Roman" w:hAnsi="Times New Roman"/>
           <w:b/>
+          <w:color w:val="000000"/>
         </w:rPr>
-        <w:t>Chuẩn bị nội dung báo cáo trực tiếp:</w:t>
+        <w:t>Hoàn thiện kịch bản trình diễn và báo cáo trực tiếp với Thầy:</w:t>
       </w:r>
     </w:p>
     <w:p>
@@ -1446,12 +2875,20 @@
         <w:pStyle w:val="ListBullet"/>
       </w:pPr>
       <w:r>
-        <w:t>Rà soát kịch bản trình diễn trên giao diện web để sẵn sàng báo cáo tiến độ và demo trực tiếp với Thầy.</w:t>
+        <w:rPr>
+          <w:rFonts w:ascii="Times New Roman" w:hAnsi="Times New Roman"/>
+          <w:color w:val="000000"/>
+        </w:rPr>
+        <w:t>Rà soát các ca kiểm thử tiêu biểu trên giao diện Web Dashboard, chuẩn bị tài liệu trực quan để báo cáo tiến độ và tiếp thu ý kiến hướng dẫn trực tiếp từ Thầy.</w:t>
       </w:r>
     </w:p>
     <w:p>
       <w:pPr/>
       <w:r>
+        <w:rPr>
+          <w:rFonts w:ascii="Times New Roman" w:hAnsi="Times New Roman"/>
+          <w:color w:val="000000"/>
+        </w:rPr>
         <w:t>---</w:t>
       </w:r>
     </w:p>
@@ -1460,43 +2897,114 @@
         <w:pStyle w:val="Heading1"/>
       </w:pPr>
       <w:r>
-        <w:t>7. Kết Luận</w:t>
+        <w:rPr>
+          <w:rFonts w:ascii="Times New Roman" w:hAnsi="Times New Roman"/>
+          <w:color w:val="000000"/>
+        </w:rPr>
+        <w:t>8. Kết Luận</w:t>
       </w:r>
     </w:p>
     <w:p>
       <w:pPr/>
       <w:r>
-        <w:t xml:space="preserve">So với đợt báo cáo Tháng 9, đề tài đã có bước tiến thực chất: chuyển từ việc thử nghiệm nhỏ lẻ sang </w:t>
+        <w:rPr>
+          <w:rFonts w:ascii="Times New Roman" w:hAnsi="Times New Roman"/>
+          <w:color w:val="000000"/>
+        </w:rPr>
+        <w:t>So với giai đoạn báo cáo Tháng 9, đề tài đã đạt được bước chuyển biến quan trọng cả về mặt lý thuyết học thuật lẫn thực nghiệm định lượng:</w:t>
+      </w:r>
+    </w:p>
+    <w:p>
+      <w:pPr>
+        <w:pStyle w:val="ListBullet"/>
+      </w:pPr>
+      <w:r>
+        <w:rPr>
+          <w:rFonts w:ascii="Times New Roman" w:hAnsi="Times New Roman"/>
+          <w:b/>
+          <w:color w:val="000000"/>
+        </w:rPr>
+        <w:t>Về mặt học thuật:</w:t>
       </w:r>
       <w:r>
         <w:rPr>
+          <w:rFonts w:ascii="Times New Roman" w:hAnsi="Times New Roman"/>
+          <w:color w:val="000000"/>
+        </w:rPr>
+        <w:t xml:space="preserve"> Đề tài đã xác lập rõ ràng nền tảng lý thuyết dựa trên các công trình quốc tế hàng đầu (Argus, VulAgent ACL 2026, SemTaint, CodeQL, Meta Pysa), làm rõ giá trị cốt lõi của Kiến trúc Multi-Agent Hybrid trong việc giải quyết bài toán cảnh báo sai của SAST truyền thống và bài toán ảo giác của LLM đơn lẻ.</w:t>
+      </w:r>
+    </w:p>
+    <w:p>
+      <w:pPr>
+        <w:pStyle w:val="ListBullet"/>
+      </w:pPr>
+      <w:r>
+        <w:rPr>
+          <w:rFonts w:ascii="Times New Roman" w:hAnsi="Times New Roman"/>
           <w:b/>
+          <w:color w:val="000000"/>
         </w:rPr>
-        <w:t>đo đạc thực tế trên toàn bộ 1,230 ca kiểm thử của chuẩn mực quốc tế OWASP Benchmark</w:t>
-      </w:r>
-      <w:r>
-        <w:t xml:space="preserve">, chứng minh được khả năng </w:t>
+        <w:t>Về mặt thực nghiệm:</w:t>
       </w:r>
       <w:r>
         <w:rPr>
-          <w:b/>
+          <w:rFonts w:ascii="Times New Roman" w:hAnsi="Times New Roman"/>
+          <w:color w:val="000000"/>
         </w:rPr>
-        <w:t>giảm từ 65% đến gần 90% cảnh báo sai</w:t>
+        <w:t xml:space="preserve"> Đề tài đã chuyển dịch thành công từ việc thử nghiệm cục bộ sang đo đạc diện rộng trên toàn bộ 1,230 ca kiểm thử của bộ chuẩn quốc tế OWASP Benchmark Python. Kết quả chứng minh khả năng </w:t>
       </w:r>
       <w:r>
-        <w:t xml:space="preserve"> của phương pháp lai ghép.</w:t>
+        <w:rPr>
+          <w:rFonts w:ascii="Times New Roman" w:hAnsi="Times New Roman"/>
+          <w:b/>
+          <w:color w:val="000000"/>
+        </w:rPr>
+        <w:t>cắt giảm 65.00% cảnh báo sai trên toàn cục và 89.66% trên các nhóm trọng tâm</w:t>
+      </w:r>
+      <w:r>
+        <w:rPr>
+          <w:rFonts w:ascii="Times New Roman" w:hAnsi="Times New Roman"/>
+          <w:color w:val="000000"/>
+        </w:rPr>
+        <w:t>, với độ chính xác đạt 62.11% và F1-Score đạt 60.20%.</w:t>
       </w:r>
     </w:p>
     <w:p>
       <w:pPr/>
       <w:r>
-        <w:t>Nhóm kiên định bám sát các nguyên lý phân tích tĩnh chuẩn mực quốc tế để bảo đảm hệ thống có giá trị thực tiễn, thay vì chỉnh sửa đối phó theo bài kiểm thử.</w:t>
+        <w:rPr>
+          <w:rFonts w:ascii="Times New Roman" w:hAnsi="Times New Roman"/>
+          <w:color w:val="000000"/>
+        </w:rPr>
+        <w:t>Nhóm kính mong tiếp tục nhận được những lời nhận xét, góp ý và định hướng quý báu từ Thầy để hoàn thiện hơn nữa nội dung nghiên cứu trong các giai đoạn tiếp theo.</w:t>
       </w:r>
     </w:p>
     <w:p>
       <w:pPr/>
       <w:r>
-        <w:t>Nhóm kính mong tiếp tục nhận được những ý kiến nhận xét và định hướng của Thầy để hoàn thiện đề tài trong các giai đoạn tiếp theo.</w:t>
+        <w:rPr>
+          <w:rFonts w:ascii="Times New Roman" w:hAnsi="Times New Roman"/>
+          <w:color w:val="000000"/>
+        </w:rPr>
+        <w:t>---</w:t>
+      </w:r>
+    </w:p>
+    <w:p>
+      <w:pPr/>
+      <w:r>
+        <w:rPr>
+          <w:rFonts w:ascii="Times New Roman" w:hAnsi="Times New Roman"/>
+          <w:color w:val="000000"/>
+        </w:rPr>
+        <w:t xml:space="preserve">*Hà Nội, ngày 11 tháng 10 năm 2026* </w:t>
+      </w:r>
+      <w:r>
+        <w:rPr>
+          <w:rFonts w:ascii="Times New Roman" w:hAnsi="Times New Roman"/>
+          <w:b/>
+          <w:color w:val="000000"/>
+        </w:rPr>
+        <w:t>Nhóm sinh viên thực hiện đề tài kính báo.</w:t>
       </w:r>
     </w:p>
     <w:sectPr>
@@ -1872,6 +3380,10 @@
     <w:name w:val="Normal"/>
     <w:qFormat/>
     <w:rsid w:val="00FC693F"/>
+    <w:rPr>
+      <w:rFonts w:ascii="Times New Roman" w:hAnsi="Times New Roman"/>
+      <w:color w:val="000000"/>
+    </w:rPr>
   </w:style>
   <w:style w:type="paragraph" w:styleId="Header">
     <w:name w:val="header"/>
@@ -1932,10 +3444,10 @@
       <w:outlineLvl w:val="0"/>
     </w:pPr>
     <w:rPr>
-      <w:rFonts w:asciiTheme="majorHAnsi" w:eastAsiaTheme="majorEastAsia" w:hAnsiTheme="majorHAnsi" w:cstheme="majorBidi"/>
+      <w:rFonts w:asciiTheme="majorHAnsi" w:eastAsiaTheme="majorEastAsia" w:hAnsiTheme="majorHAnsi" w:cstheme="majorBidi" w:ascii="Times New Roman" w:hAnsi="Times New Roman"/>
       <w:b/>
       <w:bCs/>
-      <w:color w:val="365F91" w:themeColor="accent1" w:themeShade="BF"/>
+      <w:color w:val="000000"/>
       <w:sz w:val="28"/>
       <w:szCs w:val="28"/>
     </w:rPr>
@@ -1956,10 +3468,10 @@
       <w:outlineLvl w:val="1"/>
     </w:pPr>
     <w:rPr>
-      <w:rFonts w:asciiTheme="majorHAnsi" w:eastAsiaTheme="majorEastAsia" w:hAnsiTheme="majorHAnsi" w:cstheme="majorBidi"/>
+      <w:rFonts w:asciiTheme="majorHAnsi" w:eastAsiaTheme="majorEastAsia" w:hAnsiTheme="majorHAnsi" w:cstheme="majorBidi" w:ascii="Times New Roman" w:hAnsi="Times New Roman"/>
       <w:b/>
       <w:bCs/>
-      <w:color w:val="4F81BD" w:themeColor="accent1"/>
+      <w:color w:val="000000"/>
       <w:sz w:val="26"/>
       <w:szCs w:val="26"/>
     </w:rPr>
@@ -1980,10 +3492,10 @@
       <w:outlineLvl w:val="2"/>
     </w:pPr>
     <w:rPr>
-      <w:rFonts w:asciiTheme="majorHAnsi" w:eastAsiaTheme="majorEastAsia" w:hAnsiTheme="majorHAnsi" w:cstheme="majorBidi"/>
+      <w:rFonts w:asciiTheme="majorHAnsi" w:eastAsiaTheme="majorEastAsia" w:hAnsiTheme="majorHAnsi" w:cstheme="majorBidi" w:ascii="Times New Roman" w:hAnsi="Times New Roman"/>
       <w:b/>
       <w:bCs/>
-      <w:color w:val="4F81BD" w:themeColor="accent1"/>
+      <w:color w:val="000000"/>
     </w:rPr>
   </w:style>
   <w:style w:type="paragraph" w:styleId="Heading4">
@@ -2003,12 +3515,12 @@
       <w:outlineLvl w:val="3"/>
     </w:pPr>
     <w:rPr>
-      <w:rFonts w:asciiTheme="majorHAnsi" w:eastAsiaTheme="majorEastAsia" w:hAnsiTheme="majorHAnsi" w:cstheme="majorBidi"/>
+      <w:rFonts w:asciiTheme="majorHAnsi" w:eastAsiaTheme="majorEastAsia" w:hAnsiTheme="majorHAnsi" w:cstheme="majorBidi" w:ascii="Times New Roman" w:hAnsi="Times New Roman"/>
       <w:b/>
       <w:bCs/>
       <w:i/>
       <w:iCs/>
-      <w:color w:val="4F81BD" w:themeColor="accent1"/>
+      <w:color w:val="000000"/>
     </w:rPr>
   </w:style>
   <w:style w:type="paragraph" w:styleId="Heading5">
@@ -2028,8 +3540,8 @@
       <w:outlineLvl w:val="4"/>
     </w:pPr>
     <w:rPr>
-      <w:rFonts w:asciiTheme="majorHAnsi" w:eastAsiaTheme="majorEastAsia" w:hAnsiTheme="majorHAnsi" w:cstheme="majorBidi"/>
-      <w:color w:val="243F60" w:themeColor="accent1" w:themeShade="7F"/>
+      <w:rFonts w:asciiTheme="majorHAnsi" w:eastAsiaTheme="majorEastAsia" w:hAnsiTheme="majorHAnsi" w:cstheme="majorBidi" w:ascii="Times New Roman" w:hAnsi="Times New Roman"/>
+      <w:color w:val="000000"/>
     </w:rPr>
   </w:style>
   <w:style w:type="paragraph" w:styleId="Heading6">
@@ -2049,10 +3561,10 @@
       <w:outlineLvl w:val="5"/>
     </w:pPr>
     <w:rPr>
-      <w:rFonts w:asciiTheme="majorHAnsi" w:eastAsiaTheme="majorEastAsia" w:hAnsiTheme="majorHAnsi" w:cstheme="majorBidi"/>
+      <w:rFonts w:asciiTheme="majorHAnsi" w:eastAsiaTheme="majorEastAsia" w:hAnsiTheme="majorHAnsi" w:cstheme="majorBidi" w:ascii="Times New Roman" w:hAnsi="Times New Roman"/>
       <w:i/>
       <w:iCs/>
-      <w:color w:val="243F60" w:themeColor="accent1" w:themeShade="7F"/>
+      <w:color w:val="000000"/>
     </w:rPr>
   </w:style>
   <w:style w:type="paragraph" w:styleId="Heading7">
@@ -2221,8 +3733,8 @@
       <w:contextualSpacing/>
     </w:pPr>
     <w:rPr>
-      <w:rFonts w:asciiTheme="majorHAnsi" w:eastAsiaTheme="majorEastAsia" w:hAnsiTheme="majorHAnsi" w:cstheme="majorBidi"/>
-      <w:color w:val="17365D" w:themeColor="text2" w:themeShade="BF"/>
+      <w:rFonts w:asciiTheme="majorHAnsi" w:eastAsiaTheme="majorEastAsia" w:hAnsiTheme="majorHAnsi" w:cstheme="majorBidi" w:ascii="Times New Roman" w:hAnsi="Times New Roman"/>
+      <w:color w:val="000000"/>
       <w:spacing w:val="5"/>
       <w:kern w:val="28"/>
       <w:sz w:val="52"/>
@@ -2401,6 +3913,10 @@
       </w:numPr>
       <w:contextualSpacing/>
     </w:pPr>
+    <w:rPr>
+      <w:rFonts w:ascii="Times New Roman" w:hAnsi="Times New Roman"/>
+      <w:color w:val="000000"/>
+    </w:rPr>
   </w:style>
   <w:style w:type="paragraph" w:styleId="ListBullet2">
     <w:name w:val="List Bullet 2"/>
@@ -2440,6 +3956,10 @@
       </w:numPr>
       <w:contextualSpacing/>
     </w:pPr>
+    <w:rPr>
+      <w:rFonts w:ascii="Times New Roman" w:hAnsi="Times New Roman"/>
+      <w:color w:val="000000"/>
+    </w:rPr>
   </w:style>
   <w:style w:type="paragraph" w:styleId="ListNumber2">
     <w:name w:val="List Number 2"/>

</xml_diff>